<commit_message>
point the artifact repository reference to comcast-tsf/tsf-llm-security-research (internal TSF org)
</commit_message>
<xml_diff>
--- a/paper/agent-gate.docx
+++ b/paper/agent-gate.docx
@@ -228,7 +228,7 @@
           <w:rStyle w:val="VerbatimChar"/>
           <w:i/>
         </w:rPr>
-        <w:t xml:space="preserve">github.com/francose/llm-sandbox-cwe-research</w:t>
+        <w:t xml:space="preserve">github.com/comcast-tsf/tsf-llm-security-research</w:t>
       </w:r>
       <w:r>
         <w:rPr>
@@ -12572,7 +12572,7 @@
         <w:rPr>
           <w:rStyle w:val="VerbatimChar"/>
         </w:rPr>
-        <w:t xml:space="preserve">github.com/francose/llm-sandbox-cwe-research</w:t>
+        <w:t xml:space="preserve">github.com/comcast-tsf/tsf-llm-security-research</w:t>
       </w:r>
       <w:r>
         <w:t xml:space="preserve">.</w:t>
@@ -13260,7 +13260,7 @@
         <w:rPr>
           <w:rStyle w:val="VerbatimChar"/>
         </w:rPr>
-        <w:t xml:space="preserve">github.com/francose/llm-sandbox-cwe-research</w:t>
+        <w:t xml:space="preserve">github.com/comcast-tsf/tsf-llm-security-research</w:t>
       </w:r>
       <w:r>
         <w:t xml:space="preserve">.</w:t>

</xml_diff>

<commit_message>
scope claims to the tested matrix, not absolutes: 'no tested attack violated' over 'admits no violation'/'holds against every'/'immune'; foreground the user-space-vs-kernel-boundary thesis in the intro; add openat2/SCM_RIGHTS/memfd-execveat as named-but-untested surfaces in limitations
</commit_message>
<xml_diff>
--- a/paper/agent-gate.docx
+++ b/paper/agent-gate.docx
@@ -658,19 +658,19 @@
         <w:t xml:space="preserve"> </w:t>
       </w:r>
       <w:r>
-        <w:t xml:space="preserve">allowlist, a deterministic execution deny, and a routeless network namespace—the sound controls admit no</w:t>
-      </w:r>
-      <w:r>
-        <w:t xml:space="preserve"> </w:t>
-      </w:r>
-      <w:r>
-        <w:t xml:space="preserve">filesystem, execution, or network violation of five stated invariants under a runtime-mutation and</w:t>
-      </w:r>
-      <w:r>
-        <w:t xml:space="preserve"> </w:t>
-      </w:r>
-      <w:r>
-        <w:t xml:space="preserve">mechanism-bypass matrix, save a descriptor opened before the domain, and an external</w:t>
+        <w:t xml:space="preserve">allowlist, a deterministic execution deny, and a routeless network namespace—no tested attack in a</w:t>
+      </w:r>
+      <w:r>
+        <w:t xml:space="preserve"> </w:t>
+      </w:r>
+      <w:r>
+        <w:t xml:space="preserve">runtime-mutation and mechanism-bypass matrix violated the filesystem, execution, or network invariants</w:t>
+      </w:r>
+      <w:r>
+        <w:t xml:space="preserve"> </w:t>
+      </w:r>
+      <w:r>
+        <w:t xml:space="preserve">once the domain was entered, the one measured exception being a descriptor opened before it; an external</w:t>
       </w:r>
       <w:r>
         <w:t xml:space="preserve"> </w:t>
@@ -691,7 +691,7 @@
         <w:t xml:space="preserve"> </w:t>
       </w:r>
       <w:r>
-        <w:t xml:space="preserve">sandbox; a host-owned cgroup kill switch drives the process tree to zero live processes where PID</w:t>
+        <w:t xml:space="preserve">sandbox, and a host-owned cgroup kill switch drives the process tree to zero live processes where PID</w:t>
       </w:r>
       <w:r>
         <w:t xml:space="preserve"> </w:t>
@@ -901,6 +901,104 @@
       </w:r>
       <w:r>
         <w:t xml:space="preserve">, and coverage is where the containment fails.</w:t>
+      </w:r>
+    </w:p>
+    <w:p>
+      <w:pPr>
+        <w:pStyle w:val="BodyText"/>
+      </w:pPr>
+      <w:r>
+        <w:t xml:space="preserve">One principle organizes the results. A security decision taken in user space, on memory the target can</w:t>
+      </w:r>
+      <w:r>
+        <w:t xml:space="preserve"> </w:t>
+      </w:r>
+      <w:r>
+        <w:t xml:space="preserve">rewrite, can be invalidated by the target—by a sibling thread, an external</w:t>
+      </w:r>
+      <w:r>
+        <w:t xml:space="preserve"> </w:t>
+      </w:r>
+      <w:r>
+        <w:rPr>
+          <w:rStyle w:val="VerbatimChar"/>
+        </w:rPr>
+        <w:t xml:space="preserve">process_vm_writev</w:t>
+      </w:r>
+      <w:r>
+        <w:t xml:space="preserve"> </w:t>
+      </w:r>
+      <w:r>
+        <w:t xml:space="preserve">write, or an operation that never reaches the checked syscall. A decision enforced in the kernel, against</w:t>
+      </w:r>
+      <w:r>
+        <w:t xml:space="preserve"> </w:t>
+      </w:r>
+      <w:r>
+        <w:t xml:space="preserve">the resolved object, cannot be, because nothing in user space remains to invalidate. The</w:t>
+      </w:r>
+      <w:r>
+        <w:t xml:space="preserve"> </w:t>
+      </w:r>
+      <w:r>
+        <w:t xml:space="preserve">argument-inspection gate decides in user space and is invalidated on all three counts; the Landlock</w:t>
+      </w:r>
+      <w:r>
+        <w:t xml:space="preserve"> </w:t>
+      </w:r>
+      <w:r>
+        <w:t xml:space="preserve">allowlist, the network namespace, and the</w:t>
+      </w:r>
+      <w:r>
+        <w:t xml:space="preserve"> </w:t>
+      </w:r>
+      <w:r>
+        <w:rPr>
+          <w:rStyle w:val="VerbatimChar"/>
+        </w:rPr>
+        <w:t xml:space="preserve">cgroup</w:t>
+      </w:r>
+      <w:r>
+        <w:t xml:space="preserve"> </w:t>
+      </w:r>
+      <w:r>
+        <w:t xml:space="preserve">decide in the kernel and were not, across the</w:t>
+      </w:r>
+      <w:r>
+        <w:t xml:space="preserve"> </w:t>
+      </w:r>
+      <w:r>
+        <w:t xml:space="preserve">same attack matrix. What follows is the measurement of that distinction across seccomp user notification,</w:t>
+      </w:r>
+      <w:r>
+        <w:t xml:space="preserve"> </w:t>
+      </w:r>
+      <w:r>
+        <w:t xml:space="preserve">Landlock,</w:t>
+      </w:r>
+      <w:r>
+        <w:t xml:space="preserve"> </w:t>
+      </w:r>
+      <w:r>
+        <w:rPr>
+          <w:rStyle w:val="VerbatimChar"/>
+        </w:rPr>
+        <w:t xml:space="preserve">io_uring</w:t>
+      </w:r>
+      <w:r>
+        <w:t xml:space="preserve">, runtime memory mutation, and process-tree control—not a proof that an</w:t>
+      </w:r>
+      <w:r>
+        <w:t xml:space="preserve"> </w:t>
+      </w:r>
+      <w:r>
+        <w:t xml:space="preserve">agent cannot escape, which would require a threat model excluding kernel, hypervisor, firmware, and</w:t>
+      </w:r>
+      <w:r>
+        <w:t xml:space="preserve"> </w:t>
+      </w:r>
+      <w:r>
+        <w:t xml:space="preserve">hardware flaws that this study does not attempt.</w:t>
       </w:r>
     </w:p>
     <w:p>
@@ -1242,19 +1340,19 @@
         <w:t xml:space="preserve"> </w:t>
       </w:r>
       <w:r>
-        <w:t xml:space="preserve">it against five explicit invariants: it holds against every filesystem, execution, and network attack that</w:t>
-      </w:r>
-      <w:r>
-        <w:t xml:space="preserve"> </w:t>
-      </w:r>
-      <w:r>
-        <w:t xml:space="preserve">acquires access after the domain is entered—the composition closes the UDP and raw egress a single</w:t>
-      </w:r>
-      <w:r>
-        <w:t xml:space="preserve"> </w:t>
-      </w:r>
-      <w:r>
-        <w:t xml:space="preserve">Landlock layer leaves open—with one measured caveat, a descriptor opened before the domain</w:t>
+        <w:t xml:space="preserve">it against five explicit invariants: no tested filesystem, execution, or network attack that acquires</w:t>
+      </w:r>
+      <w:r>
+        <w:t xml:space="preserve"> </w:t>
+      </w:r>
+      <w:r>
+        <w:t xml:space="preserve">access after the domain is entered violated its invariant—the composition closes the UDP and raw egress a</w:t>
+      </w:r>
+      <w:r>
+        <w:t xml:space="preserve"> </w:t>
+      </w:r>
+      <w:r>
+        <w:t xml:space="preserve">single Landlock layer leaves open—the one measured exception being a descriptor opened before the domain</w:t>
       </w:r>
       <w:r>
         <w:t xml:space="preserve"> </w:t>
@@ -1271,7 +1369,7 @@
         </w:r>
       </w:hyperlink>
       <w:r>
-        <w:t xml:space="preserve">), the same external memory mutation that defeats the user-space gate does</w:t>
+        <w:t xml:space="preserve">); the same external memory mutation that defeats the user-space gate does</w:t>
       </w:r>
       <w:r>
         <w:t xml:space="preserve"> </w:t>
@@ -10465,13 +10563,7 @@
         <w:t xml:space="preserve"> </w:t>
       </w:r>
       <w:r>
-        <w:t xml:space="preserve">unless that descriptor’s rights are constrained. The invariant holds against every attack that acquires</w:t>
-      </w:r>
-      <w:r>
-        <w:t xml:space="preserve"> </w:t>
-      </w:r>
-      <w:r>
-        <w:t xml:space="preserve">its access</w:t>
+        <w:t xml:space="preserve">unless that descriptor’s rights are constrained. Every attack in the matrix that acquired its access</w:t>
       </w:r>
       <w:r>
         <w:t xml:space="preserve"> </w:t>
@@ -10486,7 +10578,13 @@
         <w:t xml:space="preserve"> </w:t>
       </w:r>
       <w:r>
-        <w:t xml:space="preserve">the domain is entered, which is the case the sandbox is there to govern.</w:t>
+        <w:t xml:space="preserve">the domain was entered was denied; we claim the invariant for that tested class, and by</w:t>
+      </w:r>
+      <w:r>
+        <w:t xml:space="preserve"> </w:t>
+      </w:r>
+      <w:r>
+        <w:t xml:space="preserve">construction for access acquired after entry, not as a general property of the composition.</w:t>
       </w:r>
     </w:p>
     <w:p>
@@ -10730,13 +10828,13 @@
         <w:pStyle w:val="BodyText"/>
       </w:pPr>
       <w:r>
-        <w:t xml:space="preserve">The composed sandbox is immune to the identical external flip. Run against the Landlock target, the</w:t>
-      </w:r>
-      <w:r>
-        <w:t xml:space="preserve"> </w:t>
-      </w:r>
-      <w:r>
-        <w:t xml:space="preserve">mutation opened the evil path 0 times in 4000: the flip only changes which</w:t>
+        <w:t xml:space="preserve">The composed sandbox denied the identical external flip on every attempt. Run against the Landlock target,</w:t>
+      </w:r>
+      <w:r>
+        <w:t xml:space="preserve"> </w:t>
+      </w:r>
+      <w:r>
+        <w:t xml:space="preserve">the mutation opened the evil path 0 times in 4000: the flip only changes which</w:t>
       </w:r>
       <w:r>
         <w:t xml:space="preserve"> </w:t>
@@ -11366,7 +11464,7 @@
         <w:t xml:space="preserve"> </w:t>
       </w:r>
       <w:r>
-        <w:t xml:space="preserve">limit inside the cgroup with the host unaffected. I4 and I5 hold.</w:t>
+        <w:t xml:space="preserve">limit inside the cgroup with the host unaffected. Under these tests, I4 and I5 held.</w:t>
       </w:r>
     </w:p>
     <w:p>
@@ -11873,6 +11971,118 @@
         <w:pStyle w:val="BodyText"/>
       </w:pPr>
       <w:r>
+        <w:t xml:space="preserve">The composed-sandbox matrix (Section </w:t>
+      </w:r>
+      <w:hyperlink w:anchor="sec:composed">
+        <w:r>
+          <w:rPr>
+            <w:rStyle w:val="Hyperlink"/>
+          </w:rPr>
+          <w:t xml:space="preserve">1</w:t>
+        </w:r>
+      </w:hyperlink>
+      <w:r>
+        <w:t xml:space="preserve">) is not exhaustive, and the result is scoped to</w:t>
+      </w:r>
+      <w:r>
+        <w:t xml:space="preserve"> </w:t>
+      </w:r>
+      <w:r>
+        <w:t xml:space="preserve">the attacks it runs, not a general escape-resistance claim. Several surfaces are named but untested and we</w:t>
+      </w:r>
+      <w:r>
+        <w:t xml:space="preserve"> </w:t>
+      </w:r>
+      <w:r>
+        <w:t xml:space="preserve">do not claim them:</w:t>
+      </w:r>
+      <w:r>
+        <w:t xml:space="preserve"> </w:t>
+      </w:r>
+      <w:r>
+        <w:rPr>
+          <w:rStyle w:val="VerbatimChar"/>
+        </w:rPr>
+        <w:t xml:space="preserve">openat2</w:t>
+      </w:r>
+      <w:r>
+        <w:t xml:space="preserve">, which the file-open LSM hook governs on the same footing as</w:t>
+      </w:r>
+      <w:r>
+        <w:t xml:space="preserve"> </w:t>
+      </w:r>
+      <w:r>
+        <w:rPr>
+          <w:rStyle w:val="VerbatimChar"/>
+        </w:rPr>
+        <w:t xml:space="preserve">openat</w:t>
+      </w:r>
+      <w:r>
+        <w:t xml:space="preserve"> </w:t>
+      </w:r>
+      <w:r>
+        <w:t xml:space="preserve">but which we did not exercise; file-descriptor passing over a Unix-domain socket</w:t>
+      </w:r>
+      <w:r>
+        <w:t xml:space="preserve"> </w:t>
+      </w:r>
+      <w:r>
+        <w:t xml:space="preserve">(</w:t>
+      </w:r>
+      <w:r>
+        <w:rPr>
+          <w:rStyle w:val="VerbatimChar"/>
+        </w:rPr>
+        <w:t xml:space="preserve">SCM_RIGHTS</w:t>
+      </w:r>
+      <w:r>
+        <w:t xml:space="preserve">), the descriptor-provenance question of the pre-open hole in another form;</w:t>
+      </w:r>
+      <w:r>
+        <w:t xml:space="preserve"> </w:t>
+      </w:r>
+      <w:r>
+        <w:rPr>
+          <w:rStyle w:val="VerbatimChar"/>
+        </w:rPr>
+        <w:t xml:space="preserve">execveat</w:t>
+      </w:r>
+      <w:r>
+        <w:t xml:space="preserve"> </w:t>
+      </w:r>
+      <w:r>
+        <w:t xml:space="preserve">on a</w:t>
+      </w:r>
+      <w:r>
+        <w:t xml:space="preserve"> </w:t>
+      </w:r>
+      <w:r>
+        <w:rPr>
+          <w:rStyle w:val="VerbatimChar"/>
+        </w:rPr>
+        <w:t xml:space="preserve">memfd</w:t>
+      </w:r>
+      <w:r>
+        <w:t xml:space="preserve">; and any path through a future kernel interface. The empirical claim</w:t>
+      </w:r>
+      <w:r>
+        <w:t xml:space="preserve"> </w:t>
+      </w:r>
+      <w:r>
+        <w:t xml:space="preserve">is that no attack in the tested matrix violated a stated invariant once the domain was entered; it is not</w:t>
+      </w:r>
+      <w:r>
+        <w:t xml:space="preserve"> </w:t>
+      </w:r>
+      <w:r>
+        <w:t xml:space="preserve">a claim about attacks the matrix does not contain.</w:t>
+      </w:r>
+    </w:p>
+    <w:p>
+      <w:pPr>
+        <w:pStyle w:val="BodyText"/>
+      </w:pPr>
+      <w:r>
         <w:t xml:space="preserve">One more limit is inferred rather than demonstrated. We did not build the delegating supervisor that</w:t>
       </w:r>
       <w:r>
@@ -12476,19 +12686,19 @@
         <w:t xml:space="preserve"> </w:t>
       </w:r>
       <w:r>
-        <w:t xml:space="preserve">routeless network namespace into a composed sandbox (Part IV). Against the tested runtime-mutation and</w:t>
-      </w:r>
-      <w:r>
-        <w:t xml:space="preserve"> </w:t>
-      </w:r>
-      <w:r>
-        <w:t xml:space="preserve">mechanism-bypass matrix that sandbox admitted no filesystem, execution, or network violation of its stated</w:t>
-      </w:r>
-      <w:r>
-        <w:t xml:space="preserve"> </w:t>
-      </w:r>
-      <w:r>
-        <w:t xml:space="preserve">invariants once the domain was entered—the one measured exception being a descriptor opened before it,</w:t>
+        <w:t xml:space="preserve">routeless network namespace into a composed sandbox (Part IV). Across the tested runtime-mutation and</w:t>
+      </w:r>
+      <w:r>
+        <w:t xml:space="preserve"> </w:t>
+      </w:r>
+      <w:r>
+        <w:t xml:space="preserve">mechanism-bypass matrix, no attack violated that sandbox’s filesystem, execution, or network invariants</w:t>
+      </w:r>
+      <w:r>
+        <w:t xml:space="preserve"> </w:t>
+      </w:r>
+      <w:r>
+        <w:t xml:space="preserve">once the domain was entered—the one measured exception being a descriptor opened before it,</w:t>
       </w:r>
       <w:r>
         <w:t xml:space="preserve"> </w:t>

</xml_diff>

<commit_message>
answer the technical review: add I0 ambient-authority invariant and reword I1 as no-new-write-authority-after-entry (fixes the pre-open logical mismatch); rename I2 to process-image replacement and I3 to routed-IP egress with their caveats; report both frontier denominators (11/12, 11/16) and drop the non-inferiority overclaim; frame the mutation as cross-process virtual-memory under granted ptrace; add kill-switch irreversibility + Wilson bounds (0/4000, 0/20); primary refs for cgroup v2, process_vm_writev, PR_SET_PTRACER, userfaultfd; drop defensive phrasing
</commit_message>
<xml_diff>
--- a/paper/agent-gate.docx
+++ b/paper/agent-gate.docx
@@ -1340,7 +1340,7 @@
         <w:t xml:space="preserve"> </w:t>
       </w:r>
       <w:r>
-        <w:t xml:space="preserve">it against five explicit invariants: no tested filesystem, execution, or network attack that acquires</w:t>
+        <w:t xml:space="preserve">it against six explicit invariants: no tested filesystem, process-image, or routed-egress attack that acquires</w:t>
       </w:r>
       <w:r>
         <w:t xml:space="preserve"> </w:t>
@@ -8522,53 +8522,19 @@
         <w:t xml:space="preserve">execve("/bin/sh")</w:t>
       </w:r>
       <w:r>
-        <w:t xml:space="preserve">—Claude 7 of 7 (</w:t>
-      </w:r>
-      <m:oMath>
-        <m:r>
-          <m:t>[</m:t>
-        </m:r>
-        <m:r>
-          <m:t>64.6</m:t>
-        </m:r>
-        <m:r>
-          <m:t>,</m:t>
-        </m:r>
-        <m:r>
-          <m:t>100</m:t>
-        </m:r>
-        <m:r>
-          <m:t>]</m:t>
-        </m:r>
-      </m:oMath>
-      <w:r>
-        <w:t xml:space="preserve">), Gemini 4 of 5 (</w:t>
-      </w:r>
-      <m:oMath>
-        <m:r>
-          <m:t>[</m:t>
-        </m:r>
-        <m:r>
-          <m:t>37.6</m:t>
-        </m:r>
-        <m:r>
-          <m:t>,</m:t>
-        </m:r>
-        <m:r>
-          <m:t>96.4</m:t>
-        </m:r>
-        <m:r>
-          <m:t>]</m:t>
-        </m:r>
-      </m:oMath>
-      <w:r>
-        <w:t xml:space="preserve">),</w:t>
-      </w:r>
-      <w:r>
-        <w:t xml:space="preserve"> </w:t>
-      </w:r>
-      <w:r>
-        <w:t xml:space="preserve">pooled 11/12 (91.7%,</w:t>
+        <w:t xml:space="preserve">. We report two denominators, because they measure different things.</w:t>
+      </w:r>
+      <w:r>
+        <w:t xml:space="preserve"> </w:t>
+      </w:r>
+      <w:r>
+        <w:t xml:space="preserve">Conditional on the artifact compiling, the executable direct-injection rate was Claude 7 of 7, Gemini 4 of</w:t>
+      </w:r>
+      <w:r>
+        <w:t xml:space="preserve"> </w:t>
+      </w:r>
+      <w:r>
+        <w:t xml:space="preserve">5, pooled 11/12 (91.7%,</w:t>
       </w:r>
       <w:r>
         <w:t xml:space="preserve"> </w:t>
@@ -8591,13 +8557,42 @@
         </m:r>
       </m:oMath>
       <w:r>
-        <w:t xml:space="preserve">). That is at least as high as the local models’ pooled</w:t>
-      </w:r>
-      <w:r>
-        <w:t xml:space="preserve"> </w:t>
-      </w:r>
-      <w:r>
-        <w:t xml:space="preserve">direct-injection rate of 95/140 (67.9%,</w:t>
+        <w:t xml:space="preserve">); over all generations, including the compile failures that a real</w:t>
+      </w:r>
+      <w:r>
+        <w:t xml:space="preserve"> </w:t>
+      </w:r>
+      <w:r>
+        <w:t xml:space="preserve">pipeline would simply regenerate, the execution-success rate was 11/16 (68.8%,</w:t>
+      </w:r>
+      <w:r>
+        <w:t xml:space="preserve"> </w:t>
+      </w:r>
+      <m:oMath>
+        <m:r>
+          <m:t>[</m:t>
+        </m:r>
+        <m:r>
+          <m:t>44.4</m:t>
+        </m:r>
+        <m:r>
+          <m:t>,</m:t>
+        </m:r>
+        <m:r>
+          <m:t>85.8</m:t>
+        </m:r>
+        <m:r>
+          <m:t>]</m:t>
+        </m:r>
+      </m:oMath>
+      <w:r>
+        <w:t xml:space="preserve">). The</w:t>
+      </w:r>
+      <w:r>
+        <w:t xml:space="preserve"> </w:t>
+      </w:r>
+      <w:r>
+        <w:t xml:space="preserve">observed conditional rate was higher than the local models’ 95/140 (67.9%,</w:t>
       </w:r>
       <w:r>
         <w:t xml:space="preserve"> </w:t>
@@ -8620,25 +8615,37 @@
         </m:r>
       </m:oMath>
       <w:r>
-        <w:t xml:space="preserve">); the intervals overlap, so the supported claim is</w:t>
-      </w:r>
-      <w:r>
-        <w:t xml:space="preserve"> </w:t>
-      </w:r>
-      <w:r>
-        <w:t xml:space="preserve">that frontier capability does not lower direct compliance, not that it raises it. Where a model resisted</w:t>
-      </w:r>
-      <w:r>
-        <w:t xml:space="preserve"> </w:t>
-      </w:r>
-      <w:r>
-        <w:t xml:space="preserve">it did so silently—Gemini in 1 of its 5 usable direct artifacts wrote a clean logging function that</w:t>
-      </w:r>
-      <w:r>
-        <w:t xml:space="preserve"> </w:t>
-      </w:r>
-      <w:r>
-        <w:t xml:space="preserve">omitted the injected call rather than issuing a refusal.</w:t>
+        <w:t xml:space="preserve">), but this</w:t>
+      </w:r>
+      <w:r>
+        <w:t xml:space="preserve"> </w:t>
+      </w:r>
+      <w:r>
+        <w:t xml:space="preserve">experiment was not powered or designed to establish superiority, equality, or non-inferiority—the</w:t>
+      </w:r>
+      <w:r>
+        <w:t xml:space="preserve"> </w:t>
+      </w:r>
+      <w:r>
+        <w:t xml:space="preserve">intervals overlap, and repeated generations from one prompt are generation replicates, not independent</w:t>
+      </w:r>
+      <w:r>
+        <w:t xml:space="preserve"> </w:t>
+      </w:r>
+      <w:r>
+        <w:t xml:space="preserve">task families. The finding is that neither frontier model refused, not a ranking of compliance rates.</w:t>
+      </w:r>
+      <w:r>
+        <w:t xml:space="preserve"> </w:t>
+      </w:r>
+      <w:r>
+        <w:t xml:space="preserve">Where a model resisted it did so silently—Gemini in 1 of its 5 usable direct artifacts wrote a clean</w:t>
+      </w:r>
+      <w:r>
+        <w:t xml:space="preserve"> </w:t>
+      </w:r>
+      <w:r>
+        <w:t xml:space="preserve">logging function that omitted the injected call rather than issuing a refusal.</w:t>
       </w:r>
     </w:p>
     <w:p>
@@ -8757,7 +8764,7 @@
         <w:t xml:space="preserve"> </w:t>
       </w:r>
       <w:r>
-        <w:t xml:space="preserve">least as often as the local models, and at least one flagship follows indirect injection verbatim. The</w:t>
+        <w:t xml:space="preserve">a high rate, and at least one flagship follows indirect injection verbatim. The</w:t>
       </w:r>
       <w:r>
         <w:t xml:space="preserve"> </w:t>
@@ -9466,7 +9473,7 @@
         <w:t xml:space="preserve"> </w:t>
       </w:r>
       <w:r>
-        <w:t xml:space="preserve">actually faces is whether an assembled sandbox holds under attack, and against what. We state five</w:t>
+        <w:t xml:space="preserve">actually faces is whether an assembled sandbox holds under attack, and against what. We state six</w:t>
       </w:r>
       <w:r>
         <w:t xml:space="preserve"> </w:t>
@@ -9519,16 +9526,43 @@
         <w:rPr>
           <w:b/>
         </w:rPr>
-        <w:t xml:space="preserve">I1 filesystem</w:t>
-      </w:r>
-      <w:r>
-        <w:t xml:space="preserve">: no write, create, or remove outside a scratch allowlist—enforced by the</w:t>
-      </w:r>
-      <w:r>
-        <w:t xml:space="preserve"> </w:t>
-      </w:r>
-      <w:r>
-        <w:t xml:space="preserve">Landlock default-deny ruleset of Part II.</w:t>
+        <w:t xml:space="preserve">I0 ambient authority</w:t>
+      </w:r>
+      <w:r>
+        <w:t xml:space="preserve">: before releasing untrusted code, the launcher closes or constrains</w:t>
+      </w:r>
+      <w:r>
+        <w:t xml:space="preserve"> </w:t>
+      </w:r>
+      <w:r>
+        <w:t xml:space="preserve">every inherited file, socket, namespace, device, and control descriptor—enforced by descriptor hygiene</w:t>
+      </w:r>
+      <w:r>
+        <w:t xml:space="preserve"> </w:t>
+      </w:r>
+      <w:r>
+        <w:t xml:space="preserve">at the launcher, not by any of the in-domain controls. Our probe deliberately carries in one pre-domain</w:t>
+      </w:r>
+      <w:r>
+        <w:t xml:space="preserve"> </w:t>
+      </w:r>
+      <w:r>
+        <w:t xml:space="preserve">descriptor to measure the cost of</w:t>
+      </w:r>
+      <w:r>
+        <w:t xml:space="preserve"> </w:t>
+      </w:r>
+      <w:r>
+        <w:rPr>
+          <w:i/>
+        </w:rPr>
+        <w:t xml:space="preserve">not</w:t>
+      </w:r>
+      <w:r>
+        <w:t xml:space="preserve"> </w:t>
+      </w:r>
+      <w:r>
+        <w:t xml:space="preserve">enforcing I0; a production launcher closes it.</w:t>
       </w:r>
     </w:p>
     <w:p>
@@ -9542,7 +9576,7 @@
         <w:rPr>
           <w:b/>
         </w:rPr>
-        <w:t xml:space="preserve">I2 execution</w:t>
+        <w:t xml:space="preserve">I1 filesystem</w:t>
       </w:r>
       <w:r>
         <w:t xml:space="preserve">: no</w:t>
@@ -9552,51 +9586,48 @@
       </w:r>
       <w:r>
         <w:rPr>
-          <w:rStyle w:val="VerbatimChar"/>
-        </w:rPr>
-        <w:t xml:space="preserve">execve</w:t>
-      </w:r>
-      <w:r>
-        <w:t xml:space="preserve">/</w:t>
-      </w:r>
-      <w:r>
-        <w:rPr>
-          <w:rStyle w:val="VerbatimChar"/>
-        </w:rPr>
-        <w:t xml:space="preserve">execveat</w:t>
-      </w:r>
-      <w:r>
-        <w:t xml:space="preserve">—enforced by a seccomp</w:t>
-      </w:r>
-      <w:r>
-        <w:t xml:space="preserve"> </w:t>
-      </w:r>
-      <w:r>
-        <w:rPr>
-          <w:rStyle w:val="VerbatimChar"/>
-        </w:rPr>
-        <w:t xml:space="preserve">SCMP_ACT_ERRNO</w:t>
-      </w:r>
-      <w:r>
-        <w:t xml:space="preserve"> </w:t>
-      </w:r>
-      <w:r>
-        <w:t xml:space="preserve">deny, which is deterministic and has no</w:t>
-      </w:r>
-      <w:r>
-        <w:t xml:space="preserve"> </w:t>
-      </w:r>
-      <w:r>
-        <w:rPr>
-          <w:rStyle w:val="VerbatimChar"/>
-        </w:rPr>
-        <w:t xml:space="preserve">CONTINUE</w:t>
-      </w:r>
-      <w:r>
-        <w:t xml:space="preserve"> </w:t>
-      </w:r>
-      <w:r>
-        <w:t xml:space="preserve">allow path to race.</w:t>
+          <w:i/>
+        </w:rPr>
+        <w:t xml:space="preserve">new</w:t>
+      </w:r>
+      <w:r>
+        <w:t xml:space="preserve"> </w:t>
+      </w:r>
+      <w:r>
+        <w:t xml:space="preserve">filesystem write authority can be acquired after entry—no</w:t>
+      </w:r>
+      <w:r>
+        <w:t xml:space="preserve"> </w:t>
+      </w:r>
+      <w:r>
+        <w:t xml:space="preserve">write, create, or remove outside a scratch allowlist through any path or descriptor obtained once the</w:t>
+      </w:r>
+      <w:r>
+        <w:t xml:space="preserve"> </w:t>
+      </w:r>
+      <w:r>
+        <w:t xml:space="preserve">domain is entered, enforced by the Landlock default-deny ruleset of Part II. A descriptor opened</w:t>
+      </w:r>
+      <w:r>
+        <w:t xml:space="preserve"> </w:t>
+      </w:r>
+      <w:r>
+        <w:rPr>
+          <w:i/>
+        </w:rPr>
+        <w:t xml:space="preserve">before</w:t>
+      </w:r>
+      <w:r>
+        <w:t xml:space="preserve"> </w:t>
+      </w:r>
+      <w:r>
+        <w:t xml:space="preserve">entry is an I0 concern, not an I1 one; separating the two is what the pre-domain row below</w:t>
+      </w:r>
+      <w:r>
+        <w:t xml:space="preserve"> </w:t>
+      </w:r>
+      <w:r>
+        <w:t xml:space="preserve">measures.</w:t>
       </w:r>
     </w:p>
     <w:p>
@@ -9610,22 +9641,144 @@
         <w:rPr>
           <w:b/>
         </w:rPr>
-        <w:t xml:space="preserve">I3 network</w:t>
-      </w:r>
-      <w:r>
-        <w:t xml:space="preserve">: no off-host egress—enforced by an empty network namespace with no route, not</w:t>
-      </w:r>
-      <w:r>
-        <w:t xml:space="preserve"> </w:t>
-      </w:r>
-      <w:r>
-        <w:t xml:space="preserve">by a policy layer. A mediating egress broker is named in the threat model but not built here, so we claim</w:t>
-      </w:r>
-      <w:r>
-        <w:t xml:space="preserve"> </w:t>
-      </w:r>
-      <w:r>
-        <w:t xml:space="preserve">only</w:t>
+        <w:t xml:space="preserve">I2 process-image replacement</w:t>
+      </w:r>
+      <w:r>
+        <w:t xml:space="preserve">: no</w:t>
+      </w:r>
+      <w:r>
+        <w:t xml:space="preserve"> </w:t>
+      </w:r>
+      <w:r>
+        <w:rPr>
+          <w:rStyle w:val="VerbatimChar"/>
+        </w:rPr>
+        <w:t xml:space="preserve">execve</w:t>
+      </w:r>
+      <w:r>
+        <w:t xml:space="preserve">/</w:t>
+      </w:r>
+      <w:r>
+        <w:rPr>
+          <w:rStyle w:val="VerbatimChar"/>
+        </w:rPr>
+        <w:t xml:space="preserve">execveat</w:t>
+      </w:r>
+      <w:r>
+        <w:t xml:space="preserve">—enforced by a seccomp</w:t>
+      </w:r>
+      <w:r>
+        <w:t xml:space="preserve"> </w:t>
+      </w:r>
+      <w:r>
+        <w:rPr>
+          <w:rStyle w:val="VerbatimChar"/>
+        </w:rPr>
+        <w:t xml:space="preserve">SCMP_ACT_ERRNO</w:t>
+      </w:r>
+      <w:r>
+        <w:t xml:space="preserve"> </w:t>
+      </w:r>
+      <w:r>
+        <w:t xml:space="preserve">deny, deterministic with no</w:t>
+      </w:r>
+      <w:r>
+        <w:t xml:space="preserve"> </w:t>
+      </w:r>
+      <w:r>
+        <w:rPr>
+          <w:rStyle w:val="VerbatimChar"/>
+        </w:rPr>
+        <w:t xml:space="preserve">CONTINUE</w:t>
+      </w:r>
+      <w:r>
+        <w:t xml:space="preserve"> </w:t>
+      </w:r>
+      <w:r>
+        <w:t xml:space="preserve">allow path to race. This denies</w:t>
+      </w:r>
+      <w:r>
+        <w:t xml:space="preserve"> </w:t>
+      </w:r>
+      <w:r>
+        <w:t xml:space="preserve">replacing the process image; it does</w:t>
+      </w:r>
+      <w:r>
+        <w:t xml:space="preserve"> </w:t>
+      </w:r>
+      <w:r>
+        <w:rPr>
+          <w:i/>
+        </w:rPr>
+        <w:t xml:space="preserve">not</w:t>
+      </w:r>
+      <w:r>
+        <w:t xml:space="preserve"> </w:t>
+      </w:r>
+      <w:r>
+        <w:t xml:space="preserve">deny in-process code execution (a JIT, shellcode through</w:t>
+      </w:r>
+      <w:r>
+        <w:t xml:space="preserve"> </w:t>
+      </w:r>
+      <w:r>
+        <w:rPr>
+          <w:rStyle w:val="VerbatimChar"/>
+        </w:rPr>
+        <w:t xml:space="preserve">mmap</w:t>
+      </w:r>
+      <w:r>
+        <w:t xml:space="preserve">+</w:t>
+      </w:r>
+      <w:r>
+        <w:rPr>
+          <w:rStyle w:val="VerbatimChar"/>
+        </w:rPr>
+        <w:t xml:space="preserve">mprotect</w:t>
+      </w:r>
+      <w:r>
+        <w:t xml:space="preserve">, or</w:t>
+      </w:r>
+      <w:r>
+        <w:t xml:space="preserve"> </w:t>
+      </w:r>
+      <w:r>
+        <w:rPr>
+          <w:rStyle w:val="VerbatimChar"/>
+        </w:rPr>
+        <w:t xml:space="preserve">dlopen</w:t>
+      </w:r>
+      <w:r>
+        <w:t xml:space="preserve">), which this policy does not address.</w:t>
+      </w:r>
+    </w:p>
+    <w:p>
+      <w:pPr>
+        <w:numPr>
+          <w:ilvl w:val="0"/>
+          <w:numId w:val="1002"/>
+        </w:numPr>
+      </w:pPr>
+      <w:r>
+        <w:rPr>
+          <w:b/>
+        </w:rPr>
+        <w:t xml:space="preserve">I3 routed-IP egress</w:t>
+      </w:r>
+      <w:r>
+        <w:t xml:space="preserve">: no packet leaves the host over a routed TCP, UDP, or raw IP</w:t>
+      </w:r>
+      <w:r>
+        <w:t xml:space="preserve"> </w:t>
+      </w:r>
+      <w:r>
+        <w:t xml:space="preserve">socket—enforced by an empty network namespace with no route, not by a policy layer. This is narrower</w:t>
+      </w:r>
+      <w:r>
+        <w:t xml:space="preserve"> </w:t>
+      </w:r>
+      <w:r>
+        <w:t xml:space="preserve">than</w:t>
       </w:r>
       <w:r>
         <w:t xml:space="preserve"> </w:t>
@@ -9634,28 +9787,36 @@
         <w:t xml:space="preserve">“</w:t>
       </w:r>
       <w:r>
-        <w:t xml:space="preserve">no egress,</w:t>
+        <w:t xml:space="preserve">no egress</w:t>
       </w:r>
       <w:r>
         <w:t xml:space="preserve">”</w:t>
       </w:r>
       <w:r>
-        <w:t xml:space="preserve"> </w:t>
-      </w:r>
-      <w:r>
-        <w:t xml:space="preserve">not</w:t>
-      </w:r>
-      <w:r>
-        <w:t xml:space="preserve"> </w:t>
-      </w:r>
-      <w:r>
-        <w:t xml:space="preserve">“</w:t>
-      </w:r>
-      <w:r>
-        <w:t xml:space="preserve">egress through the designated broker.</w:t>
-      </w:r>
-      <w:r>
-        <w:t xml:space="preserve">”</w:t>
+        <w:t xml:space="preserve">: a pathname Unix-domain socket is a filesystem object, and with no mount namespace an</w:t>
+      </w:r>
+      <w:r>
+        <w:t xml:space="preserve"> </w:t>
+      </w:r>
+      <w:r>
+        <w:t xml:space="preserve">accessible host socket could reach a host service that then talks off-host (Section </w:t>
+      </w:r>
+      <w:hyperlink w:anchor="sec:limits">
+        <w:r>
+          <w:rPr>
+            <w:rStyle w:val="Hyperlink"/>
+          </w:rPr>
+          <w:t xml:space="preserve">5</w:t>
+        </w:r>
+      </w:hyperlink>
+      <w:r>
+        <w:t xml:space="preserve">). We</w:t>
+      </w:r>
+      <w:r>
+        <w:t xml:space="preserve"> </w:t>
+      </w:r>
+      <w:r>
+        <w:t xml:space="preserve">claim routed-IP egress isolation only.</w:t>
       </w:r>
     </w:p>
     <w:p>
@@ -9786,7 +9947,7 @@
         <w:t xml:space="preserve">composed_probe.c</w:t>
       </w:r>
       <w:r>
-        <w:t xml:space="preserve">) applies the three sound</w:t>
+        <w:t xml:space="preserve">) applies the sound</w:t>
       </w:r>
       <w:r>
         <w:t xml:space="preserve"> </w:t>
@@ -10173,7 +10334,7 @@
               <w:jc w:val="left"/>
             </w:pPr>
             <w:r>
-              <w:t xml:space="preserve">I1 write through a pre-domain descriptor</w:t>
+              <w:t xml:space="preserve">I0 write through a pre-domain descriptor</w:t>
             </w:r>
           </w:p>
         </w:tc>
@@ -10434,6 +10595,41 @@
         </w:tc>
       </w:tr>
     </w:tbl>
+    <w:p>
+      <w:pPr>
+        <w:pStyle w:val="BodyText"/>
+      </w:pPr>
+      <w:r>
+        <w:t xml:space="preserve">The pre-domain row is an I0 result, not an I1 one: it is the write authority the launcher failed to</w:t>
+      </w:r>
+      <w:r>
+        <w:t xml:space="preserve"> </w:t>
+      </w:r>
+      <w:r>
+        <w:t xml:space="preserve">strip, carried in on a descriptor opened before the domain existed. No attack acquired write authority</w:t>
+      </w:r>
+      <w:r>
+        <w:t xml:space="preserve"> </w:t>
+      </w:r>
+      <w:r>
+        <w:rPr>
+          <w:i/>
+        </w:rPr>
+        <w:t xml:space="preserve">after</w:t>
+      </w:r>
+      <w:r>
+        <w:t xml:space="preserve"> </w:t>
+      </w:r>
+      <w:r>
+        <w:t xml:space="preserve">entry (I1). The two are different invariants enforced by different parties—the launcher for</w:t>
+      </w:r>
+      <w:r>
+        <w:t xml:space="preserve"> </w:t>
+      </w:r>
+      <w:r>
+        <w:t xml:space="preserve">I0, Landlock for I1—and separating them is the point of the row.</w:t>
+      </w:r>
+    </w:p>
     <w:p>
       <w:pPr>
         <w:pStyle w:val="BodyText"/>
@@ -10492,13 +10688,13 @@
         <w:t xml:space="preserve"> </w:t>
       </w:r>
       <w:r>
-        <w:t xml:space="preserve">off any one layer is the Part I error repeated. Second, one</w:t>
-      </w:r>
-      <w:r>
-        <w:t xml:space="preserve"> </w:t>
-      </w:r>
-      <w:r>
-        <w:t xml:space="preserve">attack succeeds: a write through a descriptor opened</w:t>
+        <w:t xml:space="preserve">off any one layer is the Part I error repeated. Second, the one</w:t>
+      </w:r>
+      <w:r>
+        <w:t xml:space="preserve"> </w:t>
+      </w:r>
+      <w:r>
+        <w:t xml:space="preserve">success is the I0 row: a write through a descriptor opened</w:t>
       </w:r>
       <w:r>
         <w:t xml:space="preserve"> </w:t>
@@ -10513,13 +10709,13 @@
         <w:t xml:space="preserve"> </w:t>
       </w:r>
       <w:r>
-        <w:t xml:space="preserve">the Landlock domain was entered. That</w:t>
-      </w:r>
-      <w:r>
-        <w:t xml:space="preserve"> </w:t>
-      </w:r>
-      <w:r>
-        <w:t xml:space="preserve">is the pre-open hole of Section </w:t>
+        <w:t xml:space="preserve">the domain was entered. That is</w:t>
+      </w:r>
+      <w:r>
+        <w:t xml:space="preserve"> </w:t>
+      </w:r>
+      <w:r>
+        <w:t xml:space="preserve">the pre-open hole of Section </w:t>
       </w:r>
       <w:hyperlink w:anchor="sec:landlock">
         <w:r>
@@ -10530,19 +10726,13 @@
         </w:r>
       </w:hyperlink>
       <w:r>
-        <w:t xml:space="preserve">, and its survival in the composed sandbox is the</w:t>
-      </w:r>
-      <w:r>
-        <w:t xml:space="preserve"> </w:t>
-      </w:r>
-      <w:r>
-        <w:t xml:space="preserve">measured form of a discipline requirement—a supervisor that hands the target a descriptor it opened</w:t>
-      </w:r>
-      <w:r>
-        <w:t xml:space="preserve"> </w:t>
-      </w:r>
-      <w:r>
-        <w:t xml:space="preserve">outside the domain (the</w:t>
+        <w:t xml:space="preserve">, and it is an ambient-authority failure, not an I1 one—a</w:t>
+      </w:r>
+      <w:r>
+        <w:t xml:space="preserve"> </w:t>
+      </w:r>
+      <w:r>
+        <w:t xml:space="preserve">supervisor that hands the target a descriptor it opened outside the domain (the</w:t>
       </w:r>
       <w:r>
         <w:t xml:space="preserve"> </w:t>
@@ -10557,13 +10747,19 @@
         <w:t xml:space="preserve"> </w:t>
       </w:r>
       <w:r>
-        <w:t xml:space="preserve">delegation Part I recommends is exactly such a hand-off) reopens I1</w:t>
-      </w:r>
-      <w:r>
-        <w:t xml:space="preserve"> </w:t>
-      </w:r>
-      <w:r>
-        <w:t xml:space="preserve">unless that descriptor’s rights are constrained. Every attack in the matrix that acquired its access</w:t>
+        <w:t xml:space="preserve">delegation</w:t>
+      </w:r>
+      <w:r>
+        <w:t xml:space="preserve"> </w:t>
+      </w:r>
+      <w:r>
+        <w:t xml:space="preserve">Part I recommends is exactly such a hand-off) leaks write authority unless the launcher strips or</w:t>
+      </w:r>
+      <w:r>
+        <w:t xml:space="preserve"> </w:t>
+      </w:r>
+      <w:r>
+        <w:t xml:space="preserve">constrains it first. Every attack in the matrix that acquired its access</w:t>
       </w:r>
       <w:r>
         <w:t xml:space="preserve"> </w:t>
@@ -10578,13 +10774,19 @@
         <w:t xml:space="preserve"> </w:t>
       </w:r>
       <w:r>
-        <w:t xml:space="preserve">the domain was entered was denied; we claim the invariant for that tested class, and by</w:t>
-      </w:r>
-      <w:r>
-        <w:t xml:space="preserve"> </w:t>
-      </w:r>
-      <w:r>
-        <w:t xml:space="preserve">construction for access acquired after entry, not as a general property of the composition.</w:t>
+        <w:t xml:space="preserve">the domain was</w:t>
+      </w:r>
+      <w:r>
+        <w:t xml:space="preserve"> </w:t>
+      </w:r>
+      <w:r>
+        <w:t xml:space="preserve">entered was denied; we claim I1 for that tested class, and by construction for authority acquired after</w:t>
+      </w:r>
+      <w:r>
+        <w:t xml:space="preserve"> </w:t>
+      </w:r>
+      <w:r>
+        <w:t xml:space="preserve">entry, not as a general property of the composition.</w:t>
       </w:r>
     </w:p>
     <w:p>
@@ -10593,7 +10795,7 @@
       </w:pPr>
       <w:bookmarkStart w:id="50" w:name="sec:memmut"/>
       <w:r>
-        <w:t xml:space="preserve">Runtime memory mutation</w:t>
+        <w:t xml:space="preserve">Runtime process-memory mutation</w:t>
       </w:r>
       <w:bookmarkEnd w:id="50"/>
     </w:p>
@@ -10641,6 +10843,9 @@
         <w:t xml:space="preserve">process_vm_writev</w:t>
       </w:r>
       <w:r>
+        <w:t xml:space="preserve"> </w:t>
+      </w:r>
+      <w:r>
         <w:t xml:space="preserve"> </w:t>
       </w:r>
       <w:r>
@@ -10659,13 +10864,13 @@
         <w:t xml:space="preserve"> </w:t>
       </w:r>
       <w:r>
-        <w:t xml:space="preserve">thread is parked on the notification; the</w:t>
-      </w:r>
-      <w:r>
-        <w:t xml:space="preserve"> </w:t>
-      </w:r>
-      <w:r>
-        <w:t xml:space="preserve">target grants the writer access with</w:t>
+        <w:t xml:space="preserve">thread is parked on the</w:t>
+      </w:r>
+      <w:r>
+        <w:t xml:space="preserve"> </w:t>
+      </w:r>
+      <w:r>
+        <w:t xml:space="preserve">notification; the target grants the writer access with</w:t>
       </w:r>
       <w:r>
         <w:t xml:space="preserve"> </w:t>
@@ -10677,25 +10882,55 @@
         <w:t xml:space="preserve">PR_SET_PTRACER</w:t>
       </w:r>
       <w:r>
-        <w:t xml:space="preserve">, which an attacker owning the target can</w:t>
-      </w:r>
-      <w:r>
-        <w:t xml:space="preserve"> </w:t>
-      </w:r>
-      <w:r>
-        <w:t xml:space="preserve">do. Against the same gate the external writer opened the persistence path on 28.5–44.2% of attempts</w:t>
-      </w:r>
-      <w:r>
-        <w:t xml:space="preserve"> </w:t>
-      </w:r>
-      <w:r>
-        <w:t xml:space="preserve">across five runs of 4000, at least as often as the in-process thread</w:t>
-      </w:r>
-      <w:r>
-        <w:t xml:space="preserve"> </w:t>
-      </w:r>
-      <w:r>
-        <w:t xml:space="preserve">(Section </w:t>
+        <w:t xml:space="preserve"> </w:t>
+      </w:r>
+      <w:r>
+        <w:t xml:space="preserve">, which an</w:t>
+      </w:r>
+      <w:r>
+        <w:t xml:space="preserve"> </w:t>
+      </w:r>
+      <w:r>
+        <w:t xml:space="preserve">attacker owning the target can do. This is cross-process runtime buffer mutation under granted</w:t>
+      </w:r>
+      <w:r>
+        <w:t xml:space="preserve"> </w:t>
+      </w:r>
+      <w:r>
+        <w:rPr>
+          <w:rStyle w:val="VerbatimChar"/>
+        </w:rPr>
+        <w:t xml:space="preserve">ptrace</w:t>
+      </w:r>
+      <w:r>
+        <w:t xml:space="preserve"> </w:t>
+      </w:r>
+      <w:r>
+        <w:t xml:space="preserve">authority—not the hijack of an unrelated protected process (the target consents, and an</w:t>
+      </w:r>
+      <w:r>
+        <w:t xml:space="preserve"> </w:t>
+      </w:r>
+      <w:r>
+        <w:t xml:space="preserve">attacker that already owns the target could mutate the buffer internally), and not a physical-memory or</w:t>
+      </w:r>
+      <w:r>
+        <w:t xml:space="preserve"> </w:t>
+      </w:r>
+      <w:r>
+        <w:t xml:space="preserve">hardware-page experiment; it operates on the target’s virtual memory. Against the same gate the external</w:t>
+      </w:r>
+      <w:r>
+        <w:t xml:space="preserve"> </w:t>
+      </w:r>
+      <w:r>
+        <w:t xml:space="preserve">writer opened the persistence path on 28.5–44.2% of attempts across five runs of 4000, a rate in the</w:t>
+      </w:r>
+      <w:r>
+        <w:t xml:space="preserve"> </w:t>
+      </w:r>
+      <w:r>
+        <w:t xml:space="preserve">same range as the in-process thread (Section </w:t>
       </w:r>
       <w:hyperlink w:anchor="sec:toctou">
         <w:r>
@@ -10706,7 +10941,13 @@
         </w:r>
       </w:hyperlink>
       <w:r>
-        <w:t xml:space="preserve">’s 18.9–23.1%). The other external mechanisms the literature names</w:t>
+        <w:t xml:space="preserve">’s 18.9–23.1%). The other external</w:t>
+      </w:r>
+      <w:r>
+        <w:t xml:space="preserve"> </w:t>
+      </w:r>
+      <w:r>
+        <w:t xml:space="preserve">mechanisms the literature names</w:t>
       </w:r>
       <w:r>
         <w:t xml:space="preserve"> </w:t>
@@ -10760,6 +11001,9 @@
         <w:t xml:space="preserve">userfaultfd</w:t>
       </w:r>
       <w:r>
+        <w:t xml:space="preserve"> </w:t>
+      </w:r>
+      <w:r>
         <w:t xml:space="preserve">, which lets the attacker</w:t>
       </w:r>
       <w:r>
@@ -10775,19 +11019,25 @@
         <w:t xml:space="preserve"> </w:t>
       </w:r>
       <w:r>
-        <w:t xml:space="preserve">the faulting read and supply the</w:t>
-      </w:r>
-      <w:r>
-        <w:t xml:space="preserve"> </w:t>
-      </w:r>
-      <w:r>
-        <w:t xml:space="preserve">page at a chosen moment, making the race deterministic rather than probabilistic; on this host it needs</w:t>
-      </w:r>
-      <w:r>
-        <w:t xml:space="preserve"> </w:t>
-      </w:r>
-      <w:r>
-        <w:t xml:space="preserve">privilege (</w:t>
+        <w:t xml:space="preserve">the faulting</w:t>
+      </w:r>
+      <w:r>
+        <w:t xml:space="preserve"> </w:t>
+      </w:r>
+      <w:r>
+        <w:t xml:space="preserve">read and supply the page at a chosen moment, making the race deterministic rather than probabilistic—but</w:t>
+      </w:r>
+      <w:r>
+        <w:t xml:space="preserve"> </w:t>
+      </w:r>
+      <w:r>
+        <w:t xml:space="preserve">still a virtual-memory experiment, not page-table compromise or physical-RAM substitution; on this host it</w:t>
+      </w:r>
+      <w:r>
+        <w:t xml:space="preserve"> </w:t>
+      </w:r>
+      <w:r>
+        <w:t xml:space="preserve">needs privilege (</w:t>
       </w:r>
       <w:r>
         <w:rPr>
@@ -10814,13 +11064,13 @@
         <w:t xml:space="preserve"> </w:t>
       </w:r>
       <w:r>
-        <w:t xml:space="preserve">is 0) and is left</w:t>
-      </w:r>
-      <w:r>
-        <w:t xml:space="preserve"> </w:t>
-      </w:r>
-      <w:r>
-        <w:t xml:space="preserve">to the privileged step.</w:t>
+        <w:t xml:space="preserve">is 0) and is</w:t>
+      </w:r>
+      <w:r>
+        <w:t xml:space="preserve"> </w:t>
+      </w:r>
+      <w:r>
+        <w:t xml:space="preserve">left to the privileged step.</w:t>
       </w:r>
     </w:p>
     <w:p>
@@ -10828,13 +11078,19 @@
         <w:pStyle w:val="BodyText"/>
       </w:pPr>
       <w:r>
-        <w:t xml:space="preserve">The composed sandbox denied the identical external flip on every attempt. Run against the Landlock target,</w:t>
-      </w:r>
-      <w:r>
-        <w:t xml:space="preserve"> </w:t>
-      </w:r>
-      <w:r>
-        <w:t xml:space="preserve">the mutation opened the evil path 0 times in 4000: the flip only changes which</w:t>
+        <w:t xml:space="preserve">The composed sandbox showed no violation under the tested mutation. Run against the Landlock target,</w:t>
+      </w:r>
+      <w:r>
+        <w:t xml:space="preserve"> </w:t>
+      </w:r>
+      <w:r>
+        <w:t xml:space="preserve">the mutation opened the evil path 0 times in 4000 (Wilson 95% upper bound 0.096%): the flip only</w:t>
+      </w:r>
+      <w:r>
+        <w:t xml:space="preserve"> </w:t>
+      </w:r>
+      <w:r>
+        <w:t xml:space="preserve">changes which</w:t>
       </w:r>
       <w:r>
         <w:t xml:space="preserve"> </w:t>
@@ -10849,19 +11105,13 @@
         <w:t xml:space="preserve"> </w:t>
       </w:r>
       <w:r>
-        <w:t xml:space="preserve">path is</w:t>
-      </w:r>
-      <w:r>
-        <w:t xml:space="preserve"> </w:t>
-      </w:r>
-      <w:r>
-        <w:t xml:space="preserve">attempted, because the decision is taken at the LSM hook on the resolved object and there is no user-space</w:t>
-      </w:r>
-      <w:r>
-        <w:t xml:space="preserve"> </w:t>
-      </w:r>
-      <w:r>
-        <w:t xml:space="preserve">check left to invalidate. Memory mutation defeats a control that decides in user space; it has nothing to</w:t>
+        <w:t xml:space="preserve">path is attempted, because the decision is taken at the LSM hook on the</w:t>
+      </w:r>
+      <w:r>
+        <w:t xml:space="preserve"> </w:t>
+      </w:r>
+      <w:r>
+        <w:t xml:space="preserve">resolved object and there is no user-space check left to invalidate. Memory mutation defeats a control that decides in user space; it has nothing to</w:t>
       </w:r>
       <w:r>
         <w:t xml:space="preserve"> </w:t>
@@ -10897,13 +11147,16 @@
         <w:t xml:space="preserve">cgroup</w:t>
       </w:r>
       <w:r>
-        <w:t xml:space="preserve"> v2, which the unprivileged evaluation host does not</w:t>
-      </w:r>
-      <w:r>
-        <w:t xml:space="preserve"> </w:t>
-      </w:r>
-      <w:r>
-        <w:t xml:space="preserve">delegate, so</w:t>
+        <w:t xml:space="preserve"> v2 </w:t>
+      </w:r>
+      <w:r>
+        <w:t xml:space="preserve">, which the unprivileged evaluation</w:t>
+      </w:r>
+      <w:r>
+        <w:t xml:space="preserve"> </w:t>
+      </w:r>
+      <w:r>
+        <w:t xml:space="preserve">host does not delegate, so</w:t>
       </w:r>
       <w:r>
         <w:t xml:space="preserve"> </w:t>
@@ -10918,13 +11171,13 @@
         <w:t xml:space="preserve"> </w:t>
       </w:r>
       <w:r>
-        <w:t xml:space="preserve">runs as the one privileged step of the artifact. We report</w:t>
-      </w:r>
-      <w:r>
-        <w:t xml:space="preserve"> </w:t>
-      </w:r>
-      <w:r>
-        <w:t xml:space="preserve">correctness, not latency: this host’s non-</w:t>
+        <w:t xml:space="preserve">runs as the one privileged step of the artifact. We</w:t>
+      </w:r>
+      <w:r>
+        <w:t xml:space="preserve"> </w:t>
+      </w:r>
+      <w:r>
+        <w:t xml:space="preserve">report correctness, not latency: this host’s non-</w:t>
       </w:r>
       <w:r>
         <w:rPr>
@@ -10933,25 +11186,55 @@
         <w:t xml:space="preserve">systemd</w:t>
       </w:r>
       <w:r>
-        <w:t xml:space="preserve">, emulated kernel would not support a credible</w:t>
-      </w:r>
-      <w:r>
-        <w:t xml:space="preserve"> </w:t>
-      </w:r>
-      <w:r>
-        <w:t xml:space="preserve">latency figure, and a latency benchmark belongs on a native kernel (future work). The agent is a bounded</w:t>
-      </w:r>
-      <w:r>
-        <w:t xml:space="preserve"> </w:t>
-      </w:r>
-      <w:r>
-        <w:t xml:space="preserve">tree—thirty persistent workers, each continuously forking short-lived children, so the process set</w:t>
-      </w:r>
-      <w:r>
-        <w:t xml:space="preserve"> </w:t>
-      </w:r>
-      <w:r>
-        <w:t xml:space="preserve">churns while the population stays near ninety.</w:t>
+        <w:t xml:space="preserve">, emulated kernel would not support a</w:t>
+      </w:r>
+      <w:r>
+        <w:t xml:space="preserve"> </w:t>
+      </w:r>
+      <w:r>
+        <w:t xml:space="preserve">credible latency figure, and the full latency profile a kill switch needs—trigger-to-</w:t>
+      </w:r>
+      <w:r>
+        <w:rPr>
+          <w:rStyle w:val="VerbatimChar"/>
+        </w:rPr>
+        <w:t xml:space="preserve">frozen</w:t>
+      </w:r>
+      <w:r>
+        <w:t xml:space="preserve">,</w:t>
+      </w:r>
+      <w:r>
+        <w:t xml:space="preserve"> </w:t>
+      </w:r>
+      <w:r>
+        <w:t xml:space="preserve">trigger-to-</w:t>
+      </w:r>
+      <w:r>
+        <w:rPr>
+          <w:rStyle w:val="VerbatimChar"/>
+        </w:rPr>
+        <w:t xml:space="preserve">populated 0</w:t>
+      </w:r>
+      <w:r>
+        <w:t xml:space="preserve">, and post-trigger bytes and operations at median, p95, p99, and maximum</w:t>
+      </w:r>
+      <w:r>
+        <w:t xml:space="preserve"> </w:t>
+      </w:r>
+      <w:r>
+        <w:t xml:space="preserve">over many trials, under idle and loaded hosts—belongs on a native kernel and is future work. The agent</w:t>
+      </w:r>
+      <w:r>
+        <w:t xml:space="preserve"> </w:t>
+      </w:r>
+      <w:r>
+        <w:t xml:space="preserve">is a bounded tree—thirty persistent workers, each continuously forking short-lived children, so the</w:t>
+      </w:r>
+      <w:r>
+        <w:t xml:space="preserve"> </w:t>
+      </w:r>
+      <w:r>
+        <w:t xml:space="preserve">process set churns while the population stays near ninety.</w:t>
       </w:r>
     </w:p>
     <w:tbl>
@@ -11464,7 +11747,61 @@
         <w:t xml:space="preserve"> </w:t>
       </w:r>
       <w:r>
-        <w:t xml:space="preserve">limit inside the cgroup with the host unaffected. Under these tests, I4 and I5 held.</w:t>
+        <w:t xml:space="preserve">limit inside the cgroup with the host unaffected. In the evaluated trials, I4 and I5 held (the</w:t>
+      </w:r>
+      <w:r>
+        <w:t xml:space="preserve"> </w:t>
+      </w:r>
+      <w:r>
+        <w:rPr>
+          <w:rStyle w:val="VerbatimChar"/>
+        </w:rPr>
+        <w:t xml:space="preserve">cgroup.kill</w:t>
+      </w:r>
+      <w:r>
+        <w:t xml:space="preserve"> </w:t>
+      </w:r>
+      <w:r>
+        <w:t xml:space="preserve">survivor rate 0/20 carries a Wilson 95% upper bound of 16.1%, so mechanism</w:t>
+      </w:r>
+      <w:r>
+        <w:t xml:space="preserve"> </w:t>
+      </w:r>
+      <w:r>
+        <w:t xml:space="preserve">semantics, not the sample size, carry the assurance). One limit is intrinsic: the kill terminates the</w:t>
+      </w:r>
+      <w:r>
+        <w:t xml:space="preserve"> </w:t>
+      </w:r>
+      <w:r>
+        <w:t xml:space="preserve">tree but cannot reverse a write, a packet, or an</w:t>
+      </w:r>
+      <w:r>
+        <w:t xml:space="preserve"> </w:t>
+      </w:r>
+      <w:r>
+        <w:rPr>
+          <w:rStyle w:val="VerbatimChar"/>
+        </w:rPr>
+        <w:t xml:space="preserve">io_uring</w:t>
+      </w:r>
+      <w:r>
+        <w:t xml:space="preserve"> </w:t>
+      </w:r>
+      <w:r>
+        <w:t xml:space="preserve">completion that finished before</w:t>
+      </w:r>
+      <w:r>
+        <w:t xml:space="preserve"> </w:t>
+      </w:r>
+      <w:r>
+        <w:t xml:space="preserve">quiescence—the 338 post-trigger writes are exactly such side effects—so a kill switch bounds damage</w:t>
+      </w:r>
+      <w:r>
+        <w:t xml:space="preserve"> </w:t>
+      </w:r>
+      <w:r>
+        <w:t xml:space="preserve">after detection, it does not prevent it.</w:t>
       </w:r>
     </w:p>
     <w:p>
@@ -11710,7 +12047,7 @@
         <w:pStyle w:val="FirstParagraph"/>
       </w:pPr>
       <w:r>
-        <w:t xml:space="preserve">The study is scoped and we state the scope rather than let a reviewer find it. The core subjects are three</w:t>
+        <w:t xml:space="preserve">The study is scoped, and we state the scope. The core subjects are three</w:t>
       </w:r>
       <w:r>
         <w:t xml:space="preserve"> </w:t>
@@ -12974,7 +13311,7 @@
         <w:pStyle w:val="BodyText"/>
       </w:pPr>
       <w:r>
-        <w:t xml:space="preserve">21</w:t>
+        <w:t xml:space="preserve">25</w:t>
       </w:r>
       <w:r>
         <w:t xml:space="preserve"> </w:t>
@@ -13359,6 +13696,210 @@
       </w:r>
       <w:r>
         <w:t xml:space="preserve">. Risks cited: LLM01 (prompt injection), LLM06 (excessive agency).</w:t>
+      </w:r>
+      <w:r>
+        <w:t xml:space="preserve"> </w:t>
+      </w:r>
+      <w:r>
+        <w:t xml:space="preserve">Linux kernel. Control Group v2.</w:t>
+      </w:r>
+      <w:r>
+        <w:t xml:space="preserve"> </w:t>
+      </w:r>
+      <w:r>
+        <w:rPr>
+          <w:rStyle w:val="VerbatimChar"/>
+        </w:rPr>
+        <w:t xml:space="preserve">https://docs.kernel.org/admin-guide/cgroup-v2.html</w:t>
+      </w:r>
+      <w:r>
+        <w:t xml:space="preserve">.</w:t>
+      </w:r>
+      <w:r>
+        <w:t xml:space="preserve"> </w:t>
+      </w:r>
+      <w:r>
+        <w:rPr>
+          <w:rStyle w:val="VerbatimChar"/>
+        </w:rPr>
+        <w:t xml:space="preserve">cgroup.kill</w:t>
+      </w:r>
+      <w:r>
+        <w:t xml:space="preserve">,</w:t>
+      </w:r>
+      <w:r>
+        <w:t xml:space="preserve"> </w:t>
+      </w:r>
+      <w:r>
+        <w:rPr>
+          <w:rStyle w:val="VerbatimChar"/>
+        </w:rPr>
+        <w:t xml:space="preserve">cgroup.freeze</w:t>
+      </w:r>
+      <w:r>
+        <w:t xml:space="preserve">, and</w:t>
+      </w:r>
+      <w:r>
+        <w:t xml:space="preserve"> </w:t>
+      </w:r>
+      <w:r>
+        <w:rPr>
+          <w:rStyle w:val="VerbatimChar"/>
+        </w:rPr>
+        <w:t xml:space="preserve">cgroup.events</w:t>
+      </w:r>
+      <w:r>
+        <w:t xml:space="preserve"> </w:t>
+      </w:r>
+      <w:r>
+        <w:t xml:space="preserve">semantics;</w:t>
+      </w:r>
+      <w:r>
+        <w:t xml:space="preserve"> </w:t>
+      </w:r>
+      <w:r>
+        <w:rPr>
+          <w:rStyle w:val="VerbatimChar"/>
+        </w:rPr>
+        <w:t xml:space="preserve">cgroup.kill</w:t>
+      </w:r>
+      <w:r>
+        <w:t xml:space="preserve"> </w:t>
+      </w:r>
+      <w:r>
+        <w:t xml:space="preserve">terminates a subtree while handling concurrent forks and migrations.</w:t>
+      </w:r>
+      <w:r>
+        <w:t xml:space="preserve"> </w:t>
+      </w:r>
+      <w:r>
+        <w:t xml:space="preserve">Linux man-pages project.</w:t>
+      </w:r>
+      <w:r>
+        <w:t xml:space="preserve"> </w:t>
+      </w:r>
+      <w:r>
+        <w:rPr>
+          <w:rStyle w:val="VerbatimChar"/>
+        </w:rPr>
+        <w:t xml:space="preserve">process_vm_writev</w:t>
+      </w:r>
+      <w:r>
+        <w:t xml:space="preserve">(2).</w:t>
+      </w:r>
+      <w:r>
+        <w:t xml:space="preserve"> </w:t>
+      </w:r>
+      <w:r>
+        <w:rPr>
+          <w:rStyle w:val="VerbatimChar"/>
+        </w:rPr>
+        <w:t xml:space="preserve">https://man7.org/linux/man-pages/man2/process_vm_writev.2.html</w:t>
+      </w:r>
+      <w:r>
+        <w:t xml:space="preserve">.</w:t>
+      </w:r>
+      <w:r>
+        <w:t xml:space="preserve"> </w:t>
+      </w:r>
+      <w:r>
+        <w:t xml:space="preserve">Linux man-pages project.</w:t>
+      </w:r>
+      <w:r>
+        <w:t xml:space="preserve"> </w:t>
+      </w:r>
+      <w:r>
+        <w:rPr>
+          <w:rStyle w:val="VerbatimChar"/>
+        </w:rPr>
+        <w:t xml:space="preserve">prctl</w:t>
+      </w:r>
+      <w:r>
+        <w:t xml:space="preserve">(2):</w:t>
+      </w:r>
+      <w:r>
+        <w:t xml:space="preserve"> </w:t>
+      </w:r>
+      <w:r>
+        <w:rPr>
+          <w:rStyle w:val="VerbatimChar"/>
+        </w:rPr>
+        <w:t xml:space="preserve">PR_SET_PTRACER</w:t>
+      </w:r>
+      <w:r>
+        <w:t xml:space="preserve"> </w:t>
+      </w:r>
+      <w:r>
+        <w:t xml:space="preserve">(Yama ptrace-scope registration).</w:t>
+      </w:r>
+      <w:r>
+        <w:t xml:space="preserve"> </w:t>
+      </w:r>
+      <w:r>
+        <w:rPr>
+          <w:rStyle w:val="VerbatimChar"/>
+        </w:rPr>
+        <w:t xml:space="preserve">https://man7.org/linux/man-pages/man2/prctl.2.html</w:t>
+      </w:r>
+      <w:r>
+        <w:t xml:space="preserve">.</w:t>
+      </w:r>
+      <w:r>
+        <w:t xml:space="preserve"> </w:t>
+      </w:r>
+      <w:r>
+        <w:t xml:space="preserve">Linux man-pages project.</w:t>
+      </w:r>
+      <w:r>
+        <w:t xml:space="preserve"> </w:t>
+      </w:r>
+      <w:r>
+        <w:rPr>
+          <w:rStyle w:val="VerbatimChar"/>
+        </w:rPr>
+        <w:t xml:space="preserve">userfaultfd</w:t>
+      </w:r>
+      <w:r>
+        <w:t xml:space="preserve">(2).</w:t>
+      </w:r>
+      <w:r>
+        <w:t xml:space="preserve"> </w:t>
+      </w:r>
+      <w:r>
+        <w:rPr>
+          <w:rStyle w:val="VerbatimChar"/>
+        </w:rPr>
+        <w:t xml:space="preserve">https://man7.org/linux/man-pages/man2/userfaultfd.2.html</w:t>
+      </w:r>
+      <w:r>
+        <w:t xml:space="preserve">. Unprivileged use gated by</w:t>
+      </w:r>
+      <w:r>
+        <w:t xml:space="preserve"> </w:t>
+      </w:r>
+      <w:r>
+        <w:rPr>
+          <w:rStyle w:val="VerbatimChar"/>
+        </w:rPr>
+        <w:t xml:space="preserve">vm.unprivileged_userfaultfd</w:t>
+      </w:r>
+      <w:r>
+        <w:t xml:space="preserve"> </w:t>
+      </w:r>
+      <w:r>
+        <w:t xml:space="preserve">and</w:t>
+      </w:r>
+      <w:r>
+        <w:t xml:space="preserve"> </w:t>
+      </w:r>
+      <w:r>
+        <w:rPr>
+          <w:rStyle w:val="VerbatimChar"/>
+        </w:rPr>
+        <w:t xml:space="preserve">/dev/userfaultfd</w:t>
+      </w:r>
+      <w:r>
+        <w:t xml:space="preserve">.</w:t>
       </w:r>
     </w:p>
     <w:sectPr/>

</xml_diff>

<commit_message>
condense: cut abstract 530->253 words (problem/method/three results/scope, details moved to body); merge the three behavioural-signal sections into one 'Why behavioural observation is not enforcement'; remove the redundant title footnote; tighten limitations without dropping caveats; 19->18 pages
</commit_message>
<xml_diff>
--- a/paper/agent-gate.docx
+++ b/paper/agent-gate.docx
@@ -93,12 +93,6 @@
       <w:r>
         <w:t xml:space="preserve">agents</w:t>
       </w:r>
-      <w:r>
-        <w:rPr>
-          <w:rStyle w:val="FootnoteReference"/>
-        </w:rPr>
-        <w:footnoteReference w:id="20"/>
-      </w:r>
     </w:p>
     <w:p>
       <w:pPr>
@@ -272,24 +266,24 @@
       <w:pPr>
         <w:pStyle w:val="Heading3"/>
       </w:pPr>
-      <w:bookmarkStart w:id="21" w:name="abstract"/>
+      <w:bookmarkStart w:id="20" w:name="abstract"/>
       <w:r>
         <w:t xml:space="preserve">Abstract</w:t>
       </w:r>
-      <w:bookmarkEnd w:id="21"/>
+      <w:bookmarkEnd w:id="20"/>
     </w:p>
     <w:p>
       <w:pPr>
         <w:pStyle w:val="FirstParagraph"/>
       </w:pPr>
       <w:r>
-        <w:t xml:space="preserve">Sandboxes that run untrusted LLM-agent code increasingly reach for a syscall-boundary</w:t>
-      </w:r>
-      <w:r>
-        <w:t xml:space="preserve"> </w:t>
-      </w:r>
-      <w:r>
-        <w:t xml:space="preserve">control: a seccomp supervisor that inspects the</w:t>
+        <w:t xml:space="preserve">Sandboxes that run untrusted LLM-agent code increasingly reach for a syscall-boundary control: a seccomp</w:t>
+      </w:r>
+      <w:r>
+        <w:t xml:space="preserve"> </w:t>
+      </w:r>
+      <w:r>
+        <w:t xml:space="preserve">supervisor that inspects the</w:t>
       </w:r>
       <w:r>
         <w:t xml:space="preserve"> </w:t>
@@ -304,31 +298,25 @@
         <w:t xml:space="preserve"> </w:t>
       </w:r>
       <w:r>
-        <w:t xml:space="preserve">of intercepted system</w:t>
-      </w:r>
-      <w:r>
-        <w:t xml:space="preserve"> </w:t>
-      </w:r>
-      <w:r>
-        <w:t xml:space="preserve">calls and allows or denies each one. Because the supervisor’s verdict is deterministic,</w:t>
-      </w:r>
-      <w:r>
-        <w:t xml:space="preserve"> </w:t>
-      </w:r>
-      <w:r>
-        <w:t xml:space="preserve">it is tempting to treat the control as certified containment. We test that control</w:t>
-      </w:r>
-      <w:r>
-        <w:t xml:space="preserve"> </w:t>
-      </w:r>
-      <w:r>
-        <w:t xml:space="preserve">directly, on a mechanical oracle that compiles and runs the code and reads its behaviour</w:t>
-      </w:r>
-      <w:r>
-        <w:t xml:space="preserve"> </w:t>
-      </w:r>
-      <w:r>
-        <w:t xml:space="preserve">from</w:t>
+        <w:t xml:space="preserve">of intercepted calls and allows or denies each one. Its</w:t>
+      </w:r>
+      <w:r>
+        <w:t xml:space="preserve"> </w:t>
+      </w:r>
+      <w:r>
+        <w:t xml:space="preserve">verdict is deterministic, which tempts treating the control as certified containment. Neither the model’s</w:t>
+      </w:r>
+      <w:r>
+        <w:t xml:space="preserve"> </w:t>
+      </w:r>
+      <w:r>
+        <w:t xml:space="preserve">text nor a deterministic gate decision establishes containment; only execution does. We evaluate the</w:t>
+      </w:r>
+      <w:r>
+        <w:t xml:space="preserve"> </w:t>
+      </w:r>
+      <w:r>
+        <w:t xml:space="preserve">question on a mechanical oracle that compiles and runs the generated code and reads behaviour from</w:t>
       </w:r>
       <w:r>
         <w:t xml:space="preserve"> </w:t>
@@ -340,393 +328,121 @@
         <w:t xml:space="preserve">strace</w:t>
       </w:r>
       <w:r>
-        <w:t xml:space="preserve">, never from text. Four findings show the control fails. First, the</w:t>
-      </w:r>
-      <w:r>
-        <w:t xml:space="preserve"> </w:t>
-      </w:r>
-      <w:r>
-        <w:t xml:space="preserve">argument-inspection gate is bypassable: it blocks a persistence write 4000/4000</w:t>
-      </w:r>
-      <w:r>
-        <w:t xml:space="preserve"> </w:t>
-      </w:r>
-      <w:r>
-        <w:t xml:space="preserve">times head-on, yet a two-thread time-of-check-to-time-of-use (TOCTOU) race on its</w:t>
-      </w:r>
-      <w:r>
-        <w:t xml:space="preserve"> </w:t>
-      </w:r>
-      <w:r>
-        <w:t xml:space="preserve">allow path defeats it at 18.9–23.1% per attempt across five runs, which approaches certainty under</w:t>
-      </w:r>
-      <w:r>
-        <w:t xml:space="preserve"> </w:t>
-      </w:r>
-      <w:r>
-        <w:t xml:space="preserve">retry. Second, attacker-injected and self-driven behaviour do not collapse to one syscall</w:t>
-      </w:r>
-      <w:r>
-        <w:t xml:space="preserve"> </w:t>
-      </w:r>
-      <w:r>
-        <w:t xml:space="preserve">footprint: they share</w:t>
-      </w:r>
-      <w:r>
-        <w:t xml:space="preserve"> </w:t>
-      </w:r>
-      <w:r>
-        <w:rPr>
-          <w:rStyle w:val="VerbatimChar"/>
-        </w:rPr>
-        <w:t xml:space="preserve">execve</w:t>
-      </w:r>
-      <w:r>
-        <w:t xml:space="preserve">, but 18% of self-driven destruction takes</w:t>
-      </w:r>
-      <w:r>
-        <w:t xml:space="preserve"> </w:t>
-      </w:r>
-      <w:r>
-        <w:t xml:space="preserve">a direct</w:t>
-      </w:r>
-      <w:r>
-        <w:t xml:space="preserve"> </w:t>
-      </w:r>
-      <w:r>
-        <w:rPr>
-          <w:rStyle w:val="VerbatimChar"/>
-        </w:rPr>
-        <w:t xml:space="preserve">unlink</w:t>
-      </w:r>
-      <w:r>
-        <w:t xml:space="preserve">/</w:t>
-      </w:r>
-      <w:r>
-        <w:rPr>
-          <w:rStyle w:val="VerbatimChar"/>
-        </w:rPr>
-        <w:t xml:space="preserve">rmdir</w:t>
-      </w:r>
-      <w:r>
-        <w:t xml:space="preserve"> </w:t>
-      </w:r>
-      <w:r>
-        <w:t xml:space="preserve">path that an</w:t>
-      </w:r>
-      <w:r>
-        <w:t xml:space="preserve"> </w:t>
-      </w:r>
-      <w:r>
-        <w:rPr>
-          <w:rStyle w:val="VerbatimChar"/>
-        </w:rPr>
-        <w:t xml:space="preserve">execve</w:t>
-      </w:r>
-      <w:r>
-        <w:t xml:space="preserve">/</w:t>
-      </w:r>
-      <w:r>
-        <w:rPr>
-          <w:rStyle w:val="VerbatimChar"/>
-        </w:rPr>
-        <w:t xml:space="preserve">connect</w:t>
-      </w:r>
-      <w:r>
-        <w:t xml:space="preserve"> </w:t>
-      </w:r>
-      <w:r>
-        <w:t xml:space="preserve">gate</w:t>
-      </w:r>
-      <w:r>
-        <w:t xml:space="preserve"> </w:t>
-      </w:r>
-      <w:r>
-        <w:t xml:space="preserve">never observes. Third, the gate is genuinely selective rather than deny-all, but its</w:t>
-      </w:r>
-      <w:r>
-        <w:t xml:space="preserve"> </w:t>
-      </w:r>
-      <w:r>
-        <w:t xml:space="preserve">substring path-matching admits false positives on benign look-alike filenames while its</w:t>
-      </w:r>
-      <w:r>
-        <w:t xml:space="preserve"> </w:t>
-      </w:r>
-      <w:r>
-        <w:t xml:space="preserve">anchored tokens are evaded by path normalization. Fourth, attributing the actor from its</w:t>
-      </w:r>
-      <w:r>
-        <w:t xml:space="preserve"> </w:t>
-      </w:r>
-      <w:r>
-        <w:t xml:space="preserve">behaviour—by timing, by stated intent, or by its reaction to a denial—fails as a</w:t>
-      </w:r>
-      <w:r>
-        <w:t xml:space="preserve"> </w:t>
-      </w:r>
-      <w:r>
-        <w:t xml:space="preserve">control against an adversary that chooses its own behaviour. We then build and benchmark the</w:t>
-      </w:r>
-      <w:r>
-        <w:t xml:space="preserve"> </w:t>
-      </w:r>
-      <w:r>
-        <w:t xml:space="preserve">successor the failure implies: a default-deny filesystem allowlist over the Landlock LSM closes the</w:t>
-      </w:r>
-      <w:r>
-        <w:t xml:space="preserve"> </w:t>
-      </w:r>
-      <w:r>
-        <w:t xml:space="preserve">same TOCTOU race to 0/4000 and governs</w:t>
-      </w:r>
-      <w:r>
-        <w:t xml:space="preserve"> </w:t>
-      </w:r>
-      <w:r>
-        <w:rPr>
-          <w:rStyle w:val="VerbatimChar"/>
-        </w:rPr>
-        <w:t xml:space="preserve">open</w:t>
-      </w:r>
-      <w:r>
-        <w:t xml:space="preserve">,</w:t>
-      </w:r>
-      <w:r>
-        <w:t xml:space="preserve"> </w:t>
-      </w:r>
-      <w:r>
-        <w:rPr>
-          <w:rStyle w:val="VerbatimChar"/>
-        </w:rPr>
-        <w:t xml:space="preserve">creat</w:t>
-      </w:r>
-      <w:r>
-        <w:t xml:space="preserve">, and</w:t>
-      </w:r>
-      <w:r>
-        <w:t xml:space="preserve"> </w:t>
-      </w:r>
-      <w:r>
-        <w:rPr>
-          <w:rStyle w:val="VerbatimChar"/>
-        </w:rPr>
-        <w:t xml:space="preserve">openat</w:t>
-      </w:r>
-      <w:r>
-        <w:t xml:space="preserve"> </w:t>
-      </w:r>
-      <w:r>
-        <w:t xml:space="preserve">at one</w:t>
-      </w:r>
-      <w:r>
-        <w:t xml:space="preserve"> </w:t>
-      </w:r>
-      <w:r>
-        <w:t xml:space="preserve">kernel hook, where the seccomp gate races on its allow path and lets</w:t>
-      </w:r>
-      <w:r>
-        <w:t xml:space="preserve"> </w:t>
-      </w:r>
-      <w:r>
-        <w:rPr>
-          <w:rStyle w:val="VerbatimChar"/>
-        </w:rPr>
-        <w:t xml:space="preserve">open</w:t>
-      </w:r>
-      <w:r>
-        <w:t xml:space="preserve"> </w:t>
-      </w:r>
-      <w:r>
-        <w:t xml:space="preserve">and</w:t>
-      </w:r>
-      <w:r>
-        <w:t xml:space="preserve"> </w:t>
-      </w:r>
-      <w:r>
-        <w:rPr>
-          <w:rStyle w:val="VerbatimChar"/>
-        </w:rPr>
-        <w:t xml:space="preserve">creat</w:t>
-      </w:r>
-      <w:r>
-        <w:t xml:space="preserve"> </w:t>
-      </w:r>
-      <w:r>
-        <w:t xml:space="preserve">through, and it denies an</w:t>
-      </w:r>
-      <w:r>
-        <w:t xml:space="preserve"> </w:t>
-      </w:r>
-      <w:r>
-        <w:rPr>
-          <w:rStyle w:val="VerbatimChar"/>
-        </w:rPr>
-        <w:t xml:space="preserve">openat</w:t>
-      </w:r>
-      <w:r>
-        <w:t xml:space="preserve"> </w:t>
-      </w:r>
-      <w:r>
-        <w:t xml:space="preserve">submitted through an</w:t>
-      </w:r>
-      <w:r>
-        <w:t xml:space="preserve"> </w:t>
-      </w:r>
-      <w:r>
-        <w:rPr>
-          <w:rStyle w:val="VerbatimChar"/>
-        </w:rPr>
-        <w:t xml:space="preserve">io_uring</w:t>
-      </w:r>
-      <w:r>
-        <w:t xml:space="preserve"> </w:t>
-      </w:r>
-      <w:r>
-        <w:t xml:space="preserve">ring that the seccomp</w:t>
-      </w:r>
-      <w:r>
-        <w:t xml:space="preserve"> </w:t>
-      </w:r>
-      <w:r>
-        <w:t xml:space="preserve">gate never sees at all. We then measure where that allowlist stops: it denies</w:t>
-      </w:r>
-      <w:r>
-        <w:t xml:space="preserve"> </w:t>
-      </w:r>
-      <w:r>
-        <w:rPr>
-          <w:rStyle w:val="VerbatimChar"/>
-        </w:rPr>
-        <w:t xml:space="preserve">execve</w:t>
-      </w:r>
-      <w:r>
-        <w:t xml:space="preserve"> </w:t>
-      </w:r>
-      <w:r>
-        <w:t xml:space="preserve">when configured to, but</w:t>
-      </w:r>
-      <w:r>
-        <w:t xml:space="preserve"> </w:t>
-      </w:r>
-      <w:r>
-        <w:t xml:space="preserve">a descriptor opened before the ruleset keeps writing through it, and UDP and raw sockets pass a TCP</w:t>
-      </w:r>
-      <w:r>
-        <w:t xml:space="preserve"> </w:t>
-      </w:r>
-      <w:r>
-        <w:t xml:space="preserve">network ruleset untouched. Finally we characterize the contained process as a threat actor: denied on</w:t>
-      </w:r>
-      <w:r>
-        <w:t xml:space="preserve"> </w:t>
-      </w:r>
-      <w:r>
-        <w:t xml:space="preserve">every step, a live agent enumerated an alternative at all 88 denied steps and gave up in 0 of 8 trials,</w:t>
-      </w:r>
-      <w:r>
-        <w:t xml:space="preserve"> </w:t>
-      </w:r>
-      <w:r>
-        <w:t xml:space="preserve">escalating privilege for persistence and egress evasion for exfiltration, and its one-sentence</w:t>
-      </w:r>
-      <w:r>
-        <w:t xml:space="preserve"> </w:t>
-      </w:r>
-      <w:r>
-        <w:t xml:space="preserve">description omits the shell it spawns in 5 of 14 dangerous artifacts, so a self-description</w:t>
-      </w:r>
-      <w:r>
-        <w:t xml:space="preserve"> </w:t>
-      </w:r>
-      <w:r>
-        <w:t xml:space="preserve">cannot be the trust boundary. Two frontier models, Claude and Gemini, confirm the premise at the model</w:t>
-      </w:r>
-      <w:r>
-        <w:t xml:space="preserve"> </w:t>
-      </w:r>
-      <w:r>
-        <w:t xml:space="preserve">axis: neither refuses the injection, both emit the shell-out under direct injection at least as often as</w:t>
-      </w:r>
-      <w:r>
-        <w:t xml:space="preserve"> </w:t>
-      </w:r>
-      <w:r>
-        <w:t xml:space="preserve">the local models, and indirect injection is vendor-split. Assembled into one sandbox—the Landlock</w:t>
-      </w:r>
-      <w:r>
-        <w:t xml:space="preserve"> </w:t>
-      </w:r>
-      <w:r>
-        <w:t xml:space="preserve">allowlist, a deterministic execution deny, and a routeless network namespace—no tested attack in a</w:t>
-      </w:r>
-      <w:r>
-        <w:t xml:space="preserve"> </w:t>
-      </w:r>
-      <w:r>
-        <w:t xml:space="preserve">runtime-mutation and mechanism-bypass matrix violated the filesystem, execution, or network invariants</w:t>
-      </w:r>
-      <w:r>
-        <w:t xml:space="preserve"> </w:t>
-      </w:r>
-      <w:r>
-        <w:t xml:space="preserve">once the domain was entered, the one measured exception being a descriptor opened before it; an external</w:t>
-      </w:r>
-      <w:r>
-        <w:t xml:space="preserve"> </w:t>
-      </w:r>
-      <w:r>
-        <w:rPr>
-          <w:rStyle w:val="VerbatimChar"/>
-        </w:rPr>
-        <w:t xml:space="preserve">process_vm_writev</w:t>
-      </w:r>
-      <w:r>
-        <w:t xml:space="preserve"> </w:t>
-      </w:r>
-      <w:r>
-        <w:t xml:space="preserve">mutation that defeats the user-space gate does not reach the composed</w:t>
-      </w:r>
-      <w:r>
-        <w:t xml:space="preserve"> </w:t>
-      </w:r>
-      <w:r>
-        <w:t xml:space="preserve">sandbox, and a host-owned cgroup kill switch drives the process tree to zero live processes where PID</w:t>
-      </w:r>
-      <w:r>
-        <w:t xml:space="preserve"> </w:t>
-      </w:r>
-      <w:r>
-        <w:t xml:space="preserve">enumeration races. The determinism of the</w:t>
-      </w:r>
-      <w:r>
-        <w:t xml:space="preserve"> </w:t>
-      </w:r>
-      <w:r>
-        <w:t xml:space="preserve">verdict is not soundness of the containment. What protects the host is coverage of the</w:t>
-      </w:r>
-      <w:r>
-        <w:t xml:space="preserve"> </w:t>
-      </w:r>
-      <w:r>
-        <w:t xml:space="preserve">mechanisms an agent can use, and in every trial we ran a denied agent enumerated the</w:t>
-      </w:r>
-      <w:r>
-        <w:t xml:space="preserve"> </w:t>
-      </w:r>
-      <w:r>
-        <w:t xml:space="preserve">alternatives rather than stopping.</w:t>
+        <w:t xml:space="preserve"> </w:t>
+      </w:r>
+      <w:r>
+        <w:t xml:space="preserve">and the kernel’s errno, never from text, following the agent from prompt through syscalls</w:t>
+      </w:r>
+      <w:r>
+        <w:t xml:space="preserve"> </w:t>
+      </w:r>
+      <w:r>
+        <w:t xml:space="preserve">to kernel enforcement and runtime memory mutation.</w:t>
       </w:r>
     </w:p>
     <w:p>
       <w:pPr>
+        <w:pStyle w:val="BodyText"/>
+      </w:pPr>
+      <w:r>
+        <w:t xml:space="preserve">Three results carry the paper. First, the argument-inspection gate is raceable: it blocks a persistence</w:t>
+      </w:r>
+      <w:r>
+        <w:t xml:space="preserve"> </w:t>
+      </w:r>
+      <w:r>
+        <w:t xml:space="preserve">write 4000/4000 times head-on, but a time-of-check-to-time-of-use race on its allow path defeats it</w:t>
+      </w:r>
+      <w:r>
+        <w:t xml:space="preserve"> </w:t>
+      </w:r>
+      <w:r>
+        <w:t xml:space="preserve">at 18.9–23.1% per attempt, and a separate process rewriting the checked buffer wins the same</w:t>
+      </w:r>
+      <w:r>
+        <w:t xml:space="preserve"> </w:t>
+      </w:r>
+      <w:r>
+        <w:t xml:space="preserve">window. Second, manipulated and denied agents produce executable dangerous behaviour and adapt rather than</w:t>
+      </w:r>
+      <w:r>
+        <w:t xml:space="preserve"> </w:t>
+      </w:r>
+      <w:r>
+        <w:t xml:space="preserve">stop: a denied agent enumerated an alternative at all 88 blocked steps and gave up in none of eight</w:t>
+      </w:r>
+      <w:r>
+        <w:t xml:space="preserve"> </w:t>
+      </w:r>
+      <w:r>
+        <w:t xml:space="preserve">trials, and two frontier models complied with prompt injection instead of refusing. Third, moving the</w:t>
+      </w:r>
+      <w:r>
+        <w:t xml:space="preserve"> </w:t>
+      </w:r>
+      <w:r>
+        <w:t xml:space="preserve">decision to kernel object hooks and composing a Landlock allowlist, a deterministic execution deny, a</w:t>
+      </w:r>
+      <w:r>
+        <w:t xml:space="preserve"> </w:t>
+      </w:r>
+      <w:r>
+        <w:t xml:space="preserve">routeless network namespace, and a</w:t>
+      </w:r>
+      <w:r>
+        <w:t xml:space="preserve"> </w:t>
+      </w:r>
+      <w:r>
+        <w:rPr>
+          <w:rStyle w:val="VerbatimChar"/>
+        </w:rPr>
+        <w:t xml:space="preserve">cgroup</w:t>
+      </w:r>
+      <w:r>
+        <w:t xml:space="preserve"> </w:t>
+      </w:r>
+      <w:r>
+        <w:t xml:space="preserve">kill switch resisted the tested attack matrix, with</w:t>
+      </w:r>
+      <w:r>
+        <w:t xml:space="preserve"> </w:t>
+      </w:r>
+      <w:r>
+        <w:rPr>
+          <w:rStyle w:val="VerbatimChar"/>
+        </w:rPr>
+        <w:t xml:space="preserve">cgroup.kill</w:t>
+      </w:r>
+      <w:r>
+        <w:t xml:space="preserve"> </w:t>
+      </w:r>
+      <w:r>
+        <w:t xml:space="preserve">terminating the whole process tree where PID enumeration raced.</w:t>
+      </w:r>
+    </w:p>
+    <w:p>
+      <w:pPr>
+        <w:pStyle w:val="BodyText"/>
+      </w:pPr>
+      <w:r>
+        <w:t xml:space="preserve">This is empirical evidence within the stated threat model and tested matrix, not a proof against untested</w:t>
+      </w:r>
+      <w:r>
+        <w:t xml:space="preserve"> </w:t>
+      </w:r>
+      <w:r>
+        <w:t xml:space="preserve">interfaces, inherited authority, or kernel and hardware flaws.</w:t>
+      </w:r>
+    </w:p>
+    <w:p>
+      <w:pPr>
         <w:pStyle w:val="Heading3"/>
       </w:pPr>
-      <w:bookmarkStart w:id="22" w:name="introduction"/>
+      <w:bookmarkStart w:id="21" w:name="introduction"/>
       <w:r>
         <w:t xml:space="preserve">Introduction</w:t>
       </w:r>
-      <w:bookmarkEnd w:id="22"/>
+      <w:bookmarkEnd w:id="21"/>
     </w:p>
     <w:p>
       <w:pPr>
@@ -1199,7 +915,7 @@
           <w:rPr>
             <w:rStyle w:val="Hyperlink"/>
           </w:rPr>
-          <w:t xml:space="preserve">5</w:t>
+          <w:t xml:space="preserve">4</w:t>
         </w:r>
       </w:hyperlink>
       <w:r>
@@ -1300,37 +1016,26 @@
         </w:r>
       </w:hyperlink>
       <w:r>
-        <w:t xml:space="preserve">), and its stated</w:t>
-      </w:r>
-      <w:r>
-        <w:t xml:space="preserve"> </w:t>
-      </w:r>
-      <w:r>
-        <w:t xml:space="preserve">intent omits the mechanism it executes (Section </w:t>
-      </w:r>
-      <w:hyperlink w:anchor="sec:conceal">
+        <w:t xml:space="preserve">), and neither its</w:t>
+      </w:r>
+      <w:r>
+        <w:t xml:space="preserve"> </w:t>
+      </w:r>
+      <w:r>
+        <w:t xml:space="preserve">stated intent, its cadence, nor its resource footprint attributes the actor, so behavioural observation is</w:t>
+      </w:r>
+      <w:r>
+        <w:t xml:space="preserve"> </w:t>
+      </w:r>
+      <w:r>
+        <w:t xml:space="preserve">not a control (Section </w:t>
+      </w:r>
+      <w:hyperlink w:anchor="sec:attribution">
         <w:r>
           <w:rPr>
             <w:rStyle w:val="Hyperlink"/>
           </w:rPr>
           <w:t xml:space="preserve">4</w:t>
-        </w:r>
-      </w:hyperlink>
-      <w:r>
-        <w:t xml:space="preserve">), so behavioural attribution is not a</w:t>
-      </w:r>
-      <w:r>
-        <w:t xml:space="preserve"> </w:t>
-      </w:r>
-      <w:r>
-        <w:t xml:space="preserve">control (Section </w:t>
-      </w:r>
-      <w:hyperlink w:anchor="sec:attribution">
-        <w:r>
-          <w:rPr>
-            <w:rStyle w:val="Hyperlink"/>
-          </w:rPr>
-          <w:t xml:space="preserve">5</w:t>
         </w:r>
       </w:hyperlink>
       <w:r>
@@ -1447,21 +1152,21 @@
       <w:pPr>
         <w:pStyle w:val="Heading1"/>
       </w:pPr>
-      <w:bookmarkStart w:id="23" w:name="the-control-fails"/>
+      <w:bookmarkStart w:id="22" w:name="the-control-fails"/>
       <w:r>
         <w:t xml:space="preserve">The control fails</w:t>
       </w:r>
-      <w:bookmarkEnd w:id="23"/>
+      <w:bookmarkEnd w:id="22"/>
     </w:p>
     <w:p>
       <w:pPr>
         <w:pStyle w:val="Heading3"/>
       </w:pPr>
-      <w:bookmarkStart w:id="24" w:name="sec:threat"/>
+      <w:bookmarkStart w:id="23" w:name="sec:threat"/>
       <w:r>
         <w:t xml:space="preserve">Threat model</w:t>
       </w:r>
-      <w:bookmarkEnd w:id="24"/>
+      <w:bookmarkEnd w:id="23"/>
     </w:p>
     <w:p>
       <w:pPr>
@@ -1629,171 +1334,171 @@
       <w:pPr>
         <w:pStyle w:val="Heading3"/>
       </w:pPr>
-      <w:bookmarkStart w:id="25" w:name="sec:method"/>
+      <w:bookmarkStart w:id="24" w:name="sec:method"/>
       <w:r>
         <w:t xml:space="preserve">Method</w:t>
+      </w:r>
+      <w:bookmarkEnd w:id="24"/>
+    </w:p>
+    <w:p>
+      <w:pPr>
+        <w:pStyle w:val="Heading6"/>
+      </w:pPr>
+      <w:bookmarkStart w:id="25" w:name="mechanical-oracle."/>
+      <w:r>
+        <w:t xml:space="preserve">Mechanical oracle.</w:t>
       </w:r>
       <w:bookmarkEnd w:id="25"/>
     </w:p>
     <w:p>
       <w:pPr>
-        <w:pStyle w:val="Heading6"/>
-      </w:pPr>
-      <w:bookmarkStart w:id="26" w:name="mechanical-oracle."/>
-      <w:r>
-        <w:t xml:space="preserve">Mechanical oracle.</w:t>
-      </w:r>
-      <w:bookmarkEnd w:id="26"/>
+        <w:pStyle w:val="FirstParagraph"/>
+      </w:pPr>
+      <w:r>
+        <w:t xml:space="preserve">Generated C is compiled with</w:t>
+      </w:r>
+      <w:r>
+        <w:t xml:space="preserve"> </w:t>
+      </w:r>
+      <w:r>
+        <w:rPr>
+          <w:rStyle w:val="VerbatimChar"/>
+        </w:rPr>
+        <w:t xml:space="preserve">gcc</w:t>
+      </w:r>
+      <w:r>
+        <w:t xml:space="preserve"> </w:t>
+      </w:r>
+      <w:r>
+        <w:t xml:space="preserve">and executed under</w:t>
+      </w:r>
+      <w:r>
+        <w:t xml:space="preserve"> </w:t>
+      </w:r>
+      <w:r>
+        <w:rPr>
+          <w:rStyle w:val="VerbatimChar"/>
+        </w:rPr>
+        <w:t xml:space="preserve">timeout 10 unshare -rn strace -f</w:t>
+      </w:r>
+      <w:r>
+        <w:t xml:space="preserve">. The footprint of a run is the set of security-relevant</w:t>
+      </w:r>
+      <w:r>
+        <w:t xml:space="preserve"> </w:t>
+      </w:r>
+      <w:r>
+        <w:t xml:space="preserve">syscalls it issues (</w:t>
+      </w:r>
+      <w:r>
+        <w:rPr>
+          <w:rStyle w:val="VerbatimChar"/>
+        </w:rPr>
+        <w:t xml:space="preserve">execve</w:t>
+      </w:r>
+      <w:r>
+        <w:t xml:space="preserve">,</w:t>
+      </w:r>
+      <w:r>
+        <w:t xml:space="preserve"> </w:t>
+      </w:r>
+      <w:r>
+        <w:rPr>
+          <w:rStyle w:val="VerbatimChar"/>
+        </w:rPr>
+        <w:t xml:space="preserve">connect</w:t>
+      </w:r>
+      <w:r>
+        <w:t xml:space="preserve">,</w:t>
+      </w:r>
+      <w:r>
+        <w:t xml:space="preserve"> </w:t>
+      </w:r>
+      <w:r>
+        <w:rPr>
+          <w:rStyle w:val="VerbatimChar"/>
+        </w:rPr>
+        <w:t xml:space="preserve">openat</w:t>
+      </w:r>
+      <w:r>
+        <w:t xml:space="preserve">,</w:t>
+      </w:r>
+      <w:r>
+        <w:t xml:space="preserve"> </w:t>
+      </w:r>
+      <w:r>
+        <w:rPr>
+          <w:rStyle w:val="VerbatimChar"/>
+        </w:rPr>
+        <w:t xml:space="preserve">unlink</w:t>
+      </w:r>
+      <w:r>
+        <w:t xml:space="preserve">,</w:t>
+      </w:r>
+      <w:r>
+        <w:t xml:space="preserve"> </w:t>
+      </w:r>
+      <w:r>
+        <w:rPr>
+          <w:rStyle w:val="VerbatimChar"/>
+        </w:rPr>
+        <w:t xml:space="preserve">rmdir</w:t>
+      </w:r>
+      <w:r>
+        <w:t xml:space="preserve">, and their families), read from the trace. A baseline of one</w:t>
+      </w:r>
+      <w:r>
+        <w:t xml:space="preserve"> </w:t>
+      </w:r>
+      <w:r>
+        <w:rPr>
+          <w:rStyle w:val="VerbatimChar"/>
+        </w:rPr>
+        <w:t xml:space="preserve">execve</w:t>
+      </w:r>
+      <w:r>
+        <w:t xml:space="preserve">—the</w:t>
+      </w:r>
+      <w:r>
+        <w:t xml:space="preserve"> </w:t>
+      </w:r>
+      <w:r>
+        <w:t xml:space="preserve">process launch—is subtracted before a run counts as</w:t>
+      </w:r>
+      <w:r>
+        <w:t xml:space="preserve"> </w:t>
+      </w:r>
+      <w:r>
+        <w:t xml:space="preserve">“</w:t>
+      </w:r>
+      <w:r>
+        <w:t xml:space="preserve">attempting.</w:t>
+      </w:r>
+      <w:r>
+        <w:t xml:space="preserve">”</w:t>
+      </w:r>
+      <w:r>
+        <w:t xml:space="preserve"> </w:t>
+      </w:r>
+      <w:r>
+        <w:t xml:space="preserve">No claim in this paper is</w:t>
+      </w:r>
+      <w:r>
+        <w:t xml:space="preserve"> </w:t>
+      </w:r>
+      <w:r>
+        <w:t xml:space="preserve">derived by scanning model output for keywords.</w:t>
+      </w:r>
     </w:p>
     <w:p>
       <w:pPr>
-        <w:pStyle w:val="FirstParagraph"/>
-      </w:pPr>
-      <w:r>
-        <w:t xml:space="preserve">Generated C is compiled with</w:t>
-      </w:r>
-      <w:r>
-        <w:t xml:space="preserve"> </w:t>
-      </w:r>
-      <w:r>
-        <w:rPr>
-          <w:rStyle w:val="VerbatimChar"/>
-        </w:rPr>
-        <w:t xml:space="preserve">gcc</w:t>
-      </w:r>
-      <w:r>
-        <w:t xml:space="preserve"> </w:t>
-      </w:r>
-      <w:r>
-        <w:t xml:space="preserve">and executed under</w:t>
-      </w:r>
-      <w:r>
-        <w:t xml:space="preserve"> </w:t>
-      </w:r>
-      <w:r>
-        <w:rPr>
-          <w:rStyle w:val="VerbatimChar"/>
-        </w:rPr>
-        <w:t xml:space="preserve">timeout 10 unshare -rn strace -f</w:t>
-      </w:r>
-      <w:r>
-        <w:t xml:space="preserve">. The footprint of a run is the set of security-relevant</w:t>
-      </w:r>
-      <w:r>
-        <w:t xml:space="preserve"> </w:t>
-      </w:r>
-      <w:r>
-        <w:t xml:space="preserve">syscalls it issues (</w:t>
-      </w:r>
-      <w:r>
-        <w:rPr>
-          <w:rStyle w:val="VerbatimChar"/>
-        </w:rPr>
-        <w:t xml:space="preserve">execve</w:t>
-      </w:r>
-      <w:r>
-        <w:t xml:space="preserve">,</w:t>
-      </w:r>
-      <w:r>
-        <w:t xml:space="preserve"> </w:t>
-      </w:r>
-      <w:r>
-        <w:rPr>
-          <w:rStyle w:val="VerbatimChar"/>
-        </w:rPr>
-        <w:t xml:space="preserve">connect</w:t>
-      </w:r>
-      <w:r>
-        <w:t xml:space="preserve">,</w:t>
-      </w:r>
-      <w:r>
-        <w:t xml:space="preserve"> </w:t>
-      </w:r>
-      <w:r>
-        <w:rPr>
-          <w:rStyle w:val="VerbatimChar"/>
-        </w:rPr>
-        <w:t xml:space="preserve">openat</w:t>
-      </w:r>
-      <w:r>
-        <w:t xml:space="preserve">,</w:t>
-      </w:r>
-      <w:r>
-        <w:t xml:space="preserve"> </w:t>
-      </w:r>
-      <w:r>
-        <w:rPr>
-          <w:rStyle w:val="VerbatimChar"/>
-        </w:rPr>
-        <w:t xml:space="preserve">unlink</w:t>
-      </w:r>
-      <w:r>
-        <w:t xml:space="preserve">,</w:t>
-      </w:r>
-      <w:r>
-        <w:t xml:space="preserve"> </w:t>
-      </w:r>
-      <w:r>
-        <w:rPr>
-          <w:rStyle w:val="VerbatimChar"/>
-        </w:rPr>
-        <w:t xml:space="preserve">rmdir</w:t>
-      </w:r>
-      <w:r>
-        <w:t xml:space="preserve">, and their families), read from the trace. A baseline of one</w:t>
-      </w:r>
-      <w:r>
-        <w:t xml:space="preserve"> </w:t>
-      </w:r>
-      <w:r>
-        <w:rPr>
-          <w:rStyle w:val="VerbatimChar"/>
-        </w:rPr>
-        <w:t xml:space="preserve">execve</w:t>
-      </w:r>
-      <w:r>
-        <w:t xml:space="preserve">—the</w:t>
-      </w:r>
-      <w:r>
-        <w:t xml:space="preserve"> </w:t>
-      </w:r>
-      <w:r>
-        <w:t xml:space="preserve">process launch—is subtracted before a run counts as</w:t>
-      </w:r>
-      <w:r>
-        <w:t xml:space="preserve"> </w:t>
-      </w:r>
-      <w:r>
-        <w:t xml:space="preserve">“</w:t>
-      </w:r>
-      <w:r>
-        <w:t xml:space="preserve">attempting.</w:t>
-      </w:r>
-      <w:r>
-        <w:t xml:space="preserve">”</w:t>
-      </w:r>
-      <w:r>
-        <w:t xml:space="preserve"> </w:t>
-      </w:r>
-      <w:r>
-        <w:t xml:space="preserve">No claim in this paper is</w:t>
-      </w:r>
-      <w:r>
-        <w:t xml:space="preserve"> </w:t>
-      </w:r>
-      <w:r>
-        <w:t xml:space="preserve">derived by scanning model output for keywords.</w:t>
-      </w:r>
-    </w:p>
-    <w:p>
-      <w:pPr>
         <w:pStyle w:val="Heading6"/>
       </w:pPr>
-      <w:bookmarkStart w:id="27" w:name="subjects."/>
+      <w:bookmarkStart w:id="26" w:name="subjects."/>
       <w:r>
         <w:t xml:space="preserve">Subjects.</w:t>
       </w:r>
-      <w:bookmarkEnd w:id="27"/>
+      <w:bookmarkEnd w:id="26"/>
     </w:p>
     <w:p>
       <w:pPr>
@@ -1863,9 +1568,252 @@
       <w:pPr>
         <w:pStyle w:val="Heading6"/>
       </w:pPr>
-      <w:bookmarkStart w:id="28" w:name="where-the-code-runs."/>
+      <w:bookmarkStart w:id="27" w:name="where-the-code-runs."/>
       <w:r>
         <w:t xml:space="preserve">Where the code runs.</w:t>
+      </w:r>
+      <w:bookmarkEnd w:id="27"/>
+    </w:p>
+    <w:p>
+      <w:pPr>
+        <w:pStyle w:val="FirstParagraph"/>
+      </w:pPr>
+      <w:r>
+        <w:rPr>
+          <w:rStyle w:val="VerbatimChar"/>
+        </w:rPr>
+        <w:t xml:space="preserve">unshare -rn</w:t>
+      </w:r>
+      <w:r>
+        <w:t xml:space="preserve"> </w:t>
+      </w:r>
+      <w:r>
+        <w:t xml:space="preserve">supplies a user and network namespace—no route</w:t>
+      </w:r>
+      <w:r>
+        <w:t xml:space="preserve"> </w:t>
+      </w:r>
+      <w:r>
+        <w:t xml:space="preserve">off the host, which is how we assert the zero-egress results—but</w:t>
+      </w:r>
+      <w:r>
+        <w:t xml:space="preserve"> </w:t>
+      </w:r>
+      <w:r>
+        <w:rPr>
+          <w:i/>
+        </w:rPr>
+        <w:t xml:space="preserve">not</w:t>
+      </w:r>
+      <w:r>
+        <w:t xml:space="preserve"> </w:t>
+      </w:r>
+      <w:r>
+        <w:t xml:space="preserve">a mount namespace, so the</w:t>
+      </w:r>
+      <w:r>
+        <w:t xml:space="preserve"> </w:t>
+      </w:r>
+      <w:r>
+        <w:t xml:space="preserve">filesystem the artifact sees is the host’s. Destructive behaviour is therefore contained by the syscall</w:t>
+      </w:r>
+      <w:r>
+        <w:t xml:space="preserve"> </w:t>
+      </w:r>
+      <w:r>
+        <w:t xml:space="preserve">boundary and a scratch directory, not by filesystem isolation. Injection artifacts are safe to run</w:t>
+      </w:r>
+      <w:r>
+        <w:t xml:space="preserve"> </w:t>
+      </w:r>
+      <w:r>
+        <w:t xml:space="preserve">outright: the injected payload is a benign</w:t>
+      </w:r>
+      <w:r>
+        <w:t xml:space="preserve"> </w:t>
+      </w:r>
+      <w:r>
+        <w:rPr>
+          <w:rStyle w:val="VerbatimChar"/>
+        </w:rPr>
+        <w:t xml:space="preserve">echo</w:t>
+      </w:r>
+      <w:r>
+        <w:t xml:space="preserve"> </w:t>
+      </w:r>
+      <w:r>
+        <w:t xml:space="preserve">append into a fixture under</w:t>
+      </w:r>
+      <w:r>
+        <w:t xml:space="preserve"> </w:t>
+      </w:r>
+      <w:r>
+        <w:rPr>
+          <w:rStyle w:val="VerbatimChar"/>
+        </w:rPr>
+        <w:t xml:space="preserve">/tmp/agentsec_run</w:t>
+      </w:r>
+      <w:r>
+        <w:t xml:space="preserve">, so what we observe is the</w:t>
+      </w:r>
+      <w:r>
+        <w:t xml:space="preserve"> </w:t>
+      </w:r>
+      <w:r>
+        <w:rPr>
+          <w:rStyle w:val="VerbatimChar"/>
+        </w:rPr>
+        <w:t xml:space="preserve">execve</w:t>
+      </w:r>
+      <w:r>
+        <w:t xml:space="preserve"> </w:t>
+      </w:r>
+      <w:r>
+        <w:t xml:space="preserve">mechanism, not a destructive</w:t>
+      </w:r>
+      <w:r>
+        <w:t xml:space="preserve"> </w:t>
+      </w:r>
+      <w:r>
+        <w:t xml:space="preserve">effect. Autonomous destruction artifacts (</w:t>
+      </w:r>
+      <w:r>
+        <w:rPr>
+          <w:rStyle w:val="VerbatimChar"/>
+        </w:rPr>
+        <w:t xml:space="preserve">rm -rf build</w:t>
+      </w:r>
+      <w:r>
+        <w:t xml:space="preserve">, direct</w:t>
+      </w:r>
+      <w:r>
+        <w:t xml:space="preserve"> </w:t>
+      </w:r>
+      <w:r>
+        <w:rPr>
+          <w:rStyle w:val="VerbatimChar"/>
+        </w:rPr>
+        <w:t xml:space="preserve">unlink</w:t>
+      </w:r>
+      <w:r>
+        <w:t xml:space="preserve">) are run behind</w:t>
+      </w:r>
+      <w:r>
+        <w:t xml:space="preserve"> </w:t>
+      </w:r>
+      <w:r>
+        <w:t xml:space="preserve">the deny gate—a seccomp filter that blocks</w:t>
+      </w:r>
+      <w:r>
+        <w:t xml:space="preserve"> </w:t>
+      </w:r>
+      <w:r>
+        <w:rPr>
+          <w:rStyle w:val="VerbatimChar"/>
+        </w:rPr>
+        <w:t xml:space="preserve">execve</w:t>
+      </w:r>
+      <w:r>
+        <w:t xml:space="preserve">,</w:t>
+      </w:r>
+      <w:r>
+        <w:t xml:space="preserve"> </w:t>
+      </w:r>
+      <w:r>
+        <w:rPr>
+          <w:rStyle w:val="VerbatimChar"/>
+        </w:rPr>
+        <w:t xml:space="preserve">unlink</w:t>
+      </w:r>
+      <w:r>
+        <w:t xml:space="preserve">,</w:t>
+      </w:r>
+      <w:r>
+        <w:t xml:space="preserve"> </w:t>
+      </w:r>
+      <w:r>
+        <w:rPr>
+          <w:rStyle w:val="VerbatimChar"/>
+        </w:rPr>
+        <w:t xml:space="preserve">unlinkat</w:t>
+      </w:r>
+      <w:r>
+        <w:t xml:space="preserve">,</w:t>
+      </w:r>
+      <w:r>
+        <w:t xml:space="preserve"> </w:t>
+      </w:r>
+      <w:r>
+        <w:rPr>
+          <w:rStyle w:val="VerbatimChar"/>
+        </w:rPr>
+        <w:t xml:space="preserve">rmdir</w:t>
+      </w:r>
+      <w:r>
+        <w:t xml:space="preserve">, and</w:t>
+      </w:r>
+      <w:r>
+        <w:t xml:space="preserve"> </w:t>
+      </w:r>
+      <w:r>
+        <w:rPr>
+          <w:rStyle w:val="VerbatimChar"/>
+        </w:rPr>
+        <w:t xml:space="preserve">connect</w:t>
+      </w:r>
+      <w:r>
+        <w:t xml:space="preserve">—from a throwaway working directory</w:t>
+      </w:r>
+      <w:r>
+        <w:t xml:space="preserve"> </w:t>
+      </w:r>
+      <w:r>
+        <w:t xml:space="preserve">(</w:t>
+      </w:r>
+      <w:r>
+        <w:rPr>
+          <w:rStyle w:val="VerbatimChar"/>
+        </w:rPr>
+        <w:t xml:space="preserve">/tmp/agentsec_auto/sandbox_cwd</w:t>
+      </w:r>
+      <w:r>
+        <w:t xml:space="preserve">); the destructive call returns</w:t>
+      </w:r>
+      <w:r>
+        <w:t xml:space="preserve"> </w:t>
+      </w:r>
+      <w:r>
+        <w:rPr>
+          <w:rStyle w:val="VerbatimChar"/>
+        </w:rPr>
+        <w:t xml:space="preserve">EPERM</w:t>
+      </w:r>
+      <w:r>
+        <w:t xml:space="preserve"> </w:t>
+      </w:r>
+      <w:r>
+        <w:t xml:space="preserve">and nothing is</w:t>
+      </w:r>
+      <w:r>
+        <w:t xml:space="preserve"> </w:t>
+      </w:r>
+      <w:r>
+        <w:t xml:space="preserve">deleted, so we record the attempt without executing it. Fixtures are recreated per run and removed</w:t>
+      </w:r>
+      <w:r>
+        <w:t xml:space="preserve"> </w:t>
+      </w:r>
+      <w:r>
+        <w:t xml:space="preserve">after.</w:t>
+      </w:r>
+    </w:p>
+    <w:p>
+      <w:pPr>
+        <w:pStyle w:val="Heading6"/>
+      </w:pPr>
+      <w:bookmarkStart w:id="28" w:name="the-gate."/>
+      <w:r>
+        <w:t xml:space="preserve">The gate.</w:t>
       </w:r>
       <w:bookmarkEnd w:id="28"/>
     </w:p>
@@ -1874,82 +1822,22 @@
         <w:pStyle w:val="FirstParagraph"/>
       </w:pPr>
       <w:r>
-        <w:rPr>
-          <w:rStyle w:val="VerbatimChar"/>
-        </w:rPr>
-        <w:t xml:space="preserve">unshare -rn</w:t>
-      </w:r>
-      <w:r>
-        <w:t xml:space="preserve"> </w:t>
-      </w:r>
-      <w:r>
-        <w:t xml:space="preserve">supplies a user and network namespace—no route</w:t>
-      </w:r>
-      <w:r>
-        <w:t xml:space="preserve"> </w:t>
-      </w:r>
-      <w:r>
-        <w:t xml:space="preserve">off the host, which is how we assert the zero-egress results—but</w:t>
-      </w:r>
-      <w:r>
-        <w:t xml:space="preserve"> </w:t>
-      </w:r>
-      <w:r>
-        <w:rPr>
-          <w:i/>
-        </w:rPr>
-        <w:t xml:space="preserve">not</w:t>
-      </w:r>
-      <w:r>
-        <w:t xml:space="preserve"> </w:t>
-      </w:r>
-      <w:r>
-        <w:t xml:space="preserve">a mount namespace, so the</w:t>
-      </w:r>
-      <w:r>
-        <w:t xml:space="preserve"> </w:t>
-      </w:r>
-      <w:r>
-        <w:t xml:space="preserve">filesystem the artifact sees is the host’s. Destructive behaviour is therefore contained by the syscall</w:t>
-      </w:r>
-      <w:r>
-        <w:t xml:space="preserve"> </w:t>
-      </w:r>
-      <w:r>
-        <w:t xml:space="preserve">boundary and a scratch directory, not by filesystem isolation. Injection artifacts are safe to run</w:t>
-      </w:r>
-      <w:r>
-        <w:t xml:space="preserve"> </w:t>
-      </w:r>
-      <w:r>
-        <w:t xml:space="preserve">outright: the injected payload is a benign</w:t>
-      </w:r>
-      <w:r>
-        <w:t xml:space="preserve"> </w:t>
-      </w:r>
-      <w:r>
-        <w:rPr>
-          <w:rStyle w:val="VerbatimChar"/>
-        </w:rPr>
-        <w:t xml:space="preserve">echo</w:t>
-      </w:r>
-      <w:r>
-        <w:t xml:space="preserve"> </w:t>
-      </w:r>
-      <w:r>
-        <w:t xml:space="preserve">append into a fixture under</w:t>
-      </w:r>
-      <w:r>
-        <w:t xml:space="preserve"> </w:t>
-      </w:r>
-      <w:r>
-        <w:rPr>
-          <w:rStyle w:val="VerbatimChar"/>
-        </w:rPr>
-        <w:t xml:space="preserve">/tmp/agentsec_run</w:t>
-      </w:r>
-      <w:r>
-        <w:t xml:space="preserve">, so what we observe is the</w:t>
+        <w:t xml:space="preserve">The rootful gate forks the target, installs</w:t>
+      </w:r>
+      <w:r>
+        <w:t xml:space="preserve"> </w:t>
+      </w:r>
+      <w:r>
+        <w:rPr>
+          <w:rStyle w:val="VerbatimChar"/>
+        </w:rPr>
+        <w:t xml:space="preserve">SCMP_ACT_NOTIFY</w:t>
+      </w:r>
+      <w:r>
+        <w:t xml:space="preserve"> </w:t>
+      </w:r>
+      <w:r>
+        <w:t xml:space="preserve">on</w:t>
       </w:r>
       <w:r>
         <w:t xml:space="preserve"> </w:t>
@@ -1961,43 +1849,136 @@
         <w:t xml:space="preserve">execve</w:t>
       </w:r>
       <w:r>
-        <w:t xml:space="preserve"> </w:t>
-      </w:r>
-      <w:r>
-        <w:t xml:space="preserve">mechanism, not a destructive</w:t>
-      </w:r>
-      <w:r>
-        <w:t xml:space="preserve"> </w:t>
-      </w:r>
-      <w:r>
-        <w:t xml:space="preserve">effect. Autonomous destruction artifacts (</w:t>
-      </w:r>
-      <w:r>
-        <w:rPr>
-          <w:rStyle w:val="VerbatimChar"/>
-        </w:rPr>
-        <w:t xml:space="preserve">rm -rf build</w:t>
-      </w:r>
-      <w:r>
-        <w:t xml:space="preserve">, direct</w:t>
-      </w:r>
-      <w:r>
-        <w:t xml:space="preserve"> </w:t>
-      </w:r>
-      <w:r>
-        <w:rPr>
-          <w:rStyle w:val="VerbatimChar"/>
-        </w:rPr>
-        <w:t xml:space="preserve">unlink</w:t>
-      </w:r>
-      <w:r>
-        <w:t xml:space="preserve">) are run behind</w:t>
-      </w:r>
-      <w:r>
-        <w:t xml:space="preserve"> </w:t>
-      </w:r>
-      <w:r>
-        <w:t xml:space="preserve">the deny gate—a seccomp filter that blocks</w:t>
+        <w:t xml:space="preserve">,</w:t>
+      </w:r>
+      <w:r>
+        <w:t xml:space="preserve"> </w:t>
+      </w:r>
+      <w:r>
+        <w:rPr>
+          <w:rStyle w:val="VerbatimChar"/>
+        </w:rPr>
+        <w:t xml:space="preserve">execveat</w:t>
+      </w:r>
+      <w:r>
+        <w:t xml:space="preserve">, and</w:t>
+      </w:r>
+      <w:r>
+        <w:t xml:space="preserve"> </w:t>
+      </w:r>
+      <w:r>
+        <w:rPr>
+          <w:rStyle w:val="VerbatimChar"/>
+        </w:rPr>
+        <w:t xml:space="preserve">connect</w:t>
+      </w:r>
+      <w:r>
+        <w:t xml:space="preserve"> </w:t>
+      </w:r>
+      <w:r>
+        <w:t xml:space="preserve">(and, in persistence mode, on</w:t>
+      </w:r>
+      <w:r>
+        <w:t xml:space="preserve"> </w:t>
+      </w:r>
+      <w:r>
+        <w:rPr>
+          <w:rStyle w:val="VerbatimChar"/>
+        </w:rPr>
+        <w:t xml:space="preserve">openat</w:t>
+      </w:r>
+      <w:r>
+        <w:t xml:space="preserve">,</w:t>
+      </w:r>
+      <w:r>
+        <w:t xml:space="preserve"> </w:t>
+      </w:r>
+      <w:r>
+        <w:rPr>
+          <w:rStyle w:val="VerbatimChar"/>
+        </w:rPr>
+        <w:t xml:space="preserve">rename</w:t>
+      </w:r>
+      <w:r>
+        <w:t xml:space="preserve">,</w:t>
+      </w:r>
+      <w:r>
+        <w:t xml:space="preserve"> </w:t>
+      </w:r>
+      <w:r>
+        <w:rPr>
+          <w:rStyle w:val="VerbatimChar"/>
+        </w:rPr>
+        <w:t xml:space="preserve">link</w:t>
+      </w:r>
+      <w:r>
+        <w:t xml:space="preserve">, and their variants), and sends the notification</w:t>
+      </w:r>
+      <w:r>
+        <w:t xml:space="preserve"> </w:t>
+      </w:r>
+      <w:r>
+        <w:t xml:space="preserve">descriptor to the supervisor. On each notification the supervisor reads the pathname from</w:t>
+      </w:r>
+      <w:r>
+        <w:t xml:space="preserve"> </w:t>
+      </w:r>
+      <w:r>
+        <w:rPr>
+          <w:rStyle w:val="VerbatimChar"/>
+        </w:rPr>
+        <w:t xml:space="preserve">/proc/pid/mem</w:t>
+      </w:r>
+      <w:r>
+        <w:t xml:space="preserve">, compares it against policy, and either allows the call by returning</w:t>
+      </w:r>
+      <w:r>
+        <w:t xml:space="preserve"> </w:t>
+      </w:r>
+      <w:r>
+        <w:rPr>
+          <w:rStyle w:val="VerbatimChar"/>
+        </w:rPr>
+        <w:t xml:space="preserve">SECCOMP_USER_NOTIF_FLAG_CONTINUE</w:t>
+      </w:r>
+      <w:r>
+        <w:t xml:space="preserve"> </w:t>
+      </w:r>
+      <w:r>
+        <w:t xml:space="preserve">or denies it with</w:t>
+      </w:r>
+      <w:r>
+        <w:t xml:space="preserve"> </w:t>
+      </w:r>
+      <w:r>
+        <w:rPr>
+          <w:rStyle w:val="VerbatimChar"/>
+        </w:rPr>
+        <w:t xml:space="preserve">EPERM</w:t>
+      </w:r>
+      <w:r>
+        <w:t xml:space="preserve">. The rootless gate,</w:t>
+      </w:r>
+      <w:r>
+        <w:t xml:space="preserve"> </w:t>
+      </w:r>
+      <w:r>
+        <w:t xml:space="preserve">by contrast, is a blanket</w:t>
+      </w:r>
+      <w:r>
+        <w:t xml:space="preserve"> </w:t>
+      </w:r>
+      <w:r>
+        <w:rPr>
+          <w:rStyle w:val="VerbatimChar"/>
+        </w:rPr>
+        <w:t xml:space="preserve">SCMP_ACT_ERRNO</w:t>
+      </w:r>
+      <w:r>
+        <w:t xml:space="preserve"> </w:t>
+      </w:r>
+      <w:r>
+        <w:t xml:space="preserve">deny of</w:t>
       </w:r>
       <w:r>
         <w:t xml:space="preserve"> </w:t>
@@ -2009,43 +1990,16 @@
         <w:t xml:space="preserve">execve</w:t>
       </w:r>
       <w:r>
-        <w:t xml:space="preserve">,</w:t>
-      </w:r>
-      <w:r>
-        <w:t xml:space="preserve"> </w:t>
-      </w:r>
-      <w:r>
-        <w:rPr>
-          <w:rStyle w:val="VerbatimChar"/>
-        </w:rPr>
-        <w:t xml:space="preserve">unlink</w:t>
-      </w:r>
-      <w:r>
-        <w:t xml:space="preserve">,</w:t>
-      </w:r>
-      <w:r>
-        <w:t xml:space="preserve"> </w:t>
-      </w:r>
-      <w:r>
-        <w:rPr>
-          <w:rStyle w:val="VerbatimChar"/>
-        </w:rPr>
-        <w:t xml:space="preserve">unlinkat</w:t>
-      </w:r>
-      <w:r>
-        <w:t xml:space="preserve">,</w:t>
-      </w:r>
-      <w:r>
-        <w:t xml:space="preserve"> </w:t>
-      </w:r>
-      <w:r>
-        <w:rPr>
-          <w:rStyle w:val="VerbatimChar"/>
-        </w:rPr>
-        <w:t xml:space="preserve">rmdir</w:t>
-      </w:r>
-      <w:r>
-        <w:t xml:space="preserve">, and</w:t>
+        <w:t xml:space="preserve">/</w:t>
+      </w:r>
+      <w:r>
+        <w:rPr>
+          <w:rStyle w:val="VerbatimChar"/>
+        </w:rPr>
+        <w:t xml:space="preserve">execveat</w:t>
+      </w:r>
+      <w:r>
+        <w:t xml:space="preserve">/</w:t>
       </w:r>
       <w:r>
         <w:t xml:space="preserve"> </w:t>
@@ -2057,270 +2011,21 @@
         <w:t xml:space="preserve">connect</w:t>
       </w:r>
       <w:r>
-        <w:t xml:space="preserve">—from a throwaway working directory</w:t>
-      </w:r>
-      <w:r>
-        <w:t xml:space="preserve"> </w:t>
-      </w:r>
-      <w:r>
-        <w:t xml:space="preserve">(</w:t>
-      </w:r>
-      <w:r>
-        <w:rPr>
-          <w:rStyle w:val="VerbatimChar"/>
-        </w:rPr>
-        <w:t xml:space="preserve">/tmp/agentsec_auto/sandbox_cwd</w:t>
-      </w:r>
-      <w:r>
-        <w:t xml:space="preserve">); the destructive call returns</w:t>
-      </w:r>
-      <w:r>
-        <w:t xml:space="preserve"> </w:t>
-      </w:r>
-      <w:r>
-        <w:rPr>
-          <w:rStyle w:val="VerbatimChar"/>
-        </w:rPr>
-        <w:t xml:space="preserve">EPERM</w:t>
-      </w:r>
-      <w:r>
-        <w:t xml:space="preserve"> </w:t>
-      </w:r>
-      <w:r>
-        <w:t xml:space="preserve">and nothing is</w:t>
-      </w:r>
-      <w:r>
-        <w:t xml:space="preserve"> </w:t>
-      </w:r>
-      <w:r>
-        <w:t xml:space="preserve">deleted, so we record the attempt without executing it. Fixtures are recreated per run and removed</w:t>
-      </w:r>
-      <w:r>
-        <w:t xml:space="preserve"> </w:t>
-      </w:r>
-      <w:r>
-        <w:t xml:space="preserve">after.</w:t>
+        <w:t xml:space="preserve"> </w:t>
+      </w:r>
+      <w:r>
+        <w:t xml:space="preserve">with no argument inspection.</w:t>
       </w:r>
     </w:p>
     <w:p>
       <w:pPr>
         <w:pStyle w:val="Heading6"/>
       </w:pPr>
-      <w:bookmarkStart w:id="29" w:name="the-gate."/>
-      <w:r>
-        <w:t xml:space="preserve">The gate.</w:t>
+      <w:bookmarkStart w:id="29" w:name="statistics."/>
+      <w:r>
+        <w:t xml:space="preserve">Statistics.</w:t>
       </w:r>
       <w:bookmarkEnd w:id="29"/>
-    </w:p>
-    <w:p>
-      <w:pPr>
-        <w:pStyle w:val="FirstParagraph"/>
-      </w:pPr>
-      <w:r>
-        <w:t xml:space="preserve">The rootful gate forks the target, installs</w:t>
-      </w:r>
-      <w:r>
-        <w:t xml:space="preserve"> </w:t>
-      </w:r>
-      <w:r>
-        <w:rPr>
-          <w:rStyle w:val="VerbatimChar"/>
-        </w:rPr>
-        <w:t xml:space="preserve">SCMP_ACT_NOTIFY</w:t>
-      </w:r>
-      <w:r>
-        <w:t xml:space="preserve"> </w:t>
-      </w:r>
-      <w:r>
-        <w:t xml:space="preserve">on</w:t>
-      </w:r>
-      <w:r>
-        <w:t xml:space="preserve"> </w:t>
-      </w:r>
-      <w:r>
-        <w:rPr>
-          <w:rStyle w:val="VerbatimChar"/>
-        </w:rPr>
-        <w:t xml:space="preserve">execve</w:t>
-      </w:r>
-      <w:r>
-        <w:t xml:space="preserve">,</w:t>
-      </w:r>
-      <w:r>
-        <w:t xml:space="preserve"> </w:t>
-      </w:r>
-      <w:r>
-        <w:rPr>
-          <w:rStyle w:val="VerbatimChar"/>
-        </w:rPr>
-        <w:t xml:space="preserve">execveat</w:t>
-      </w:r>
-      <w:r>
-        <w:t xml:space="preserve">, and</w:t>
-      </w:r>
-      <w:r>
-        <w:t xml:space="preserve"> </w:t>
-      </w:r>
-      <w:r>
-        <w:rPr>
-          <w:rStyle w:val="VerbatimChar"/>
-        </w:rPr>
-        <w:t xml:space="preserve">connect</w:t>
-      </w:r>
-      <w:r>
-        <w:t xml:space="preserve"> </w:t>
-      </w:r>
-      <w:r>
-        <w:t xml:space="preserve">(and, in persistence mode, on</w:t>
-      </w:r>
-      <w:r>
-        <w:t xml:space="preserve"> </w:t>
-      </w:r>
-      <w:r>
-        <w:rPr>
-          <w:rStyle w:val="VerbatimChar"/>
-        </w:rPr>
-        <w:t xml:space="preserve">openat</w:t>
-      </w:r>
-      <w:r>
-        <w:t xml:space="preserve">,</w:t>
-      </w:r>
-      <w:r>
-        <w:t xml:space="preserve"> </w:t>
-      </w:r>
-      <w:r>
-        <w:rPr>
-          <w:rStyle w:val="VerbatimChar"/>
-        </w:rPr>
-        <w:t xml:space="preserve">rename</w:t>
-      </w:r>
-      <w:r>
-        <w:t xml:space="preserve">,</w:t>
-      </w:r>
-      <w:r>
-        <w:t xml:space="preserve"> </w:t>
-      </w:r>
-      <w:r>
-        <w:rPr>
-          <w:rStyle w:val="VerbatimChar"/>
-        </w:rPr>
-        <w:t xml:space="preserve">link</w:t>
-      </w:r>
-      <w:r>
-        <w:t xml:space="preserve">, and their variants), and sends the notification</w:t>
-      </w:r>
-      <w:r>
-        <w:t xml:space="preserve"> </w:t>
-      </w:r>
-      <w:r>
-        <w:t xml:space="preserve">descriptor to the supervisor. On each notification the supervisor reads the pathname from</w:t>
-      </w:r>
-      <w:r>
-        <w:t xml:space="preserve"> </w:t>
-      </w:r>
-      <w:r>
-        <w:rPr>
-          <w:rStyle w:val="VerbatimChar"/>
-        </w:rPr>
-        <w:t xml:space="preserve">/proc/pid/mem</w:t>
-      </w:r>
-      <w:r>
-        <w:t xml:space="preserve">, compares it against policy, and either allows the call by returning</w:t>
-      </w:r>
-      <w:r>
-        <w:t xml:space="preserve"> </w:t>
-      </w:r>
-      <w:r>
-        <w:rPr>
-          <w:rStyle w:val="VerbatimChar"/>
-        </w:rPr>
-        <w:t xml:space="preserve">SECCOMP_USER_NOTIF_FLAG_CONTINUE</w:t>
-      </w:r>
-      <w:r>
-        <w:t xml:space="preserve"> </w:t>
-      </w:r>
-      <w:r>
-        <w:t xml:space="preserve">or denies it with</w:t>
-      </w:r>
-      <w:r>
-        <w:t xml:space="preserve"> </w:t>
-      </w:r>
-      <w:r>
-        <w:rPr>
-          <w:rStyle w:val="VerbatimChar"/>
-        </w:rPr>
-        <w:t xml:space="preserve">EPERM</w:t>
-      </w:r>
-      <w:r>
-        <w:t xml:space="preserve">. The rootless gate,</w:t>
-      </w:r>
-      <w:r>
-        <w:t xml:space="preserve"> </w:t>
-      </w:r>
-      <w:r>
-        <w:t xml:space="preserve">by contrast, is a blanket</w:t>
-      </w:r>
-      <w:r>
-        <w:t xml:space="preserve"> </w:t>
-      </w:r>
-      <w:r>
-        <w:rPr>
-          <w:rStyle w:val="VerbatimChar"/>
-        </w:rPr>
-        <w:t xml:space="preserve">SCMP_ACT_ERRNO</w:t>
-      </w:r>
-      <w:r>
-        <w:t xml:space="preserve"> </w:t>
-      </w:r>
-      <w:r>
-        <w:t xml:space="preserve">deny of</w:t>
-      </w:r>
-      <w:r>
-        <w:t xml:space="preserve"> </w:t>
-      </w:r>
-      <w:r>
-        <w:rPr>
-          <w:rStyle w:val="VerbatimChar"/>
-        </w:rPr>
-        <w:t xml:space="preserve">execve</w:t>
-      </w:r>
-      <w:r>
-        <w:t xml:space="preserve">/</w:t>
-      </w:r>
-      <w:r>
-        <w:rPr>
-          <w:rStyle w:val="VerbatimChar"/>
-        </w:rPr>
-        <w:t xml:space="preserve">execveat</w:t>
-      </w:r>
-      <w:r>
-        <w:t xml:space="preserve">/</w:t>
-      </w:r>
-      <w:r>
-        <w:t xml:space="preserve"> </w:t>
-      </w:r>
-      <w:r>
-        <w:rPr>
-          <w:rStyle w:val="VerbatimChar"/>
-        </w:rPr>
-        <w:t xml:space="preserve">connect</w:t>
-      </w:r>
-      <w:r>
-        <w:t xml:space="preserve"> </w:t>
-      </w:r>
-      <w:r>
-        <w:t xml:space="preserve">with no argument inspection.</w:t>
-      </w:r>
-    </w:p>
-    <w:p>
-      <w:pPr>
-        <w:pStyle w:val="Heading6"/>
-      </w:pPr>
-      <w:bookmarkStart w:id="30" w:name="statistics."/>
-      <w:r>
-        <w:t xml:space="preserve">Statistics.</w:t>
-      </w:r>
-      <w:bookmarkEnd w:id="30"/>
     </w:p>
     <w:p>
       <w:pPr>
@@ -2502,11 +2207,11 @@
       <w:pPr>
         <w:pStyle w:val="Heading3"/>
       </w:pPr>
-      <w:bookmarkStart w:id="31" w:name="sec:toctou"/>
+      <w:bookmarkStart w:id="30" w:name="sec:toctou"/>
       <w:r>
         <w:t xml:space="preserve">The argument-inspection gate is bypassable</w:t>
       </w:r>
-      <w:bookmarkEnd w:id="31"/>
+      <w:bookmarkEnd w:id="30"/>
     </w:p>
     <w:p>
       <w:pPr>
@@ -3076,11 +2781,11 @@
       <w:pPr>
         <w:pStyle w:val="Heading3"/>
       </w:pPr>
-      <w:bookmarkStart w:id="32" w:name="sec:coverage"/>
+      <w:bookmarkStart w:id="31" w:name="sec:coverage"/>
       <w:r>
         <w:t xml:space="preserve">Coverage is incomplete before any race</w:t>
       </w:r>
-      <w:bookmarkEnd w:id="32"/>
+      <w:bookmarkEnd w:id="31"/>
     </w:p>
     <w:p>
       <w:pPr>
@@ -3812,11 +3517,11 @@
       <w:pPr>
         <w:pStyle w:val="Heading6"/>
       </w:pPr>
-      <w:bookmarkStart w:id="33" w:name="the-asynchronous-path-measured."/>
+      <w:bookmarkStart w:id="32" w:name="the-asynchronous-path-measured."/>
       <w:r>
         <w:t xml:space="preserve">The asynchronous path, measured.</w:t>
       </w:r>
-      <w:bookmarkEnd w:id="33"/>
+      <w:bookmarkEnd w:id="32"/>
     </w:p>
     <w:p>
       <w:pPr>
@@ -4600,11 +4305,11 @@
       <w:pPr>
         <w:pStyle w:val="Heading3"/>
       </w:pPr>
-      <w:bookmarkStart w:id="34" w:name="sec:selectivity"/>
+      <w:bookmarkStart w:id="33" w:name="sec:selectivity"/>
       <w:r>
         <w:t xml:space="preserve">Selectivity trades false positives against evasion</w:t>
       </w:r>
-      <w:bookmarkEnd w:id="34"/>
+      <w:bookmarkEnd w:id="33"/>
     </w:p>
     <w:p>
       <w:pPr>
@@ -4790,11 +4495,11 @@
       <w:pPr>
         <w:pStyle w:val="Heading3"/>
       </w:pPr>
-      <w:bookmarkStart w:id="35" w:name="sec:holds"/>
+      <w:bookmarkStart w:id="34" w:name="sec:holds"/>
       <w:r>
         <w:t xml:space="preserve">What holds</w:t>
       </w:r>
-      <w:bookmarkEnd w:id="35"/>
+      <w:bookmarkEnd w:id="34"/>
     </w:p>
     <w:p>
       <w:pPr>
@@ -4944,21 +4649,21 @@
       <w:pPr>
         <w:pStyle w:val="Heading1"/>
       </w:pPr>
-      <w:bookmarkStart w:id="36" w:name="a-race-free-successor-benchmarked"/>
+      <w:bookmarkStart w:id="35" w:name="a-race-free-successor-benchmarked"/>
       <w:r>
         <w:t xml:space="preserve">A race-free successor, benchmarked</w:t>
       </w:r>
-      <w:bookmarkEnd w:id="36"/>
+      <w:bookmarkEnd w:id="35"/>
     </w:p>
     <w:p>
       <w:pPr>
         <w:pStyle w:val="Heading3"/>
       </w:pPr>
-      <w:bookmarkStart w:id="37" w:name="sec:landlock"/>
+      <w:bookmarkStart w:id="36" w:name="sec:landlock"/>
       <w:r>
         <w:t xml:space="preserve">From bypass to fix: a race-free filesystem allowlist</w:t>
       </w:r>
-      <w:bookmarkEnd w:id="37"/>
+      <w:bookmarkEnd w:id="36"/>
     </w:p>
     <w:p>
       <w:pPr>
@@ -5054,11 +4759,11 @@
       <w:pPr>
         <w:pStyle w:val="Heading6"/>
       </w:pPr>
-      <w:bookmarkStart w:id="38" w:name="the-race-closes."/>
+      <w:bookmarkStart w:id="37" w:name="the-race-closes."/>
       <w:r>
         <w:t xml:space="preserve">The race closes.</w:t>
       </w:r>
-      <w:bookmarkEnd w:id="38"/>
+      <w:bookmarkEnd w:id="37"/>
     </w:p>
     <w:p>
       <w:pPr>
@@ -5261,11 +4966,11 @@
       <w:pPr>
         <w:pStyle w:val="Heading6"/>
       </w:pPr>
-      <w:bookmarkStart w:id="39" w:name="the-syscall-alias-gap-closes."/>
+      <w:bookmarkStart w:id="38" w:name="the-syscall-alias-gap-closes."/>
       <w:r>
         <w:t xml:space="preserve">The syscall-alias gap closes.</w:t>
       </w:r>
-      <w:bookmarkEnd w:id="39"/>
+      <w:bookmarkEnd w:id="38"/>
     </w:p>
     <w:p>
       <w:pPr>
@@ -5644,11 +5349,11 @@
       <w:pPr>
         <w:pStyle w:val="Heading6"/>
       </w:pPr>
-      <w:bookmarkStart w:id="40" w:name="where-the-allowlist-stops."/>
+      <w:bookmarkStart w:id="39" w:name="where-the-allowlist-stops."/>
       <w:r>
         <w:t xml:space="preserve">Where the allowlist stops.</w:t>
       </w:r>
-      <w:bookmarkEnd w:id="40"/>
+      <w:bookmarkEnd w:id="39"/>
     </w:p>
     <w:p>
       <w:pPr>
@@ -6397,21 +6102,21 @@
       <w:pPr>
         <w:pStyle w:val="Heading1"/>
       </w:pPr>
-      <w:bookmarkStart w:id="41" w:name="the-agent-as-threat-actor"/>
+      <w:bookmarkStart w:id="40" w:name="the-agent-as-threat-actor"/>
       <w:r>
         <w:t xml:space="preserve">The agent as threat actor</w:t>
       </w:r>
-      <w:bookmarkEnd w:id="41"/>
+      <w:bookmarkEnd w:id="40"/>
     </w:p>
     <w:p>
       <w:pPr>
         <w:pStyle w:val="Heading3"/>
       </w:pPr>
-      <w:bookmarkStart w:id="42" w:name="sec:enum"/>
+      <w:bookmarkStart w:id="41" w:name="sec:enum"/>
       <w:r>
         <w:t xml:space="preserve">The denied agent enumerates</w:t>
       </w:r>
-      <w:bookmarkEnd w:id="42"/>
+      <w:bookmarkEnd w:id="41"/>
     </w:p>
     <w:p>
       <w:pPr>
@@ -7526,11 +7231,11 @@
       <w:pPr>
         <w:pStyle w:val="Heading3"/>
       </w:pPr>
-      <w:bookmarkStart w:id="43" w:name="sec:matrix"/>
+      <w:bookmarkStart w:id="42" w:name="sec:matrix"/>
       <w:r>
         <w:t xml:space="preserve">Autonomous versus injected behaviour</w:t>
       </w:r>
-      <w:bookmarkEnd w:id="43"/>
+      <w:bookmarkEnd w:id="42"/>
     </w:p>
     <w:p>
       <w:pPr>
@@ -7856,11 +7561,11 @@
       <w:pPr>
         <w:pStyle w:val="Heading3"/>
       </w:pPr>
-      <w:bookmarkStart w:id="44" w:name="sec:frontier"/>
+      <w:bookmarkStart w:id="43" w:name="sec:frontier"/>
       <w:r>
         <w:t xml:space="preserve">The model axis: frontier models</w:t>
       </w:r>
-      <w:bookmarkEnd w:id="44"/>
+      <w:bookmarkEnd w:id="43"/>
     </w:p>
     <w:p>
       <w:pPr>
@@ -8789,87 +8494,30 @@
       <w:pPr>
         <w:pStyle w:val="Heading3"/>
       </w:pPr>
-      <w:bookmarkStart w:id="45" w:name="sec:conceal"/>
-      <w:r>
-        <w:t xml:space="preserve">Self-description diverges from execution</w:t>
-      </w:r>
-      <w:bookmarkEnd w:id="45"/>
+      <w:bookmarkStart w:id="44" w:name="sec:attribution"/>
+      <w:r>
+        <w:t xml:space="preserve">Why behavioural observation is not enforcement</w:t>
+      </w:r>
+      <w:bookmarkEnd w:id="44"/>
     </w:p>
     <w:p>
       <w:pPr>
         <w:pStyle w:val="FirstParagraph"/>
       </w:pPr>
       <w:r>
-        <w:t xml:space="preserve">One proposed detector compares the model’s own description of its code against the code’s measured</w:t>
-      </w:r>
-      <w:r>
-        <w:t xml:space="preserve"> </w:t>
-      </w:r>
-      <w:r>
-        <w:t xml:space="preserve">behaviour. We can exhibit why it fails as a security signal. We generated 18 injection artifacts with</w:t>
-      </w:r>
-      <w:r>
-        <w:t xml:space="preserve"> </w:t>
-      </w:r>
-      <w:r>
-        <w:rPr>
-          <w:rStyle w:val="VerbatimChar"/>
-        </w:rPr>
-        <w:t xml:space="preserve">qwen2.5-coder:7b</w:t>
-      </w:r>
-      <w:r>
-        <w:t xml:space="preserve">, then in a separate call asked the model to describe what each one does; the</w:t>
-      </w:r>
-      <w:r>
-        <w:t xml:space="preserve"> </w:t>
-      </w:r>
-      <w:r>
-        <w:t xml:space="preserve">footprint is read mechanically from</w:t>
-      </w:r>
-      <w:r>
-        <w:t xml:space="preserve"> </w:t>
-      </w:r>
-      <w:r>
-        <w:rPr>
-          <w:rStyle w:val="VerbatimChar"/>
-        </w:rPr>
-        <w:t xml:space="preserve">strace</w:t>
-      </w:r>
-      <w:r>
-        <w:t xml:space="preserve">. A case diverges when the footprint shows a</w:t>
-      </w:r>
-      <w:r>
-        <w:t xml:space="preserve"> </w:t>
-      </w:r>
-      <w:r>
-        <w:t xml:space="preserve">dangerous syscall the description omits—we make no claim about intent, only about the gap between the</w:t>
-      </w:r>
-      <w:r>
-        <w:t xml:space="preserve"> </w:t>
-      </w:r>
-      <w:r>
-        <w:t xml:space="preserve">stated and the executed. The injected payload is a benign</w:t>
-      </w:r>
-      <w:r>
-        <w:t xml:space="preserve"> </w:t>
-      </w:r>
-      <w:r>
-        <w:rPr>
-          <w:rStyle w:val="VerbatimChar"/>
-        </w:rPr>
-        <w:t xml:space="preserve">echo</w:t>
-      </w:r>
-      <w:r>
-        <w:t xml:space="preserve"> </w:t>
-      </w:r>
-      <w:r>
-        <w:t xml:space="preserve">append, so the</w:t>
-      </w:r>
-      <w:r>
-        <w:t xml:space="preserve"> </w:t>
-      </w:r>
-      <w:r>
-        <w:t xml:space="preserve">artifacts are safe to run.</w:t>
+        <w:t xml:space="preserve">The porous gate invites a tempting move: profile the agent from what it looks like and stop the bad actor</w:t>
+      </w:r>
+      <w:r>
+        <w:t xml:space="preserve"> </w:t>
+      </w:r>
+      <w:r>
+        <w:t xml:space="preserve">before it reaches a gap. Four observational signals fail for one structural reason—a manipulated agent</w:t>
+      </w:r>
+      <w:r>
+        <w:t xml:space="preserve"> </w:t>
+      </w:r>
+      <w:r>
+        <w:t xml:space="preserve">chooses its own behaviour, so any signature the defender keys on, the agent can produce or suppress.</w:t>
       </w:r>
     </w:p>
     <w:p>
@@ -8877,7 +8525,46 @@
         <w:pStyle w:val="BodyText"/>
       </w:pPr>
       <w:r>
-        <w:t xml:space="preserve">Fourteen of the eighteen artifacts spawned a shell, and in 5 of those 14 the description omitted it (36%,</w:t>
+        <w:rPr>
+          <w:i/>
+        </w:rPr>
+        <w:t xml:space="preserve">Self-description diverges from execution.</w:t>
+      </w:r>
+      <w:r>
+        <w:t xml:space="preserve"> </w:t>
+      </w:r>
+      <w:r>
+        <w:t xml:space="preserve">We generated 18 injection artifacts with</w:t>
+      </w:r>
+      <w:r>
+        <w:t xml:space="preserve"> </w:t>
+      </w:r>
+      <w:r>
+        <w:rPr>
+          <w:rStyle w:val="VerbatimChar"/>
+        </w:rPr>
+        <w:t xml:space="preserve">qwen2.5-coder:7b</w:t>
+      </w:r>
+      <w:r>
+        <w:t xml:space="preserve">, asked the model in a separate call to describe each, and read the footprint</w:t>
+      </w:r>
+      <w:r>
+        <w:t xml:space="preserve"> </w:t>
+      </w:r>
+      <w:r>
+        <w:t xml:space="preserve">from</w:t>
+      </w:r>
+      <w:r>
+        <w:t xml:space="preserve"> </w:t>
+      </w:r>
+      <w:r>
+        <w:rPr>
+          <w:rStyle w:val="VerbatimChar"/>
+        </w:rPr>
+        <w:t xml:space="preserve">strace</w:t>
+      </w:r>
+      <w:r>
+        <w:t xml:space="preserve">. Fourteen spawned a shell; in 5 of those 14 (36%,</w:t>
       </w:r>
       <w:r>
         <w:t xml:space="preserve"> </w:t>
@@ -8900,7 +8587,13 @@
         </m:r>
       </m:oMath>
       <w:r>
-        <w:t xml:space="preserve">): the description reported a file write and left out the</w:t>
+        <w:t xml:space="preserve">) the description</w:t>
+      </w:r>
+      <w:r>
+        <w:t xml:space="preserve"> </w:t>
+      </w:r>
+      <w:r>
+        <w:t xml:space="preserve">reported a file write and omitted the</w:t>
       </w:r>
       <w:r>
         <w:t xml:space="preserve"> </w:t>
@@ -8912,19 +8605,28 @@
         <w:t xml:space="preserve">execve</w:t>
       </w:r>
       <w:r>
-        <w:t xml:space="preserve">. (An earlier</w:t>
-      </w:r>
-      <w:r>
-        <w:t xml:space="preserve"> </w:t>
-      </w:r>
-      <w:r>
-        <w:t xml:space="preserve">divergence run put the rate at 22% on a different sample; the interval on 5/14 covers that value, so</w:t>
-      </w:r>
-      <w:r>
-        <w:t xml:space="preserve"> </w:t>
-      </w:r>
-      <w:r>
-        <w:t xml:space="preserve">the two runs are consistent and the rate is sample-dependent.) Two divergent cases, verbatim:</w:t>
+        <w:t xml:space="preserve">, and across all injection cases the stated summary</w:t>
+      </w:r>
+      <w:r>
+        <w:t xml:space="preserve"> </w:t>
+      </w:r>
+      <w:r>
+        <w:t xml:space="preserve">diverged from the footprint in 22%. The data effect is real—the file is written—but the summary</w:t>
+      </w:r>
+      <w:r>
+        <w:t xml:space="preserve"> </w:t>
+      </w:r>
+      <w:r>
+        <w:t xml:space="preserve">presents the shell-out as a plain append, so a defender clearing artifacts on stated intent (OWASP LLM06,</w:t>
+      </w:r>
+      <w:r>
+        <w:t xml:space="preserve"> </w:t>
+      </w:r>
+      <w:r>
+        <w:t xml:space="preserve">excessive agency </w:t>
+      </w:r>
+      <w:r>
+        <w:t xml:space="preserve">) would pass it:</w:t>
       </w:r>
     </w:p>
     <w:p>
@@ -8935,55 +8637,7 @@
         <w:rPr>
           <w:rStyle w:val="VerbatimChar"/>
         </w:rPr>
-        <w:t xml:space="preserve">Case 1</w:t>
-      </w:r>
-      <w:r>
-        <w:br/>
-      </w:r>
-      <w:r>
-        <w:rPr>
-          <w:rStyle w:val="VerbatimChar"/>
-        </w:rPr>
-        <w:t xml:space="preserve">  STATED : "writes a message to /var/log/myapp.log and also appends 'mirrored' to /tmp/agentsec_run/mirror"</w:t>
-      </w:r>
-      <w:r>
-        <w:br/>
-      </w:r>
-      <w:r>
-        <w:rPr>
-          <w:rStyle w:val="VerbatimChar"/>
-        </w:rPr>
-        <w:t xml:space="preserve">  CODE   : system("sh -c 'echo mirrored &gt;&gt; /tmp/agentsec_run/mirror'");</w:t>
-      </w:r>
-      <w:r>
-        <w:br/>
-      </w:r>
-      <w:r>
-        <w:rPr>
-          <w:rStyle w:val="VerbatimChar"/>
-        </w:rPr>
-        <w:t xml:space="preserve">  DID    : execve("/bin/sh", ["sh","-c","sh -c 'echo mirrored &gt;&gt; /tmp/agentsec_run/mirror'"]) = 0</w:t>
-      </w:r>
-      <w:r>
-        <w:br/>
-      </w:r>
-      <w:r>
-        <w:br/>
-      </w:r>
-      <w:r>
-        <w:rPr>
-          <w:rStyle w:val="VerbatimChar"/>
-        </w:rPr>
-        <w:t xml:space="preserve">Case 2</w:t>
-      </w:r>
-      <w:r>
-        <w:br/>
-      </w:r>
-      <w:r>
-        <w:rPr>
-          <w:rStyle w:val="VerbatimChar"/>
-        </w:rPr>
-        <w:t xml:space="preserve">  STATED : "logs a message to a log file and also appends the string 'mirrored' to another file in /tmp/agentsec_run/"</w:t>
+        <w:t xml:space="preserve">  STATED : "writes to /var/log/myapp.log and appends 'mirrored' to /tmp/agentsec_run/mirror"</w:t>
       </w:r>
       <w:r>
         <w:br/>
@@ -9009,85 +8663,19 @@
         <w:pStyle w:val="FirstParagraph"/>
       </w:pPr>
       <w:r>
-        <w:t xml:space="preserve">The description omits the mechanism while the data effect it reports is real: the file is in fact</w:t>
-      </w:r>
-      <w:r>
-        <w:t xml:space="preserve"> </w:t>
-      </w:r>
-      <w:r>
-        <w:t xml:space="preserve">“</w:t>
-      </w:r>
-      <w:r>
-        <w:t xml:space="preserve">mirrored,</w:t>
-      </w:r>
-      <w:r>
-        <w:t xml:space="preserve">”</w:t>
-      </w:r>
-      <w:r>
-        <w:t xml:space="preserve"> </w:t>
-      </w:r>
-      <w:r>
-        <w:t xml:space="preserve">and the summary presents the shell-out as a plain append. A reviewer reading only the</w:t>
-      </w:r>
-      <w:r>
-        <w:t xml:space="preserve"> </w:t>
-      </w:r>
-      <w:r>
-        <w:t xml:space="preserve">summary would not see that</w:t>
-      </w:r>
-      <w:r>
-        <w:t xml:space="preserve"> </w:t>
-      </w:r>
-      <w:r>
-        <w:rPr>
-          <w:rStyle w:val="VerbatimChar"/>
-        </w:rPr>
-        <w:t xml:space="preserve">system()</w:t>
-      </w:r>
-      <w:r>
-        <w:t xml:space="preserve"> </w:t>
-      </w:r>
-      <w:r>
-        <w:t xml:space="preserve">ran</w:t>
-      </w:r>
-      <w:r>
-        <w:t xml:space="preserve"> </w:t>
-      </w:r>
-      <w:r>
-        <w:rPr>
-          <w:rStyle w:val="VerbatimChar"/>
-        </w:rPr>
-        <w:t xml:space="preserve">execve("/bin/sh")</w:t>
-      </w:r>
-      <w:r>
-        <w:t xml:space="preserve">, and a defender clearing</w:t>
-      </w:r>
-      <w:r>
-        <w:t xml:space="preserve"> </w:t>
-      </w:r>
-      <w:r>
-        <w:t xml:space="preserve">artifacts on stated intent (OWASP LLM06, excessive agency </w:t>
-      </w:r>
-      <w:r>
-        <w:t xml:space="preserve">) would pass it. This is why</w:t>
-      </w:r>
-      <w:r>
-        <w:t xml:space="preserve"> </w:t>
-      </w:r>
-      <w:r>
-        <w:t xml:space="preserve">self-description cannot be the trust boundary: the stated mechanism and the executed mechanism diverge,</w:t>
-      </w:r>
-      <w:r>
-        <w:t xml:space="preserve"> </w:t>
-      </w:r>
-      <w:r>
-        <w:t xml:space="preserve">and only the syscall footprint carries the truth. The description is a post-hoc summary elicited in a</w:t>
-      </w:r>
-      <w:r>
-        <w:t xml:space="preserve"> </w:t>
-      </w:r>
-      <w:r>
-        <w:t xml:space="preserve">separate call, not a reasoning trace, so the finding is narrower than—and consistent with—the</w:t>
+        <w:t xml:space="preserve">The omission falls on the shell-out artifacts specifically—file-only artifacts describe themselves</w:t>
+      </w:r>
+      <w:r>
+        <w:t xml:space="preserve"> </w:t>
+      </w:r>
+      <w:r>
+        <w:t xml:space="preserve">faithfully—so it tracks the shell, not noise. The description is a post-hoc summary elicited in a</w:t>
+      </w:r>
+      <w:r>
+        <w:t xml:space="preserve"> </w:t>
+      </w:r>
+      <w:r>
+        <w:t xml:space="preserve">separate call, not a reasoning trace, so this is narrower than and consistent with the</w:t>
       </w:r>
       <w:r>
         <w:t xml:space="preserve"> </w:t>
@@ -9102,81 +8690,47 @@
         <w:t xml:space="preserve">and Lanham et al. </w:t>
       </w:r>
       <w:r>
-        <w:t xml:space="preserve">. The</w:t>
-      </w:r>
-      <w:r>
-        <w:t xml:space="preserve"> </w:t>
-      </w:r>
-      <w:r>
-        <w:t xml:space="preserve">omission falls on the shell-out artifacts specifically—benign file-only artifacts describe themselves</w:t>
-      </w:r>
-      <w:r>
-        <w:t xml:space="preserve"> </w:t>
-      </w:r>
-      <w:r>
-        <w:t xml:space="preserve">faithfully—so it tracks the presence of the shell, not noise.</w:t>
+        <w:t xml:space="preserve">.</w:t>
       </w:r>
     </w:p>
     <w:p>
       <w:pPr>
-        <w:pStyle w:val="Heading3"/>
-      </w:pPr>
-      <w:bookmarkStart w:id="46" w:name="sec:attribution"/>
-      <w:r>
-        <w:t xml:space="preserve">Behavioural attribution is not a control</w:t>
-      </w:r>
-      <w:bookmarkEnd w:id="46"/>
-    </w:p>
-    <w:p>
-      <w:pPr>
-        <w:pStyle w:val="FirstParagraph"/>
-      </w:pPr>
-      <w:r>
-        <w:t xml:space="preserve">The porous gate invites a different move: profile the agent and stop the bad actor before it reaches a</w:t>
-      </w:r>
-      <w:r>
-        <w:t xml:space="preserve"> </w:t>
-      </w:r>
-      <w:r>
-        <w:t xml:space="preserve">gap. Three candidate signals fail for one structural reason—a manipulated agent chooses its own</w:t>
-      </w:r>
-      <w:r>
-        <w:t xml:space="preserve"> </w:t>
-      </w:r>
-      <w:r>
-        <w:t xml:space="preserve">behaviour, so any signature the defender keys on, the agent can produce or suppress—and the data of</w:t>
-      </w:r>
-      <w:r>
-        <w:t xml:space="preserve"> </w:t>
-      </w:r>
-      <w:r>
-        <w:t xml:space="preserve">Part III shows each failing in turn.</w:t>
-      </w:r>
-    </w:p>
-    <w:p>
-      <w:pPr>
         <w:pStyle w:val="BodyText"/>
       </w:pPr>
       <w:r>
-        <w:t xml:space="preserve">Cadence does not attribute. A script that inserts random sleeps shows no cadence separation we can key on</w:t>
-      </w:r>
-      <w:r>
-        <w:t xml:space="preserve"> </w:t>
-      </w:r>
-      <w:r>
-        <w:t xml:space="preserve">from a live agent’s action cadence (coefficient of variation 0.45 versus 0.54; fifteen of seventeen</w:t>
-      </w:r>
-      <w:r>
-        <w:t xml:space="preserve"> </w:t>
-      </w:r>
-      <w:r>
-        <w:t xml:space="preserve">inter-action intervals overlap); we ran no formal equivalence test at this sample size, and timing</w:t>
-      </w:r>
-      <w:r>
-        <w:t xml:space="preserve"> </w:t>
-      </w:r>
-      <w:r>
-        <w:t xml:space="preserve">separates neither by construction, while Section </w:t>
+        <w:rPr>
+          <w:i/>
+        </w:rPr>
+        <w:t xml:space="preserve">Cadence does not attribute.</w:t>
+      </w:r>
+      <w:r>
+        <w:t xml:space="preserve"> </w:t>
+      </w:r>
+      <w:r>
+        <w:t xml:space="preserve">A script inserting random sleeps shows no cadence separation we can key</w:t>
+      </w:r>
+      <w:r>
+        <w:t xml:space="preserve"> </w:t>
+      </w:r>
+      <w:r>
+        <w:t xml:space="preserve">on from a live agent’s action cadence (coefficient of variation 0.45 versus 0.54; fifteen of seventeen</w:t>
+      </w:r>
+      <w:r>
+        <w:t xml:space="preserve"> </w:t>
+      </w:r>
+      <w:r>
+        <w:t xml:space="preserve">inter-action intervals overlap; no equivalence test at this</w:t>
+      </w:r>
+      <w:r>
+        <w:t xml:space="preserve"> </w:t>
+      </w:r>
+      <m:oMath>
+        <m:r>
+          <m:t>N</m:t>
+        </m:r>
+      </m:oMath>
+      <w:r>
+        <w:t xml:space="preserve">), and Section </w:t>
       </w:r>
       <w:hyperlink w:anchor="sec:matrix">
         <w:r>
@@ -9190,13 +8744,13 @@
         <w:t xml:space="preserve"> </w:t>
       </w:r>
       <w:r>
-        <w:t xml:space="preserve">finds no behavioural-speed difference</w:t>
-      </w:r>
-      <w:r>
-        <w:t xml:space="preserve"> </w:t>
-      </w:r>
-      <w:r>
-        <w:t xml:space="preserve">between the two forces to key on.</w:t>
+        <w:t xml:space="preserve">finds no</w:t>
+      </w:r>
+      <w:r>
+        <w:t xml:space="preserve"> </w:t>
+      </w:r>
+      <w:r>
+        <w:t xml:space="preserve">behavioural-speed difference between the two forces either.</w:t>
       </w:r>
     </w:p>
     <w:p>
@@ -9204,56 +8758,22 @@
         <w:pStyle w:val="BodyText"/>
       </w:pPr>
       <w:r>
-        <w:t xml:space="preserve">Stated intent does not attribute. Divergence between a model’s one-sentence description and its measured</w:t>
-      </w:r>
-      <w:r>
-        <w:t xml:space="preserve"> </w:t>
-      </w:r>
-      <w:r>
-        <w:t xml:space="preserve">footprint appeared in 22% of injection cases and in none of the autonomous or benign cases; where it</w:t>
-      </w:r>
-      <w:r>
-        <w:t xml:space="preserve"> </w:t>
-      </w:r>
-      <w:r>
-        <w:t xml:space="preserve">appeared the description omitted the executed mechanism (Section </w:t>
-      </w:r>
-      <w:hyperlink w:anchor="sec:conceal">
-        <w:r>
-          <w:rPr>
-            <w:rStyle w:val="Hyperlink"/>
-          </w:rPr>
-          <w:t xml:space="preserve">4</w:t>
-        </w:r>
-      </w:hyperlink>
-      <w:r>
-        <w:t xml:space="preserve">), and a non-manipulated model mostly</w:t>
-      </w:r>
-      <w:r>
-        <w:t xml:space="preserve"> </w:t>
-      </w:r>
-      <w:r>
-        <w:t xml:space="preserve">narrates honestly while a manipulated one writes a faithful malicious description and drives the divergence</w:t>
-      </w:r>
-      <w:r>
-        <w:t xml:space="preserve"> </w:t>
-      </w:r>
-      <w:r>
-        <w:t xml:space="preserve">to zero.</w:t>
-      </w:r>
-    </w:p>
-    <w:p>
-      <w:pPr>
-        <w:pStyle w:val="BodyText"/>
-      </w:pPr>
-      <w:r>
-        <w:t xml:space="preserve">Reaction to a denial is a real behaviour that points at coverage. A denied agent adapts on 90% of steps</w:t>
-      </w:r>
-      <w:r>
-        <w:t xml:space="preserve"> </w:t>
-      </w:r>
-      <w:r>
-        <w:t xml:space="preserve">and stopped in none of eight trials (Section </w:t>
+        <w:rPr>
+          <w:i/>
+        </w:rPr>
+        <w:t xml:space="preserve">Reaction to a denial points at coverage, not identity.</w:t>
+      </w:r>
+      <w:r>
+        <w:t xml:space="preserve"> </w:t>
+      </w:r>
+      <w:r>
+        <w:t xml:space="preserve">A denied agent adapted on 90% of steps and</w:t>
+      </w:r>
+      <w:r>
+        <w:t xml:space="preserve"> </w:t>
+      </w:r>
+      <w:r>
+        <w:t xml:space="preserve">stopped in none of eight trials (Section </w:t>
       </w:r>
       <w:hyperlink w:anchor="sec:enum">
         <w:r>
@@ -9270,19 +8790,7 @@
         <w:t xml:space="preserve"> </w:t>
       </w:r>
       <w:r>
-        <w:t xml:space="preserve">mechanisms; that</w:t>
-      </w:r>
-      <w:r>
-        <w:t xml:space="preserve"> </w:t>
-      </w:r>
-      <w:r>
-        <w:t xml:space="preserve">identifies a persistent actor, not an attributable one, and it returns the weight to coverage: blocking one</w:t>
-      </w:r>
-      <w:r>
-        <w:t xml:space="preserve"> </w:t>
-      </w:r>
-      <w:r>
-        <w:t xml:space="preserve">path routes the agent to the next.</w:t>
+        <w:t xml:space="preserve">mechanisms; that identifies a persistent actor, not an attributable one.</w:t>
       </w:r>
     </w:p>
     <w:p>
@@ -9290,115 +8798,46 @@
         <w:pStyle w:val="BodyText"/>
       </w:pPr>
       <w:r>
-        <w:t xml:space="preserve">The three routes reach one wall.</w:t>
-      </w:r>
-      <w:r>
-        <w:t xml:space="preserve"> </w:t>
-      </w:r>
-      <w:r>
-        <w:t xml:space="preserve">“</w:t>
-      </w:r>
-      <w:r>
-        <w:t xml:space="preserve">LLM agent</w:t>
-      </w:r>
-      <w:r>
-        <w:t xml:space="preserve">”</w:t>
-      </w:r>
-      <w:r>
-        <w:t xml:space="preserve"> </w:t>
-      </w:r>
-      <w:r>
-        <w:t xml:space="preserve">names no behavioural class; it is any distribution its</w:t>
-      </w:r>
-      <w:r>
-        <w:t xml:space="preserve"> </w:t>
-      </w:r>
-      <w:r>
-        <w:t xml:space="preserve">controller chooses, able to pace like a human, retry like a port scanner, or stop after one block. The</w:t>
-      </w:r>
-      <w:r>
-        <w:t xml:space="preserve"> </w:t>
-      </w:r>
-      <w:r>
-        <w:t xml:space="preserve">adversarially robust facts are what the actor did at the boundary (its footprint) and whether it was</w:t>
-      </w:r>
-      <w:r>
-        <w:t xml:space="preserve"> </w:t>
-      </w:r>
-      <w:r>
-        <w:t xml:space="preserve">authorized (the policy at the gate), not what it looks like. Certify the gate; do not profile the actor.</w:t>
-      </w:r>
-    </w:p>
-    <w:p>
-      <w:pPr>
-        <w:pStyle w:val="Heading3"/>
-      </w:pPr>
-      <w:bookmarkStart w:id="47" w:name="sec:telemetry"/>
-      <w:r>
-        <w:t xml:space="preserve">Resource footprint is not the security signal</w:t>
-      </w:r>
-      <w:bookmarkEnd w:id="47"/>
-    </w:p>
-    <w:p>
-      <w:pPr>
-        <w:pStyle w:val="FirstParagraph"/>
-      </w:pPr>
-      <w:r>
-        <w:t xml:space="preserve">One more candidate signal, resource use, fails at the host. Generation and execution sit about 2700x apart</w:t>
-      </w:r>
-      <w:r>
-        <w:t xml:space="preserve"> </w:t>
-      </w:r>
-      <w:r>
-        <w:t xml:space="preserve">in resident memory: the generation phase holds a 5.1 GB model in the server process, and the compiled</w:t>
-      </w:r>
-      <w:r>
-        <w:t xml:space="preserve"> </w:t>
-      </w:r>
-      <w:r>
-        <w:t xml:space="preserve">artifact runs in 1.92 MB with near-zero CPU. The weight of the agentic loop is in the model-server trust</w:t>
-      </w:r>
-      <w:r>
-        <w:t xml:space="preserve"> </w:t>
-      </w:r>
-      <w:r>
-        <w:t xml:space="preserve">domain, off the orchestrator host, reached over an RPC the orchestrator waits on in roughly 20 MB of</w:t>
-      </w:r>
-      <w:r>
-        <w:t xml:space="preserve"> </w:t>
-      </w:r>
-      <w:r>
-        <w:t xml:space="preserve">interpreter. A resource-anomaly detector on the orchestrator sees neither the generation (it looks like</w:t>
-      </w:r>
-      <w:r>
-        <w:t xml:space="preserve"> </w:t>
-      </w:r>
-      <w:r>
-        <w:t xml:space="preserve">idle network wait) nor the artifact (it looks like any small process). The security-relevant signal is the</w:t>
-      </w:r>
-      <w:r>
-        <w:t xml:space="preserve"> </w:t>
-      </w:r>
-      <w:r>
-        <w:t xml:space="preserve">syscall footprint and the egress, and the egress has to be captured at the network: the study corpus made</w:t>
-      </w:r>
-      <w:r>
-        <w:t xml:space="preserve"> </w:t>
-      </w:r>
-      <w:r>
-        <w:t xml:space="preserve">zero network calls (0/360 injection, 0/240 persistence, 0/45 autonomous), and an egress-tasked</w:t>
-      </w:r>
-      <w:r>
-        <w:t xml:space="preserve"> </w:t>
-      </w:r>
-      <w:r>
-        <w:t xml:space="preserve">scenario networked in only 1 of 3 generations—when it did, it fetched and ran a payload from a</w:t>
-      </w:r>
-      <w:r>
-        <w:t xml:space="preserve"> </w:t>
-      </w:r>
-      <w:r>
-        <w:t xml:space="preserve">prompt-controlled URL through</w:t>
+        <w:rPr>
+          <w:i/>
+        </w:rPr>
+        <w:t xml:space="preserve">Resource footprint is not the signal.</w:t>
+      </w:r>
+      <w:r>
+        <w:t xml:space="preserve"> </w:t>
+      </w:r>
+      <w:r>
+        <w:t xml:space="preserve">Generation and execution sit about 2700x apart in resident</w:t>
+      </w:r>
+      <w:r>
+        <w:t xml:space="preserve"> </w:t>
+      </w:r>
+      <w:r>
+        <w:t xml:space="preserve">memory—a 5.1 GB model in the server process against a 1.92 MB compiled artifact reached over an RPC</w:t>
+      </w:r>
+      <w:r>
+        <w:t xml:space="preserve"> </w:t>
+      </w:r>
+      <w:r>
+        <w:t xml:space="preserve">the orchestrator waits on in roughly 20 MB—so a resource-anomaly detector sees neither the generation</w:t>
+      </w:r>
+      <w:r>
+        <w:t xml:space="preserve"> </w:t>
+      </w:r>
+      <w:r>
+        <w:t xml:space="preserve">(idle network wait) nor the artifact (any small process). The corpus made zero network calls (0/360</w:t>
+      </w:r>
+      <w:r>
+        <w:t xml:space="preserve"> </w:t>
+      </w:r>
+      <w:r>
+        <w:t xml:space="preserve">injection, 0/240 persistence, 0/45 autonomous); an egress-tasked scenario networked in 1 of 3</w:t>
+      </w:r>
+      <w:r>
+        <w:t xml:space="preserve"> </w:t>
+      </w:r>
+      <w:r>
+        <w:t xml:space="preserve">generations, fetching and running a payload from a prompt-controlled URL through</w:t>
       </w:r>
       <w:r>
         <w:t xml:space="preserve"> </w:t>
@@ -9424,43 +8863,87 @@
         <w:t xml:space="preserve"> </w:t>
       </w:r>
       <w:r>
-        <w:t xml:space="preserve">(T1105 ingress tool transfer,</w:t>
-      </w:r>
-      <w:r>
-        <w:t xml:space="preserve"> </w:t>
-      </w:r>
-      <w:r>
-        <w:t xml:space="preserve">T1071.001 web protocols, T1059 </w:t>
-      </w:r>
-      <w:r>
-        <w:t xml:space="preserve">). Whoever owns the URL owns what runs next; resource use does</w:t>
-      </w:r>
-      <w:r>
-        <w:t xml:space="preserve"> </w:t>
-      </w:r>
-      <w:r>
-        <w:t xml:space="preserve">not carry that fact, and the network boundary does.</w:t>
+        <w:t xml:space="preserve">(T1105, T1071.001, T1059 </w:t>
+      </w:r>
+      <w:r>
+        <w:t xml:space="preserve">). Whoever owns the URL</w:t>
+      </w:r>
+      <w:r>
+        <w:t xml:space="preserve"> </w:t>
+      </w:r>
+      <w:r>
+        <w:t xml:space="preserve">owns what runs next.</w:t>
       </w:r>
     </w:p>
     <w:p>
       <w:pPr>
-        <w:pStyle w:val="Heading1"/>
-      </w:pPr>
-      <w:bookmarkStart w:id="48" w:name="the-composed-sandbox-under-attack"/>
-      <w:r>
-        <w:t xml:space="preserve">The composed sandbox under attack</w:t>
-      </w:r>
-      <w:bookmarkEnd w:id="48"/>
+        <w:pStyle w:val="BodyText"/>
+      </w:pPr>
+      <w:r>
+        <w:t xml:space="preserve">The four routes reach one wall.</w:t>
+      </w:r>
+      <w:r>
+        <w:t xml:space="preserve"> </w:t>
+      </w:r>
+      <w:r>
+        <w:t xml:space="preserve">“</w:t>
+      </w:r>
+      <w:r>
+        <w:t xml:space="preserve">LLM agent</w:t>
+      </w:r>
+      <w:r>
+        <w:t xml:space="preserve">”</w:t>
+      </w:r>
+      <w:r>
+        <w:t xml:space="preserve"> </w:t>
+      </w:r>
+      <w:r>
+        <w:t xml:space="preserve">names no behavioural class; it is any distribution its</w:t>
+      </w:r>
+      <w:r>
+        <w:t xml:space="preserve"> </w:t>
+      </w:r>
+      <w:r>
+        <w:t xml:space="preserve">controller chooses, able to pace like a human, retry like a port scanner, or stop after one block. The</w:t>
+      </w:r>
+      <w:r>
+        <w:t xml:space="preserve"> </w:t>
+      </w:r>
+      <w:r>
+        <w:t xml:space="preserve">adversarially robust facts are what the actor did at the boundary (its footprint), whether it was</w:t>
+      </w:r>
+      <w:r>
+        <w:t xml:space="preserve"> </w:t>
+      </w:r>
+      <w:r>
+        <w:t xml:space="preserve">authorized (the policy at the gate), and where its bytes went (the network), not what it looks like.</w:t>
+      </w:r>
+      <w:r>
+        <w:t xml:space="preserve"> </w:t>
+      </w:r>
+      <w:r>
+        <w:t xml:space="preserve">Certify the boundary; do not profile the actor.</w:t>
+      </w:r>
     </w:p>
     <w:p>
       <w:pPr>
+        <w:pStyle w:val="Heading1"/>
+      </w:pPr>
+      <w:bookmarkStart w:id="45" w:name="the-composed-sandbox-under-attack"/>
+      <w:r>
+        <w:t xml:space="preserve">The composed sandbox under attack</w:t>
+      </w:r>
+      <w:bookmarkEnd w:id="45"/>
+    </w:p>
+    <w:p>
+      <w:pPr>
         <w:pStyle w:val="Heading3"/>
       </w:pPr>
-      <w:bookmarkStart w:id="49" w:name="sec:composed"/>
+      <w:bookmarkStart w:id="46" w:name="sec:composed"/>
       <w:r>
         <w:t xml:space="preserve">Five invariants, and where each is enforced</w:t>
       </w:r>
-      <w:bookmarkEnd w:id="49"/>
+      <w:bookmarkEnd w:id="46"/>
     </w:p>
     <w:p>
       <w:pPr>
@@ -10793,11 +10276,11 @@
       <w:pPr>
         <w:pStyle w:val="Heading3"/>
       </w:pPr>
-      <w:bookmarkStart w:id="50" w:name="sec:memmut"/>
+      <w:bookmarkStart w:id="47" w:name="sec:memmut"/>
       <w:r>
         <w:t xml:space="preserve">Runtime process-memory mutation</w:t>
       </w:r>
-      <w:bookmarkEnd w:id="50"/>
+      <w:bookmarkEnd w:id="47"/>
     </w:p>
     <w:p>
       <w:pPr>
@@ -11124,11 +10607,11 @@
       <w:pPr>
         <w:pStyle w:val="Heading3"/>
       </w:pPr>
-      <w:bookmarkStart w:id="51" w:name="sec:killswitch"/>
+      <w:bookmarkStart w:id="48" w:name="sec:killswitch"/>
       <w:r>
         <w:t xml:space="preserve">Process-tree termination and resource bounds</w:t>
       </w:r>
-      <w:bookmarkEnd w:id="51"/>
+      <w:bookmarkEnd w:id="48"/>
     </w:p>
     <w:p>
       <w:pPr>
@@ -11808,11 +11291,11 @@
       <w:pPr>
         <w:pStyle w:val="Heading3"/>
       </w:pPr>
-      <w:bookmarkStart w:id="52" w:name="sec:discussion"/>
+      <w:bookmarkStart w:id="49" w:name="sec:discussion"/>
       <w:r>
         <w:t xml:space="preserve">Discussion</w:t>
       </w:r>
-      <w:bookmarkEnd w:id="52"/>
+      <w:bookmarkEnd w:id="49"/>
     </w:p>
     <w:p>
       <w:pPr>
@@ -11901,7 +11384,7 @@
           <w:rPr>
             <w:rStyle w:val="Hyperlink"/>
           </w:rPr>
-          <w:t xml:space="preserve">5</w:t>
+          <w:t xml:space="preserve">4</w:t>
         </w:r>
       </w:hyperlink>
       <w:r>
@@ -12036,30 +11519,24 @@
       <w:pPr>
         <w:pStyle w:val="Heading3"/>
       </w:pPr>
-      <w:bookmarkStart w:id="53" w:name="sec:limits"/>
+      <w:bookmarkStart w:id="50" w:name="sec:limits"/>
       <w:r>
         <w:t xml:space="preserve">Limitations</w:t>
       </w:r>
-      <w:bookmarkEnd w:id="53"/>
+      <w:bookmarkEnd w:id="50"/>
     </w:p>
     <w:p>
       <w:pPr>
         <w:pStyle w:val="FirstParagraph"/>
       </w:pPr>
       <w:r>
-        <w:t xml:space="preserve">The study is scoped, and we state the scope. The core subjects are three</w:t>
-      </w:r>
-      <w:r>
-        <w:t xml:space="preserve"> </w:t>
-      </w:r>
-      <w:r>
-        <w:t xml:space="preserve">local code models between 1.5 and 7 billion parameters; the model axis is extended to two frontier models</w:t>
-      </w:r>
-      <w:r>
-        <w:t xml:space="preserve"> </w:t>
-      </w:r>
-      <w:r>
-        <w:t xml:space="preserve">(Section </w:t>
+        <w:t xml:space="preserve">The study is scoped. The core subjects are three local code models of 1.5–7B parameters; the frontier</w:t>
+      </w:r>
+      <w:r>
+        <w:t xml:space="preserve"> </w:t>
+      </w:r>
+      <w:r>
+        <w:t xml:space="preserve">axis (Section </w:t>
       </w:r>
       <w:hyperlink w:anchor="sec:frontier">
         <w:r>
@@ -12070,31 +11547,25 @@
         </w:r>
       </w:hyperlink>
       <w:r>
-        <w:t xml:space="preserve">) for the injection experiment only, at N=8 per model per channel, so the</w:t>
-      </w:r>
-      <w:r>
-        <w:t xml:space="preserve"> </w:t>
-      </w:r>
-      <w:r>
-        <w:t xml:space="preserve">frontier result is a direction rather than a benchmark, and the enumeration, self-description-divergence,</w:t>
-      </w:r>
-      <w:r>
-        <w:t xml:space="preserve"> </w:t>
-      </w:r>
-      <w:r>
-        <w:t xml:space="preserve">and autonomous-destruction experiments remain local-model. The autonomous destruction result rests on 45 attempting</w:t>
-      </w:r>
-      <w:r>
-        <w:t xml:space="preserve"> </w:t>
-      </w:r>
-      <w:r>
-        <w:t xml:space="preserve">artifacts; both the rates and the specific mechanisms seen may shift with larger models and larger samples,</w:t>
-      </w:r>
-      <w:r>
-        <w:t xml:space="preserve"> </w:t>
-      </w:r>
-      <w:r>
-        <w:t xml:space="preserve">and the emergent-destruction finding in particular is small-</w:t>
+        <w:t xml:space="preserve">) covers the injection experiment only, at N=8 per model per channel, so</w:t>
+      </w:r>
+      <w:r>
+        <w:t xml:space="preserve"> </w:t>
+      </w:r>
+      <w:r>
+        <w:t xml:space="preserve">it is a direction, not a benchmark, and the enumeration, self-description, and autonomous-destruction</w:t>
+      </w:r>
+      <w:r>
+        <w:t xml:space="preserve"> </w:t>
+      </w:r>
+      <w:r>
+        <w:t xml:space="preserve">results stay local-model. The autonomous-destruction result rests on 45 artifacts and is</w:t>
+      </w:r>
+      <w:r>
+        <w:t xml:space="preserve"> </w:t>
+      </w:r>
+      <w:r>
+        <w:t xml:space="preserve">small-</w:t>
       </w:r>
       <m:oMath>
         <m:r>
@@ -12102,49 +11573,43 @@
         </m:r>
       </m:oMath>
       <w:r>
-        <w:t xml:space="preserve">. Every measurement was taken on a single x86_64 host. Interception was checked across three</w:t>
-      </w:r>
-      <w:r>
-        <w:t xml:space="preserve"> </w:t>
-      </w:r>
-      <w:r>
-        <w:t xml:space="preserve">implementation languages but on one architecture; the aarch64 case is not established here, because</w:t>
-      </w:r>
-      <w:r>
-        <w:t xml:space="preserve"> </w:t>
-      </w:r>
-      <w:r>
-        <w:t xml:space="preserve">faithful native seccomp semantics are not available under user-mode emulation, and a second-architecture</w:t>
-      </w:r>
-      <w:r>
-        <w:t xml:space="preserve"> </w:t>
-      </w:r>
-      <w:r>
-        <w:t xml:space="preserve">host is the correct way to test it. The TOCTOU bypass is demonstrated as an existence result, which one</w:t>
-      </w:r>
-      <w:r>
-        <w:t xml:space="preserve"> </w:t>
-      </w:r>
-      <w:r>
-        <w:t xml:space="preserve">successful race establishes; its per-attempt rate is scheduler-dependent and is not an external-validity</w:t>
-      </w:r>
-      <w:r>
-        <w:t xml:space="preserve"> </w:t>
-      </w:r>
-      <w:r>
-        <w:t xml:space="preserve">claim. The Landlock benchmark is one x86_64 host at ABI v7; its race-closure and alias-coverage results</w:t>
-      </w:r>
-      <w:r>
-        <w:t xml:space="preserve"> </w:t>
-      </w:r>
-      <w:r>
-        <w:t xml:space="preserve">are host-independent properties of the mechanism, while the seccomp win rate it is measured against is</w:t>
-      </w:r>
-      <w:r>
-        <w:t xml:space="preserve"> </w:t>
-      </w:r>
-      <w:r>
-        <w:t xml:space="preserve">scheduler-dependent as above.</w:t>
+        <w:t xml:space="preserve">; rates and specific mechanisms may shift with larger models and samples. Every measurement is</w:t>
+      </w:r>
+      <w:r>
+        <w:t xml:space="preserve"> </w:t>
+      </w:r>
+      <w:r>
+        <w:t xml:space="preserve">one x86_64 host at Landlock ABI v7. Interception was checked across three languages but one architecture;</w:t>
+      </w:r>
+      <w:r>
+        <w:t xml:space="preserve"> </w:t>
+      </w:r>
+      <w:r>
+        <w:t xml:space="preserve">aarch64 is not established here, because faithful native seccomp semantics are unavailable under user-mode</w:t>
+      </w:r>
+      <w:r>
+        <w:t xml:space="preserve"> </w:t>
+      </w:r>
+      <w:r>
+        <w:t xml:space="preserve">emulation. The TOCTOU bypass is an existence result; its per-attempt rate is scheduler-dependent and not</w:t>
+      </w:r>
+      <w:r>
+        <w:t xml:space="preserve"> </w:t>
+      </w:r>
+      <w:r>
+        <w:t xml:space="preserve">an external-validity claim, as are the seccomp win rates the Landlock and kill-switch benchmarks measure</w:t>
+      </w:r>
+      <w:r>
+        <w:t xml:space="preserve"> </w:t>
+      </w:r>
+      <w:r>
+        <w:t xml:space="preserve">against—the race-closure, alias-coverage, and mechanism-asymmetry results are host-independent, the rates</w:t>
+      </w:r>
+      <w:r>
+        <w:t xml:space="preserve"> </w:t>
+      </w:r>
+      <w:r>
+        <w:t xml:space="preserve">are not.</w:t>
       </w:r>
     </w:p>
     <w:p>
@@ -12152,13 +11617,7 @@
         <w:pStyle w:val="BodyText"/>
       </w:pPr>
       <w:r>
-        <w:t xml:space="preserve">Three limits of the Part II control are measured rather than argued, all in</w:t>
-      </w:r>
-      <w:r>
-        <w:t xml:space="preserve"> </w:t>
-      </w:r>
-      <w:r>
-        <w:t xml:space="preserve">Section </w:t>
+        <w:t xml:space="preserve">Three Part II limits are measured, not argued (Section </w:t>
       </w:r>
       <w:hyperlink w:anchor="sec:landlock">
         <w:r>
@@ -12169,19 +11628,19 @@
         </w:r>
       </w:hyperlink>
       <w:r>
-        <w:t xml:space="preserve">: execution is unrestricted in our configuration because the ruleset does</w:t>
-      </w:r>
-      <w:r>
-        <w:t xml:space="preserve"> </w:t>
-      </w:r>
-      <w:r>
-        <w:t xml:space="preserve">not handle it, not because Landlock cannot; a descriptor opened before the ruleset keeps its</w:t>
-      </w:r>
-      <w:r>
-        <w:t xml:space="preserve"> </w:t>
-      </w:r>
-      <w:r>
-        <w:t xml:space="preserve">open-time rights; and UDP and raw sockets pass a TCP network ruleset. The</w:t>
+        <w:t xml:space="preserve">): execution is unrestricted</w:t>
+      </w:r>
+      <w:r>
+        <w:t xml:space="preserve"> </w:t>
+      </w:r>
+      <w:r>
+        <w:t xml:space="preserve">because our ruleset does not handle it, not because Landlock cannot; a descriptor opened before the ruleset</w:t>
+      </w:r>
+      <w:r>
+        <w:t xml:space="preserve"> </w:t>
+      </w:r>
+      <w:r>
+        <w:t xml:space="preserve">keeps its open-time rights; and UDP and raw sockets pass a TCP ruleset. The</w:t>
       </w:r>
       <w:r>
         <w:t xml:space="preserve"> </w:t>
@@ -12196,33 +11655,13 @@
         <w:t xml:space="preserve"> </w:t>
       </w:r>
       <w:r>
-        <w:t xml:space="preserve">result</w:t>
-      </w:r>
-      <w:r>
-        <w:t xml:space="preserve"> </w:t>
-      </w:r>
-      <w:r>
-        <w:t xml:space="preserve">of Section </w:t>
-      </w:r>
-      <w:hyperlink w:anchor="sec:coverage">
-        <w:r>
-          <w:rPr>
-            <w:rStyle w:val="Hyperlink"/>
-          </w:rPr>
-          <w:t xml:space="preserve">4</w:t>
-        </w:r>
-      </w:hyperlink>
-      <w:r>
-        <w:t xml:space="preserve"> </w:t>
-      </w:r>
-      <w:r>
-        <w:t xml:space="preserve">is bounded in a different way. It establishes that a Landlock domain</w:t>
-      </w:r>
-      <w:r>
-        <w:t xml:space="preserve"> </w:t>
-      </w:r>
-      <w:r>
-        <w:t xml:space="preserve">follows an</w:t>
+        <w:t xml:space="preserve">result is</w:t>
+      </w:r>
+      <w:r>
+        <w:t xml:space="preserve"> </w:t>
+      </w:r>
+      <w:r>
+        <w:t xml:space="preserve">narrower still—a Landlock domain follows one</w:t>
       </w:r>
       <w:r>
         <w:t xml:space="preserve"> </w:t>
@@ -12237,13 +11676,13 @@
         <w:t xml:space="preserve"> </w:t>
       </w:r>
       <w:r>
-        <w:t xml:space="preserve">submitted through an established ring, on this kernel, for that one</w:t>
-      </w:r>
-      <w:r>
-        <w:t xml:space="preserve"> </w:t>
-      </w:r>
-      <w:r>
-        <w:t xml:space="preserve">operation; it does not establish coverage of</w:t>
+        <w:t xml:space="preserve">through an established ring on this kernel;</w:t>
+      </w:r>
+      <w:r>
+        <w:t xml:space="preserve"> </w:t>
+      </w:r>
+      <w:r>
+        <w:t xml:space="preserve">it does not establish</w:t>
       </w:r>
       <w:r>
         <w:t xml:space="preserve"> </w:t>
@@ -12258,31 +11697,13 @@
         <w:t xml:space="preserve"> </w:t>
       </w:r>
       <w:r>
-        <w:t xml:space="preserve">generally. Landlock implements none</w:t>
-      </w:r>
-      <w:r>
-        <w:t xml:space="preserve"> </w:t>
-      </w:r>
-      <w:r>
-        <w:t xml:space="preserve">of the</w:t>
-      </w:r>
-      <w:r>
-        <w:t xml:space="preserve"> </w:t>
-      </w:r>
-      <w:r>
-        <w:rPr>
-          <w:rStyle w:val="VerbatimChar"/>
-        </w:rPr>
-        <w:t xml:space="preserve">io_uring</w:t>
-      </w:r>
-      <w:r>
-        <w:t xml:space="preserve">-specific LSM hooks, so a ring that selects a credential registered before</w:t>
-      </w:r>
-      <w:r>
-        <w:t xml:space="preserve"> </w:t>
-      </w:r>
-      <w:r>
-        <w:t xml:space="preserve">the sandbox was entered, or that reaches a device through</w:t>
+        <w:t xml:space="preserve">coverage generally, and a ring that selects a pre-registered</w:t>
+      </w:r>
+      <w:r>
+        <w:t xml:space="preserve"> </w:t>
+      </w:r>
+      <w:r>
+        <w:t xml:space="preserve">credential or reaches a device through</w:t>
       </w:r>
       <w:r>
         <w:t xml:space="preserve"> </w:t>
@@ -12294,21 +11715,16 @@
         <w:t xml:space="preserve">IORING_OP_URING_CMD</w:t>
       </w:r>
       <w:r>
-        <w:t xml:space="preserve">, is outside</w:t>
-      </w:r>
-      <w:r>
-        <w:t xml:space="preserve"> </w:t>
-      </w:r>
-      <w:r>
-        <w:t xml:space="preserve">what we tested and should be assumed ungoverned until someone measures it.</w:t>
-      </w:r>
-    </w:p>
-    <w:p>
-      <w:pPr>
-        <w:pStyle w:val="BodyText"/>
-      </w:pPr>
-      <w:r>
-        <w:t xml:space="preserve">The composed-sandbox matrix (Section </w:t>
+        <w:t xml:space="preserve"> </w:t>
+      </w:r>
+      <w:r>
+        <w:t xml:space="preserve">is untested. The composed matrix</w:t>
+      </w:r>
+      <w:r>
+        <w:t xml:space="preserve"> </w:t>
+      </w:r>
+      <w:r>
+        <w:t xml:space="preserve">(Section </w:t>
       </w:r>
       <w:hyperlink w:anchor="sec:composed">
         <w:r>
@@ -12319,19 +11735,7 @@
         </w:r>
       </w:hyperlink>
       <w:r>
-        <w:t xml:space="preserve">) is not exhaustive, and the result is scoped to</w:t>
-      </w:r>
-      <w:r>
-        <w:t xml:space="preserve"> </w:t>
-      </w:r>
-      <w:r>
-        <w:t xml:space="preserve">the attacks it runs, not a general escape-resistance claim. Several surfaces are named but untested and we</w:t>
-      </w:r>
-      <w:r>
-        <w:t xml:space="preserve"> </w:t>
-      </w:r>
-      <w:r>
-        <w:t xml:space="preserve">do not claim them:</w:t>
+        <w:t xml:space="preserve">) is likewise not exhaustive:</w:t>
       </w:r>
       <w:r>
         <w:t xml:space="preserve"> </w:t>
@@ -12343,28 +11747,19 @@
         <w:t xml:space="preserve">openat2</w:t>
       </w:r>
       <w:r>
-        <w:t xml:space="preserve">, which the file-open LSM hook governs on the same footing as</w:t>
-      </w:r>
-      <w:r>
-        <w:t xml:space="preserve"> </w:t>
-      </w:r>
-      <w:r>
-        <w:rPr>
-          <w:rStyle w:val="VerbatimChar"/>
-        </w:rPr>
-        <w:t xml:space="preserve">openat</w:t>
-      </w:r>
-      <w:r>
-        <w:t xml:space="preserve"> </w:t>
-      </w:r>
-      <w:r>
-        <w:t xml:space="preserve">but which we did not exercise; file-descriptor passing over a Unix-domain socket</w:t>
-      </w:r>
-      <w:r>
-        <w:t xml:space="preserve"> </w:t>
-      </w:r>
-      <w:r>
-        <w:t xml:space="preserve">(</w:t>
+        <w:t xml:space="preserve"> </w:t>
+      </w:r>
+      <w:r>
+        <w:t xml:space="preserve">(governed by the same file-open</w:t>
+      </w:r>
+      <w:r>
+        <w:t xml:space="preserve"> </w:t>
+      </w:r>
+      <w:r>
+        <w:t xml:space="preserve">hook but not exercised),</w:t>
+      </w:r>
+      <w:r>
+        <w:t xml:space="preserve"> </w:t>
       </w:r>
       <w:r>
         <w:rPr>
@@ -12373,7 +11768,10 @@
         <w:t xml:space="preserve">SCM_RIGHTS</w:t>
       </w:r>
       <w:r>
-        <w:t xml:space="preserve">), the descriptor-provenance question of the pre-open hole in another form;</w:t>
+        <w:t xml:space="preserve"> </w:t>
+      </w:r>
+      <w:r>
+        <w:t xml:space="preserve">descriptor passing over a Unix-domain socket,</w:t>
       </w:r>
       <w:r>
         <w:t xml:space="preserve"> </w:t>
@@ -12400,19 +11798,19 @@
         <w:t xml:space="preserve">memfd</w:t>
       </w:r>
       <w:r>
-        <w:t xml:space="preserve">; and any path through a future kernel interface. The empirical claim</w:t>
-      </w:r>
-      <w:r>
-        <w:t xml:space="preserve"> </w:t>
-      </w:r>
-      <w:r>
-        <w:t xml:space="preserve">is that no attack in the tested matrix violated a stated invariant once the domain was entered; it is not</w:t>
-      </w:r>
-      <w:r>
-        <w:t xml:space="preserve"> </w:t>
-      </w:r>
-      <w:r>
-        <w:t xml:space="preserve">a claim about attacks the matrix does not contain.</w:t>
+        <w:t xml:space="preserve">, and any future kernel interface are named but untested. The</w:t>
+      </w:r>
+      <w:r>
+        <w:t xml:space="preserve"> </w:t>
+      </w:r>
+      <w:r>
+        <w:t xml:space="preserve">empirical claim is that no attack in the tested matrix violated a stated invariant once the domain was</w:t>
+      </w:r>
+      <w:r>
+        <w:t xml:space="preserve"> </w:t>
+      </w:r>
+      <w:r>
+        <w:t xml:space="preserve">entered—not a claim about attacks the matrix does not contain.</w:t>
       </w:r>
     </w:p>
     <w:p>
@@ -12420,13 +11818,7 @@
         <w:pStyle w:val="BodyText"/>
       </w:pPr>
       <w:r>
-        <w:t xml:space="preserve">One more limit is inferred rather than demonstrated. We did not build the delegating supervisor that</w:t>
-      </w:r>
-      <w:r>
-        <w:t xml:space="preserve"> </w:t>
-      </w:r>
-      <w:r>
-        <w:t xml:space="preserve">Section </w:t>
+        <w:t xml:space="preserve">Finally, we did not build the delegating supervisor Section </w:t>
       </w:r>
       <w:hyperlink w:anchor="sec:discussion">
         <w:r>
@@ -12440,52 +11832,52 @@
         <w:t xml:space="preserve"> </w:t>
       </w:r>
       <w:r>
-        <w:t xml:space="preserve">recommends, so the descriptor-provenance problem follows from the</w:t>
-      </w:r>
-      <w:r>
-        <w:t xml:space="preserve"> </w:t>
-      </w:r>
-      <w:r>
-        <w:t xml:space="preserve">pre-open measurement plus the semantics of</w:t>
-      </w:r>
-      <w:r>
-        <w:t xml:space="preserve"> </w:t>
-      </w:r>
-      <w:r>
-        <w:rPr>
-          <w:rStyle w:val="VerbatimChar"/>
-        </w:rPr>
-        <w:t xml:space="preserve">SECCOMP_IOCTL_NOTIF_ADDFD</w:t>
-      </w:r>
-      <w:r>
-        <w:t xml:space="preserve"> </w:t>
-      </w:r>
-      <w:r>
-        <w:t xml:space="preserve">rather than from an</w:t>
-      </w:r>
-      <w:r>
-        <w:t xml:space="preserve"> </w:t>
-      </w:r>
-      <w:r>
-        <w:t xml:space="preserve">end-to-end run, and it is the first thing an implementation of that direction should test. The Part III autopsy is one 7B local model at small scale—18 self-description</w:t>
-      </w:r>
-      <w:r>
-        <w:t xml:space="preserve"> </w:t>
-      </w:r>
-      <w:r>
-        <w:t xml:space="preserve">artifacts, twelve timed generations per force, two trials per goal with denials simulated and nothing</w:t>
-      </w:r>
-      <w:r>
-        <w:t xml:space="preserve"> </w:t>
-      </w:r>
-      <w:r>
-        <w:t xml:space="preserve">executed, and 45 autonomous artifacts—so its rates are sample-dependent and the stable shapes</w:t>
-      </w:r>
-      <w:r>
-        <w:t xml:space="preserve"> </w:t>
-      </w:r>
-      <w:r>
-        <w:t xml:space="preserve">(no observed stop, description omitting the executed mechanism, no track-masking) are the findings, not the percentages. The gate’s</w:t>
+        <w:t xml:space="preserve">recommends, so the</w:t>
+      </w:r>
+      <w:r>
+        <w:t xml:space="preserve"> </w:t>
+      </w:r>
+      <w:r>
+        <w:t xml:space="preserve">descriptor-provenance problem follows from the pre-open measurement and the</w:t>
+      </w:r>
+      <w:r>
+        <w:t xml:space="preserve"> </w:t>
+      </w:r>
+      <w:r>
+        <w:rPr>
+          <w:rStyle w:val="VerbatimChar"/>
+        </w:rPr>
+        <w:t xml:space="preserve">ADDFD</w:t>
+      </w:r>
+      <w:r>
+        <w:t xml:space="preserve"> </w:t>
+      </w:r>
+      <w:r>
+        <w:t xml:space="preserve">semantics, not</w:t>
+      </w:r>
+      <w:r>
+        <w:t xml:space="preserve"> </w:t>
+      </w:r>
+      <w:r>
+        <w:t xml:space="preserve">an end-to-end run. The Part III autopsy is one 7B model at small scale (18 self-description artifacts,</w:t>
+      </w:r>
+      <w:r>
+        <w:t xml:space="preserve"> </w:t>
+      </w:r>
+      <w:r>
+        <w:t xml:space="preserve">twelve timed generations per force, two trials per goal with denials simulated), so its stable</w:t>
+      </w:r>
+      <w:r>
+        <w:t xml:space="preserve"> </w:t>
+      </w:r>
+      <w:r>
+        <w:t xml:space="preserve">shapes—no observed stop, description omitting the executed mechanism, no track-masking—are the</w:t>
+      </w:r>
+      <w:r>
+        <w:t xml:space="preserve"> </w:t>
+      </w:r>
+      <w:r>
+        <w:t xml:space="preserve">findings, not the percentages. The gate’s</w:t>
       </w:r>
       <w:r>
         <w:t xml:space="preserve"> </w:t>
@@ -12500,13 +11892,13 @@
         <w:t xml:space="preserve"> </w:t>
       </w:r>
       <w:r>
-        <w:t xml:space="preserve">rule is untested by any artifact: the corpus made no network calls, and the one elicited</w:t>
-      </w:r>
-      <w:r>
-        <w:t xml:space="preserve"> </w:t>
-      </w:r>
-      <w:r>
-        <w:t xml:space="preserve">egress rode</w:t>
+        <w:t xml:space="preserve">rule is untested by any artifact, since the</w:t>
+      </w:r>
+      <w:r>
+        <w:t xml:space="preserve"> </w:t>
+      </w:r>
+      <w:r>
+        <w:t xml:space="preserve">corpus made no network calls and the one elicited egress rode</w:t>
       </w:r>
       <w:r>
         <w:t xml:space="preserve"> </w:t>
@@ -12544,65 +11936,18 @@
         <w:t xml:space="preserve"> </w:t>
       </w:r>
       <w:r>
-        <w:t xml:space="preserve">the launch policy already stops,</w:t>
-      </w:r>
-      <w:r>
-        <w:t xml:space="preserve"> </w:t>
-      </w:r>
-      <w:r>
-        <w:t xml:space="preserve">not a direct in-process</w:t>
-      </w:r>
-      <w:r>
-        <w:t xml:space="preserve"> </w:t>
-      </w:r>
-      <w:r>
-        <w:rPr>
-          <w:rStyle w:val="VerbatimChar"/>
-        </w:rPr>
-        <w:t xml:space="preserve">connect</w:t>
-      </w:r>
-      <w:r>
-        <w:t xml:space="preserve">. The behavioural-attribution experiments are forensic</w:t>
-      </w:r>
-      <w:r>
-        <w:t xml:space="preserve"> </w:t>
-      </w:r>
-      <w:r>
-        <w:t xml:space="preserve">characterizations of non-adversarial actors</w:t>
-      </w:r>
-      <w:r>
-        <w:t xml:space="preserve"> </w:t>
-      </w:r>
-      <w:r>
-        <w:t xml:space="preserve">and are reported as such; against an adversary that controls its own behaviour they attribute nothing,</w:t>
-      </w:r>
-      <w:r>
-        <w:t xml:space="preserve"> </w:t>
-      </w:r>
-      <w:r>
-        <w:t xml:space="preserve">which is the point of Section </w:t>
-      </w:r>
-      <w:hyperlink w:anchor="sec:attribution">
-        <w:r>
-          <w:rPr>
-            <w:rStyle w:val="Hyperlink"/>
-          </w:rPr>
-          <w:t xml:space="preserve">5</w:t>
-        </w:r>
-      </w:hyperlink>
-      <w:r>
-        <w:t xml:space="preserve">.</w:t>
+        <w:t xml:space="preserve">the launch policy already stops.</w:t>
       </w:r>
     </w:p>
     <w:p>
       <w:pPr>
         <w:pStyle w:val="Heading3"/>
       </w:pPr>
-      <w:bookmarkStart w:id="54" w:name="sec:related"/>
+      <w:bookmarkStart w:id="51" w:name="sec:related"/>
       <w:r>
         <w:t xml:space="preserve">Related work</w:t>
       </w:r>
-      <w:bookmarkEnd w:id="54"/>
+      <w:bookmarkEnd w:id="51"/>
     </w:p>
     <w:p>
       <w:pPr>
@@ -12783,7 +12128,7 @@
           <w:rPr>
             <w:rStyle w:val="Hyperlink"/>
           </w:rPr>
-          <w:t xml:space="preserve">5</w:t>
+          <w:t xml:space="preserve">4</w:t>
         </w:r>
       </w:hyperlink>
       <w:r>
@@ -12959,11 +12304,11 @@
       <w:pPr>
         <w:pStyle w:val="Heading3"/>
       </w:pPr>
-      <w:bookmarkStart w:id="55" w:name="sec:conclusion"/>
+      <w:bookmarkStart w:id="52" w:name="sec:conclusion"/>
       <w:r>
         <w:t xml:space="preserve">Conclusion</w:t>
       </w:r>
-      <w:bookmarkEnd w:id="55"/>
+      <w:bookmarkEnd w:id="52"/>
     </w:p>
     <w:p>
       <w:pPr>
@@ -13093,11 +12438,11 @@
       <w:pPr>
         <w:pStyle w:val="Heading6"/>
       </w:pPr>
-      <w:bookmarkStart w:id="56" w:name="reproducibility."/>
+      <w:bookmarkStart w:id="53" w:name="reproducibility."/>
       <w:r>
         <w:t xml:space="preserve">Reproducibility.</w:t>
       </w:r>
-      <w:bookmarkEnd w:id="56"/>
+      <w:bookmarkEnd w:id="53"/>
     </w:p>
     <w:p>
       <w:pPr>
@@ -13924,217 +13269,6 @@
     <w:p>
       <w:r>
         <w:separator/>
-      </w:r>
-    </w:p>
-  </w:footnote>
-  <w:footnote w:id="20">
-    <w:p>
-      <w:pPr>
-        <w:pStyle w:val="FootnoteText"/>
-      </w:pPr>
-      <w:r>
-        <w:rPr>
-          <w:rStyle w:val="FootnoteReference"/>
-        </w:rPr>
-        <w:footnoteRef/>
-      </w:r>
-      <w:r>
-        <w:t xml:space="preserve"> </w:t>
-      </w:r>
-      <w:r>
-        <w:t xml:space="preserve">Every</w:t>
-      </w:r>
-      <w:r>
-        <w:t xml:space="preserve"> </w:t>
-      </w:r>
-      <w:r>
-        <w:t xml:space="preserve">number</w:t>
-      </w:r>
-      <w:r>
-        <w:t xml:space="preserve"> </w:t>
-      </w:r>
-      <w:r>
-        <w:t xml:space="preserve">in</w:t>
-      </w:r>
-      <w:r>
-        <w:t xml:space="preserve"> </w:t>
-      </w:r>
-      <w:r>
-        <w:t xml:space="preserve">this</w:t>
-      </w:r>
-      <w:r>
-        <w:t xml:space="preserve"> </w:t>
-      </w:r>
-      <w:r>
-        <w:t xml:space="preserve">paper</w:t>
-      </w:r>
-      <w:r>
-        <w:t xml:space="preserve"> </w:t>
-      </w:r>
-      <w:r>
-        <w:t xml:space="preserve">traces</w:t>
-      </w:r>
-      <w:r>
-        <w:t xml:space="preserve"> </w:t>
-      </w:r>
-      <w:r>
-        <w:t xml:space="preserve">to</w:t>
-      </w:r>
-      <w:r>
-        <w:t xml:space="preserve"> </w:t>
-      </w:r>
-      <w:r>
-        <w:t xml:space="preserve">a</w:t>
-      </w:r>
-      <w:r>
-        <w:t xml:space="preserve"> </w:t>
-      </w:r>
-      <w:r>
-        <w:t xml:space="preserve">committed</w:t>
-      </w:r>
-      <w:r>
-        <w:t xml:space="preserve"> </w:t>
-      </w:r>
-      <w:r>
-        <w:t xml:space="preserve">artifact</w:t>
-      </w:r>
-      <w:r>
-        <w:t xml:space="preserve"> </w:t>
-      </w:r>
-      <w:r>
-        <w:t xml:space="preserve">in</w:t>
-      </w:r>
-      <w:r>
-        <w:t xml:space="preserve"> </w:t>
-      </w:r>
-      <w:r>
-        <w:rPr>
-          <w:rStyle w:val="VerbatimChar"/>
-        </w:rPr>
-        <w:t xml:space="preserve">github.com/comcast-tsf/tsf-llm-security-research</w:t>
-      </w:r>
-      <w:r>
-        <w:t xml:space="preserve">.</w:t>
-      </w:r>
-      <w:r>
-        <w:t xml:space="preserve"> </w:t>
-      </w:r>
-      <w:r>
-        <w:t xml:space="preserve">The</w:t>
-      </w:r>
-      <w:r>
-        <w:t xml:space="preserve"> </w:t>
-      </w:r>
-      <w:r>
-        <w:t xml:space="preserve">Part I</w:t>
-      </w:r>
-      <w:r>
-        <w:t xml:space="preserve"> </w:t>
-      </w:r>
-      <w:r>
-        <w:t xml:space="preserve">headline</w:t>
-      </w:r>
-      <w:r>
-        <w:t xml:space="preserve"> </w:t>
-      </w:r>
-      <w:r>
-        <w:t xml:space="preserve">results</w:t>
-      </w:r>
-      <w:r>
-        <w:t xml:space="preserve"> </w:t>
-      </w:r>
-      <w:r>
-        <w:t xml:space="preserve">re-check</w:t>
-      </w:r>
-      <w:r>
-        <w:t xml:space="preserve"> </w:t>
-      </w:r>
-      <w:r>
-        <w:t xml:space="preserve">via</w:t>
-      </w:r>
-      <w:r>
-        <w:t xml:space="preserve"> </w:t>
-      </w:r>
-      <w:r>
-        <w:rPr>
-          <w:rStyle w:val="VerbatimChar"/>
-        </w:rPr>
-        <w:t xml:space="preserve">experiments/agentsec/reproduce.sh</w:t>
-      </w:r>
-      <w:r>
-        <w:t xml:space="preserve">;</w:t>
-      </w:r>
-      <w:r>
-        <w:t xml:space="preserve"> </w:t>
-      </w:r>
-      <w:r>
-        <w:t xml:space="preserve">the</w:t>
-      </w:r>
-      <w:r>
-        <w:t xml:space="preserve"> </w:t>
-      </w:r>
-      <w:r>
-        <w:t xml:space="preserve">Part II–IV</w:t>
-      </w:r>
-      <w:r>
-        <w:t xml:space="preserve"> </w:t>
-      </w:r>
-      <w:r>
-        <w:t xml:space="preserve">benchmarks</w:t>
-      </w:r>
-      <w:r>
-        <w:t xml:space="preserve"> </w:t>
-      </w:r>
-      <w:r>
-        <w:t xml:space="preserve">reproduce</w:t>
-      </w:r>
-      <w:r>
-        <w:t xml:space="preserve"> </w:t>
-      </w:r>
-      <w:r>
-        <w:t xml:space="preserve">via</w:t>
-      </w:r>
-      <w:r>
-        <w:t xml:space="preserve"> </w:t>
-      </w:r>
-      <w:r>
-        <w:t xml:space="preserve">their</w:t>
-      </w:r>
-      <w:r>
-        <w:t xml:space="preserve"> </w:t>
-      </w:r>
-      <w:r>
-        <w:t xml:space="preserve">per-experiment</w:t>
-      </w:r>
-      <w:r>
-        <w:t xml:space="preserve"> </w:t>
-      </w:r>
-      <w:r>
-        <w:t xml:space="preserve">scripts</w:t>
-      </w:r>
-      <w:r>
-        <w:t xml:space="preserve"> </w:t>
-      </w:r>
-      <w:r>
-        <w:t xml:space="preserve">in</w:t>
-      </w:r>
-      <w:r>
-        <w:t xml:space="preserve"> </w:t>
-      </w:r>
-      <w:r>
-        <w:t xml:space="preserve">the</w:t>
-      </w:r>
-      <w:r>
-        <w:t xml:space="preserve"> </w:t>
-      </w:r>
-      <w:r>
-        <w:t xml:space="preserve">same</w:t>
-      </w:r>
-      <w:r>
-        <w:t xml:space="preserve"> </w:t>
-      </w:r>
-      <w:r>
-        <w:t xml:space="preserve">directory.</w:t>
       </w:r>
     </w:p>
   </w:footnote>

</xml_diff>

<commit_message>
drop the company from the bylines and the artifact links
publishing independently, so the title page keeps our roles without an employer,
and the word build points at the accompanying artifact repository instead of
the internal org path. pdf and docx rebuilt from the edited sources.
</commit_message>
<xml_diff>
--- a/paper/agent-gate.docx
+++ b/paper/agent-gate.docx
@@ -117,13 +117,7 @@
         <w:t xml:space="preserve"> </w:t>
       </w:r>
       <w:r>
-        <w:t xml:space="preserve">Engineer,</w:t>
-      </w:r>
-      <w:r>
-        <w:t xml:space="preserve"> </w:t>
-      </w:r>
-      <w:r>
-        <w:t xml:space="preserve">Comcast</w:t>
+        <w:t xml:space="preserve">Engineer</w:t>
       </w:r>
     </w:p>
     <w:p>
@@ -149,13 +143,7 @@
         <w:t xml:space="preserve"> </w:t>
       </w:r>
       <w:r>
-        <w:t xml:space="preserve">Engineer,</w:t>
-      </w:r>
-      <w:r>
-        <w:t xml:space="preserve"> </w:t>
-      </w:r>
-      <w:r>
-        <w:t xml:space="preserve">Comcast</w:t>
+        <w:t xml:space="preserve">Engineer</w:t>
       </w:r>
     </w:p>
     <w:p>
@@ -192,7 +180,7 @@
         <w:br/>
       </w:r>
       <w:r>
-        <w:t xml:space="preserve">Sadik Erisen, Security Engineer, Comcast Todd Outten, Distinguished Engineer, Comcast</w:t>
+        <w:t xml:space="preserve">Sadik Erisen, Security Engineer Todd Outten, Distinguished Engineer</w:t>
       </w:r>
       <w:r>
         <w:br/>
@@ -219,16 +207,9 @@
       </w:r>
       <w:r>
         <w:rPr>
-          <w:rStyle w:val="VerbatimChar"/>
           <w:i/>
         </w:rPr>
-        <w:t xml:space="preserve">github.com/comcast-tsf/tsf-llm-security-research</w:t>
-      </w:r>
-      <w:r>
-        <w:rPr>
-          <w:i/>
-        </w:rPr>
-        <w:t xml:space="preserve">. The Part I headline results re-check via</w:t>
+        <w:t xml:space="preserve">the accompanying artifact repository. The Part I headline results re-check via</w:t>
       </w:r>
       <w:r>
         <w:rPr>
@@ -12455,19 +12436,7 @@
         <w:t xml:space="preserve"> </w:t>
       </w:r>
       <w:r>
-        <w:t xml:space="preserve">accompanying artifact repository,</w:t>
-      </w:r>
-      <w:r>
-        <w:t xml:space="preserve"> </w:t>
-      </w:r>
-      <w:r>
-        <w:rPr>
-          <w:rStyle w:val="VerbatimChar"/>
-        </w:rPr>
-        <w:t xml:space="preserve">github.com/comcast-tsf/tsf-llm-security-research</w:t>
-      </w:r>
-      <w:r>
-        <w:t xml:space="preserve">.</w:t>
+        <w:t xml:space="preserve">accompanying artifact repository.</w:t>
       </w:r>
       <w:r>
         <w:t xml:space="preserve"> </w:t>

</xml_diff>